<commit_message>
Update System design notes: client-server architecture & proxies
</commit_message>
<xml_diff>
--- a/system-design-basics/System design notes.docx
+++ b/system-design-basics/System design notes.docx
@@ -798,7 +798,21 @@
         <w:rPr>
           <w:szCs w:val="22"/>
         </w:rPr>
-        <w:t>Message Queues: Systems that manage asynchronous communication between services.</w:t>
+        <w:t>Message Queues: Systems that manage asynchronous communication between services</w:t>
+      </w:r>
+      <w:r>
+        <w:rPr>
+          <w:szCs w:val="22"/>
+        </w:rPr>
+        <w:t>/apps</w:t>
+      </w:r>
+      <w:bookmarkStart w:id="0" w:name="_GoBack"/>
+      <w:bookmarkEnd w:id="0"/>
+      <w:r>
+        <w:rPr>
+          <w:szCs w:val="22"/>
+        </w:rPr>
+        <w:t>.</w:t>
       </w:r>
     </w:p>
     <w:p>
@@ -1266,15 +1280,7 @@
               <w:rPr>
                 <w:szCs w:val="22"/>
               </w:rPr>
-              <w:t>, Python, Amber, React, et</w:t>
-            </w:r>
-            <w:bookmarkStart w:id="0" w:name="_GoBack"/>
-            <w:bookmarkEnd w:id="0"/>
-            <w:r>
-              <w:rPr>
-                <w:szCs w:val="22"/>
-              </w:rPr>
-              <w:t>c.</w:t>
+              <w:t>, Python, Amber, React, etc.</w:t>
             </w:r>
           </w:p>
         </w:tc>
@@ -1521,6 +1527,1598 @@
         </w:rPr>
       </w:pPr>
     </w:p>
+    <w:p>
+      <w:pPr>
+        <w:rPr>
+          <w:b/>
+          <w:bCs/>
+          <w:szCs w:val="22"/>
+        </w:rPr>
+      </w:pPr>
+    </w:p>
+    <w:p>
+      <w:pPr>
+        <w:rPr>
+          <w:b/>
+          <w:bCs/>
+          <w:color w:val="FF0000"/>
+          <w:sz w:val="40"/>
+          <w:szCs w:val="40"/>
+          <w:u w:val="single"/>
+        </w:rPr>
+      </w:pPr>
+      <w:r>
+        <w:rPr>
+          <w:b/>
+          <w:bCs/>
+          <w:color w:val="FF0000"/>
+          <w:sz w:val="40"/>
+          <w:szCs w:val="40"/>
+          <w:u w:val="single"/>
+        </w:rPr>
+        <w:t>Client server architecture</w:t>
+      </w:r>
+      <w:r>
+        <w:rPr>
+          <w:b/>
+          <w:bCs/>
+          <w:color w:val="FF0000"/>
+          <w:sz w:val="40"/>
+          <w:szCs w:val="40"/>
+          <w:u w:val="single"/>
+        </w:rPr>
+        <w:t>:-</w:t>
+      </w:r>
+    </w:p>
+    <w:p>
+      <w:pPr>
+        <w:rPr>
+          <w:b/>
+          <w:bCs/>
+          <w:szCs w:val="22"/>
+        </w:rPr>
+      </w:pPr>
+      <w:r>
+        <w:rPr>
+          <w:b/>
+          <w:bCs/>
+          <w:szCs w:val="22"/>
+        </w:rPr>
+        <w:t>Client-server architecture is a simple setup where your device (the client, like a web browser or app) asks a powerful computer (the server) for info or services. Th</w:t>
+      </w:r>
+      <w:r>
+        <w:rPr>
+          <w:b/>
+          <w:bCs/>
+          <w:szCs w:val="22"/>
+        </w:rPr>
+        <w:t xml:space="preserve">e server handles the heavy work - </w:t>
+      </w:r>
+      <w:r>
+        <w:rPr>
+          <w:b/>
+          <w:bCs/>
+          <w:szCs w:val="22"/>
+        </w:rPr>
+        <w:t>like stori</w:t>
+      </w:r>
+      <w:r>
+        <w:rPr>
+          <w:b/>
+          <w:bCs/>
+          <w:szCs w:val="22"/>
+        </w:rPr>
+        <w:t xml:space="preserve">ng data or running calculations - </w:t>
+      </w:r>
+      <w:r>
+        <w:rPr>
+          <w:b/>
+          <w:bCs/>
+          <w:szCs w:val="22"/>
+        </w:rPr>
+        <w:t>and sends back results.</w:t>
+      </w:r>
+    </w:p>
+    <w:p>
+      <w:pPr>
+        <w:rPr>
+          <w:b/>
+          <w:bCs/>
+          <w:szCs w:val="22"/>
+        </w:rPr>
+      </w:pPr>
+      <w:r>
+        <w:rPr>
+          <w:b/>
+          <w:bCs/>
+          <w:szCs w:val="22"/>
+        </w:rPr>
+        <w:t>Key Flow</w:t>
+      </w:r>
+      <w:r>
+        <w:rPr>
+          <w:b/>
+          <w:bCs/>
+          <w:szCs w:val="22"/>
+        </w:rPr>
+        <w:t>:</w:t>
+      </w:r>
+    </w:p>
+    <w:p>
+      <w:pPr>
+        <w:pStyle w:val="ListParagraph"/>
+        <w:numPr>
+          <w:ilvl w:val="0"/>
+          <w:numId w:val="7"/>
+        </w:numPr>
+        <w:rPr>
+          <w:szCs w:val="22"/>
+        </w:rPr>
+      </w:pPr>
+      <w:r>
+        <w:rPr>
+          <w:szCs w:val="22"/>
+        </w:rPr>
+        <w:t>Client sends a request (e.g., "load this webpage").</w:t>
+      </w:r>
+    </w:p>
+    <w:p>
+      <w:pPr>
+        <w:pStyle w:val="ListParagraph"/>
+        <w:numPr>
+          <w:ilvl w:val="0"/>
+          <w:numId w:val="7"/>
+        </w:numPr>
+        <w:rPr>
+          <w:szCs w:val="22"/>
+        </w:rPr>
+      </w:pPr>
+      <w:r>
+        <w:rPr>
+          <w:szCs w:val="22"/>
+        </w:rPr>
+        <w:t>Server processes it and replies.</w:t>
+      </w:r>
+    </w:p>
+    <w:p>
+      <w:pPr>
+        <w:pStyle w:val="ListParagraph"/>
+        <w:numPr>
+          <w:ilvl w:val="0"/>
+          <w:numId w:val="7"/>
+        </w:numPr>
+        <w:rPr>
+          <w:szCs w:val="22"/>
+        </w:rPr>
+      </w:pPr>
+      <w:r>
+        <w:rPr>
+          <w:szCs w:val="22"/>
+        </w:rPr>
+        <w:t>Client shows the result to u</w:t>
+      </w:r>
+    </w:p>
+    <w:p>
+      <w:pPr>
+        <w:rPr>
+          <w:b/>
+          <w:bCs/>
+          <w:szCs w:val="22"/>
+        </w:rPr>
+      </w:pPr>
+      <w:r>
+        <w:rPr>
+          <w:b/>
+          <w:bCs/>
+          <w:szCs w:val="22"/>
+        </w:rPr>
+        <w:t xml:space="preserve">Clients: </w:t>
+      </w:r>
+    </w:p>
+    <w:p>
+      <w:pPr>
+        <w:pStyle w:val="ListParagraph"/>
+        <w:numPr>
+          <w:ilvl w:val="0"/>
+          <w:numId w:val="8"/>
+        </w:numPr>
+        <w:rPr>
+          <w:szCs w:val="22"/>
+        </w:rPr>
+      </w:pPr>
+      <w:r>
+        <w:rPr>
+          <w:b/>
+          <w:bCs/>
+          <w:szCs w:val="22"/>
+        </w:rPr>
+        <w:t>Thin Client:</w:t>
+      </w:r>
+      <w:r>
+        <w:rPr>
+          <w:szCs w:val="22"/>
+        </w:rPr>
+        <w:t xml:space="preserve"> The server does most of the heavy lifting. (Example: Watching Netflix).</w:t>
+      </w:r>
+    </w:p>
+    <w:p>
+      <w:pPr>
+        <w:pStyle w:val="ListParagraph"/>
+        <w:numPr>
+          <w:ilvl w:val="0"/>
+          <w:numId w:val="8"/>
+        </w:numPr>
+        <w:rPr>
+          <w:szCs w:val="22"/>
+        </w:rPr>
+      </w:pPr>
+      <w:r>
+        <w:rPr>
+          <w:b/>
+          <w:bCs/>
+          <w:szCs w:val="22"/>
+        </w:rPr>
+        <w:lastRenderedPageBreak/>
+        <w:t>Thick Client:</w:t>
+      </w:r>
+      <w:r>
+        <w:rPr>
+          <w:szCs w:val="22"/>
+        </w:rPr>
+        <w:t xml:space="preserve"> Your </w:t>
+      </w:r>
+      <w:proofErr w:type="gramStart"/>
+      <w:r>
+        <w:rPr>
+          <w:szCs w:val="22"/>
+        </w:rPr>
+        <w:t>device</w:t>
+      </w:r>
+      <w:r>
+        <w:rPr>
+          <w:szCs w:val="22"/>
+        </w:rPr>
+        <w:t>(</w:t>
+      </w:r>
+      <w:proofErr w:type="gramEnd"/>
+      <w:r>
+        <w:rPr>
+          <w:szCs w:val="22"/>
+        </w:rPr>
+        <w:t>the client)</w:t>
+      </w:r>
+      <w:r>
+        <w:rPr>
+          <w:szCs w:val="22"/>
+        </w:rPr>
+        <w:t xml:space="preserve"> does most of the hard work. (Example: Playing a heavy video game).</w:t>
+      </w:r>
+    </w:p>
+    <w:p>
+      <w:pPr>
+        <w:rPr>
+          <w:szCs w:val="22"/>
+        </w:rPr>
+      </w:pPr>
+    </w:p>
+    <w:p>
+      <w:pPr>
+        <w:rPr>
+          <w:b/>
+          <w:bCs/>
+          <w:szCs w:val="22"/>
+        </w:rPr>
+      </w:pPr>
+      <w:r>
+        <w:rPr>
+          <w:b/>
+          <w:bCs/>
+          <w:szCs w:val="22"/>
+        </w:rPr>
+        <w:t xml:space="preserve">Different Types of architecture are:- </w:t>
+      </w:r>
+    </w:p>
+    <w:p>
+      <w:pPr>
+        <w:pStyle w:val="ListParagraph"/>
+        <w:numPr>
+          <w:ilvl w:val="0"/>
+          <w:numId w:val="9"/>
+        </w:numPr>
+        <w:rPr>
+          <w:szCs w:val="22"/>
+        </w:rPr>
+      </w:pPr>
+      <w:r>
+        <w:rPr>
+          <w:szCs w:val="22"/>
+        </w:rPr>
+        <w:t xml:space="preserve">2-Tier: Client </w:t>
+      </w:r>
+      <w:r>
+        <w:rPr>
+          <w:szCs w:val="22"/>
+        </w:rPr>
+        <w:t xml:space="preserve">talks directly to server (best </w:t>
+      </w:r>
+      <w:r>
+        <w:rPr>
+          <w:szCs w:val="22"/>
+        </w:rPr>
+        <w:t>for small apps</w:t>
+      </w:r>
+      <w:r>
+        <w:rPr>
+          <w:szCs w:val="22"/>
+        </w:rPr>
+        <w:t xml:space="preserve"> and websites</w:t>
+      </w:r>
+      <w:r>
+        <w:rPr>
+          <w:szCs w:val="22"/>
+        </w:rPr>
+        <w:t>).</w:t>
+      </w:r>
+    </w:p>
+    <w:p>
+      <w:pPr>
+        <w:pStyle w:val="ListParagraph"/>
+        <w:numPr>
+          <w:ilvl w:val="0"/>
+          <w:numId w:val="9"/>
+        </w:numPr>
+        <w:rPr>
+          <w:szCs w:val="22"/>
+        </w:rPr>
+      </w:pPr>
+      <w:r>
+        <w:rPr>
+          <w:szCs w:val="22"/>
+        </w:rPr>
+        <w:t>3-Tier: Adds a middle layer for logic (better for big systems</w:t>
+      </w:r>
+      <w:r>
+        <w:rPr>
+          <w:szCs w:val="22"/>
+        </w:rPr>
+        <w:t xml:space="preserve"> like a school system</w:t>
+      </w:r>
+      <w:r>
+        <w:rPr>
+          <w:szCs w:val="22"/>
+        </w:rPr>
+        <w:t>).</w:t>
+      </w:r>
+    </w:p>
+    <w:p>
+      <w:pPr>
+        <w:pStyle w:val="ListParagraph"/>
+        <w:numPr>
+          <w:ilvl w:val="0"/>
+          <w:numId w:val="9"/>
+        </w:numPr>
+        <w:rPr>
+          <w:szCs w:val="22"/>
+        </w:rPr>
+      </w:pPr>
+      <w:r>
+        <w:rPr>
+          <w:szCs w:val="22"/>
+        </w:rPr>
+        <w:t xml:space="preserve">N-Tier: </w:t>
+      </w:r>
+      <w:r>
+        <w:rPr>
+          <w:rFonts w:cstheme="minorHAnsi"/>
+          <w:color w:val="0A0A0A"/>
+          <w:shd w:val="clear" w:color="auto" w:fill="FFFFFF"/>
+        </w:rPr>
+        <w:t>Many layers for giant apps. Best for </w:t>
+      </w:r>
+      <w:r>
+        <w:rPr>
+          <w:rStyle w:val="Strong"/>
+          <w:rFonts w:cstheme="minorHAnsi"/>
+          <w:color w:val="0A0A0A"/>
+          <w:shd w:val="clear" w:color="auto" w:fill="FFFFFF"/>
+        </w:rPr>
+        <w:t>Facebook</w:t>
+      </w:r>
+      <w:r>
+        <w:rPr>
+          <w:rFonts w:cstheme="minorHAnsi"/>
+          <w:color w:val="0A0A0A"/>
+          <w:shd w:val="clear" w:color="auto" w:fill="FFFFFF"/>
+        </w:rPr>
+        <w:t> or </w:t>
+      </w:r>
+      <w:r>
+        <w:rPr>
+          <w:rStyle w:val="Strong"/>
+          <w:rFonts w:cstheme="minorHAnsi"/>
+          <w:color w:val="0A0A0A"/>
+          <w:shd w:val="clear" w:color="auto" w:fill="FFFFFF"/>
+        </w:rPr>
+        <w:t>Gmail</w:t>
+      </w:r>
+      <w:r>
+        <w:rPr>
+          <w:rFonts w:cstheme="minorHAnsi"/>
+          <w:color w:val="0A0A0A"/>
+          <w:shd w:val="clear" w:color="auto" w:fill="FFFFFF"/>
+        </w:rPr>
+        <w:t>.</w:t>
+      </w:r>
+    </w:p>
+    <w:p>
+      <w:pPr>
+        <w:rPr>
+          <w:b/>
+          <w:bCs/>
+          <w:szCs w:val="22"/>
+        </w:rPr>
+      </w:pPr>
+      <w:r>
+        <w:rPr>
+          <w:b/>
+          <w:bCs/>
+          <w:szCs w:val="22"/>
+        </w:rPr>
+        <w:t>Q:</w:t>
+      </w:r>
+      <w:r>
+        <w:rPr>
+          <w:b/>
+          <w:bCs/>
+          <w:szCs w:val="22"/>
+        </w:rPr>
+        <w:t xml:space="preserve"> How to convert </w:t>
+      </w:r>
+      <w:proofErr w:type="gramStart"/>
+      <w:r>
+        <w:rPr>
+          <w:b/>
+          <w:bCs/>
+          <w:szCs w:val="22"/>
+        </w:rPr>
+        <w:t>a 3</w:t>
+      </w:r>
+      <w:proofErr w:type="gramEnd"/>
+      <w:r>
+        <w:rPr>
+          <w:b/>
+          <w:bCs/>
+          <w:szCs w:val="22"/>
+        </w:rPr>
+        <w:t xml:space="preserve"> tier architecture into a N-Tier architecture?</w:t>
+      </w:r>
+    </w:p>
+    <w:p>
+      <w:pPr>
+        <w:rPr>
+          <w:szCs w:val="22"/>
+        </w:rPr>
+      </w:pPr>
+      <w:proofErr w:type="spellStart"/>
+      <w:r>
+        <w:rPr>
+          <w:b/>
+          <w:bCs/>
+          <w:szCs w:val="22"/>
+        </w:rPr>
+        <w:t>Ans</w:t>
+      </w:r>
+      <w:proofErr w:type="spellEnd"/>
+      <w:proofErr w:type="gramStart"/>
+      <w:r>
+        <w:rPr>
+          <w:b/>
+          <w:bCs/>
+          <w:szCs w:val="22"/>
+        </w:rPr>
+        <w:t>:-</w:t>
+      </w:r>
+      <w:proofErr w:type="gramEnd"/>
+      <w:r>
+        <w:rPr>
+          <w:b/>
+          <w:bCs/>
+          <w:szCs w:val="22"/>
+        </w:rPr>
+        <w:t xml:space="preserve"> </w:t>
+      </w:r>
+      <w:r>
+        <w:rPr>
+          <w:szCs w:val="22"/>
+        </w:rPr>
+        <w:t>A</w:t>
+      </w:r>
+      <w:r>
+        <w:rPr>
+          <w:szCs w:val="22"/>
+        </w:rPr>
+        <w:t>dding a caching layer turns a basic 3-tier setup into an N-tier (multi-tier) architecture for better s</w:t>
+      </w:r>
+      <w:r>
+        <w:rPr>
+          <w:szCs w:val="22"/>
+        </w:rPr>
+        <w:t xml:space="preserve">peed and scalability. </w:t>
+      </w:r>
+    </w:p>
+    <w:p>
+      <w:pPr>
+        <w:rPr>
+          <w:szCs w:val="22"/>
+        </w:rPr>
+      </w:pPr>
+      <w:proofErr w:type="gramStart"/>
+      <w:r>
+        <w:rPr>
+          <w:szCs w:val="22"/>
+        </w:rPr>
+        <w:t>cache</w:t>
+      </w:r>
+      <w:proofErr w:type="gramEnd"/>
+      <w:r>
+        <w:rPr>
+          <w:szCs w:val="22"/>
+        </w:rPr>
+        <w:t xml:space="preserve"> stores frequent data (like </w:t>
+      </w:r>
+      <w:proofErr w:type="spellStart"/>
+      <w:r>
+        <w:rPr>
+          <w:szCs w:val="22"/>
+        </w:rPr>
+        <w:t>Redis</w:t>
+      </w:r>
+      <w:proofErr w:type="spellEnd"/>
+      <w:r>
+        <w:rPr>
+          <w:szCs w:val="22"/>
+        </w:rPr>
+        <w:t>) between the app layer and database to avoid slow DB hits every time</w:t>
+      </w:r>
+    </w:p>
+    <w:p>
+      <w:pPr>
+        <w:rPr>
+          <w:szCs w:val="22"/>
+        </w:rPr>
+      </w:pPr>
+    </w:p>
+    <w:p>
+      <w:pPr>
+        <w:rPr>
+          <w:b/>
+          <w:bCs/>
+          <w:color w:val="FF0000"/>
+          <w:sz w:val="40"/>
+          <w:szCs w:val="40"/>
+          <w:u w:val="single"/>
+        </w:rPr>
+      </w:pPr>
+      <w:r>
+        <w:rPr>
+          <w:b/>
+          <w:bCs/>
+          <w:color w:val="FF0000"/>
+          <w:sz w:val="40"/>
+          <w:szCs w:val="40"/>
+          <w:u w:val="single"/>
+        </w:rPr>
+        <w:t>Proxies:-</w:t>
+      </w:r>
+    </w:p>
+    <w:p>
+      <w:pPr>
+        <w:rPr>
+          <w:b/>
+          <w:bCs/>
+          <w:szCs w:val="22"/>
+        </w:rPr>
+      </w:pPr>
+      <w:r>
+        <w:rPr>
+          <w:b/>
+          <w:bCs/>
+          <w:szCs w:val="22"/>
+        </w:rPr>
+        <w:t>A proxy is a middleman server that sits between your device and the internet. It forwards your requests to websites, hides your real address, and can speed things up or add security.</w:t>
+      </w:r>
+    </w:p>
+    <w:p>
+      <w:pPr>
+        <w:rPr>
+          <w:b/>
+          <w:bCs/>
+          <w:szCs w:val="22"/>
+        </w:rPr>
+      </w:pPr>
+      <w:r>
+        <w:rPr>
+          <w:b/>
+          <w:bCs/>
+          <w:szCs w:val="22"/>
+        </w:rPr>
+        <w:t>Analogy:</w:t>
+      </w:r>
+    </w:p>
+    <w:p>
+      <w:pPr>
+        <w:rPr>
+          <w:rFonts w:cstheme="majorBidi"/>
+          <w:i/>
+          <w:iCs/>
+          <w:szCs w:val="22"/>
+        </w:rPr>
+      </w:pPr>
+      <w:r>
+        <w:rPr>
+          <w:rFonts w:cstheme="majorBidi"/>
+          <w:i/>
+          <w:iCs/>
+          <w:szCs w:val="22"/>
+        </w:rPr>
+        <w:t>Suppose you want to talk to someone but can't for security reasons, so you ask a third person to talk to him on your behalf. Then that third person is acting like a proxy between you and the second person.</w:t>
+      </w:r>
+    </w:p>
+    <w:p>
+      <w:pPr>
+        <w:rPr>
+          <w:rFonts w:cstheme="majorBidi"/>
+          <w:b/>
+          <w:bCs/>
+          <w:szCs w:val="22"/>
+        </w:rPr>
+      </w:pPr>
+      <w:r>
+        <w:rPr>
+          <w:rFonts w:cstheme="majorBidi"/>
+          <w:b/>
+          <w:bCs/>
+          <w:szCs w:val="22"/>
+        </w:rPr>
+        <w:t>Simple Flow:</w:t>
+      </w:r>
+    </w:p>
+    <w:p>
+      <w:pPr>
+        <w:rPr>
+          <w:rFonts w:cstheme="majorBidi"/>
+          <w:szCs w:val="22"/>
+        </w:rPr>
+      </w:pPr>
+      <w:r>
+        <w:rPr>
+          <w:rFonts w:cstheme="majorBidi"/>
+          <w:noProof/>
+          <w:szCs w:val="22"/>
+          <w:lang w:eastAsia="en-IN"/>
+        </w:rPr>
+        <mc:AlternateContent>
+          <mc:Choice Requires="wps">
+            <w:drawing>
+              <wp:anchor distT="0" distB="0" distL="114300" distR="114300" simplePos="0" relativeHeight="251665408" behindDoc="0" locked="0" layoutInCell="1" allowOverlap="1" wp14:anchorId="498E6DBC" wp14:editId="7814B337">
+                <wp:simplePos x="0" y="0"/>
+                <wp:positionH relativeFrom="column">
+                  <wp:posOffset>1678305</wp:posOffset>
+                </wp:positionH>
+                <wp:positionV relativeFrom="paragraph">
+                  <wp:posOffset>67945</wp:posOffset>
+                </wp:positionV>
+                <wp:extent cx="45085" cy="47625"/>
+                <wp:effectExtent l="0" t="38100" r="31115" b="66675"/>
+                <wp:wrapNone/>
+                <wp:docPr id="4" name="Right Arrow 4"/>
+                <wp:cNvGraphicFramePr/>
+                <a:graphic xmlns:a="http://schemas.openxmlformats.org/drawingml/2006/main">
+                  <a:graphicData uri="http://schemas.microsoft.com/office/word/2010/wordprocessingShape">
+                    <wps:wsp>
+                      <wps:cNvSpPr/>
+                      <wps:spPr>
+                        <a:xfrm>
+                          <a:off x="0" y="0"/>
+                          <a:ext cx="45085" cy="47625"/>
+                        </a:xfrm>
+                        <a:prstGeom prst="rightArrow">
+                          <a:avLst/>
+                        </a:prstGeom>
+                      </wps:spPr>
+                      <wps:style>
+                        <a:lnRef idx="2">
+                          <a:schemeClr val="accent1">
+                            <a:shade val="50000"/>
+                          </a:schemeClr>
+                        </a:lnRef>
+                        <a:fillRef idx="1">
+                          <a:schemeClr val="accent1"/>
+                        </a:fillRef>
+                        <a:effectRef idx="0">
+                          <a:schemeClr val="accent1"/>
+                        </a:effectRef>
+                        <a:fontRef idx="minor">
+                          <a:schemeClr val="lt1"/>
+                        </a:fontRef>
+                      </wps:style>
+                      <wps:bodyPr rot="0" spcFirstLastPara="0" vertOverflow="overflow" horzOverflow="overflow" vert="horz" wrap="square" lIns="91440" tIns="45720" rIns="91440" bIns="45720" numCol="1" spcCol="0" rtlCol="0" fromWordArt="0" anchor="ctr" anchorCtr="0" forceAA="0" compatLnSpc="1">
+                        <a:prstTxWarp prst="textNoShape">
+                          <a:avLst/>
+                        </a:prstTxWarp>
+                        <a:noAutofit/>
+                      </wps:bodyPr>
+                    </wps:wsp>
+                  </a:graphicData>
+                </a:graphic>
+              </wp:anchor>
+            </w:drawing>
+          </mc:Choice>
+          <mc:Fallback>
+            <w:pict>
+              <v:shapetype id="_x0000_t13" coordsize="21600,21600" o:spt="13" adj="16200,5400" path="m@0,l@0@1,0@1,0@2@0@2@0,21600,21600,10800xe">
+                <v:stroke joinstyle="miter"/>
+                <v:formulas>
+                  <v:f eqn="val #0"/>
+                  <v:f eqn="val #1"/>
+                  <v:f eqn="sum height 0 #1"/>
+                  <v:f eqn="sum 10800 0 #1"/>
+                  <v:f eqn="sum width 0 #0"/>
+                  <v:f eqn="prod @4 @3 10800"/>
+                  <v:f eqn="sum width 0 @5"/>
+                </v:formulas>
+                <v:path o:connecttype="custom" o:connectlocs="@0,0;0,10800;@0,21600;21600,10800" o:connectangles="270,180,90,0" textboxrect="0,@1,@6,@2"/>
+                <v:handles>
+                  <v:h position="#0,#1" xrange="0,21600" yrange="0,10800"/>
+                </v:handles>
+              </v:shapetype>
+              <v:shape id="Right Arrow 4" o:spid="_x0000_s1026" type="#_x0000_t13" style="position:absolute;margin-left:132.15pt;margin-top:5.35pt;width:3.55pt;height:3.75pt;z-index:251665408;visibility:visible;mso-wrap-style:square;mso-wrap-distance-left:9pt;mso-wrap-distance-top:0;mso-wrap-distance-right:9pt;mso-wrap-distance-bottom:0;mso-position-horizontal:absolute;mso-position-horizontal-relative:text;mso-position-vertical:absolute;mso-position-vertical-relative:text;v-text-anchor:middle" o:gfxdata="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" adj="10800" fillcolor="#4f81bd [3204]" strokecolor="#243f60 [1604]" strokeweight="2pt"/>
+            </w:pict>
+          </mc:Fallback>
+        </mc:AlternateContent>
+      </w:r>
+      <w:r>
+        <w:rPr>
+          <w:rFonts w:cstheme="majorBidi"/>
+          <w:noProof/>
+          <w:szCs w:val="22"/>
+          <w:lang w:eastAsia="en-IN"/>
+        </w:rPr>
+        <mc:AlternateContent>
+          <mc:Choice Requires="wps">
+            <w:drawing>
+              <wp:anchor distT="0" distB="0" distL="114300" distR="114300" simplePos="0" relativeHeight="251663360" behindDoc="0" locked="0" layoutInCell="1" allowOverlap="1" wp14:anchorId="02100B9D" wp14:editId="3C9A2BCD">
+                <wp:simplePos x="0" y="0"/>
+                <wp:positionH relativeFrom="column">
+                  <wp:posOffset>1249045</wp:posOffset>
+                </wp:positionH>
+                <wp:positionV relativeFrom="paragraph">
+                  <wp:posOffset>67945</wp:posOffset>
+                </wp:positionV>
+                <wp:extent cx="45085" cy="47625"/>
+                <wp:effectExtent l="0" t="38100" r="31115" b="66675"/>
+                <wp:wrapNone/>
+                <wp:docPr id="3" name="Right Arrow 3"/>
+                <wp:cNvGraphicFramePr/>
+                <a:graphic xmlns:a="http://schemas.openxmlformats.org/drawingml/2006/main">
+                  <a:graphicData uri="http://schemas.microsoft.com/office/word/2010/wordprocessingShape">
+                    <wps:wsp>
+                      <wps:cNvSpPr/>
+                      <wps:spPr>
+                        <a:xfrm>
+                          <a:off x="0" y="0"/>
+                          <a:ext cx="45085" cy="47625"/>
+                        </a:xfrm>
+                        <a:prstGeom prst="rightArrow">
+                          <a:avLst/>
+                        </a:prstGeom>
+                      </wps:spPr>
+                      <wps:style>
+                        <a:lnRef idx="2">
+                          <a:schemeClr val="accent1">
+                            <a:shade val="50000"/>
+                          </a:schemeClr>
+                        </a:lnRef>
+                        <a:fillRef idx="1">
+                          <a:schemeClr val="accent1"/>
+                        </a:fillRef>
+                        <a:effectRef idx="0">
+                          <a:schemeClr val="accent1"/>
+                        </a:effectRef>
+                        <a:fontRef idx="minor">
+                          <a:schemeClr val="lt1"/>
+                        </a:fontRef>
+                      </wps:style>
+                      <wps:bodyPr rot="0" spcFirstLastPara="0" vertOverflow="overflow" horzOverflow="overflow" vert="horz" wrap="square" lIns="91440" tIns="45720" rIns="91440" bIns="45720" numCol="1" spcCol="0" rtlCol="0" fromWordArt="0" anchor="ctr" anchorCtr="0" forceAA="0" compatLnSpc="1">
+                        <a:prstTxWarp prst="textNoShape">
+                          <a:avLst/>
+                        </a:prstTxWarp>
+                        <a:noAutofit/>
+                      </wps:bodyPr>
+                    </wps:wsp>
+                  </a:graphicData>
+                </a:graphic>
+                <wp14:sizeRelH relativeFrom="margin">
+                  <wp14:pctWidth>0</wp14:pctWidth>
+                </wp14:sizeRelH>
+                <wp14:sizeRelV relativeFrom="margin">
+                  <wp14:pctHeight>0</wp14:pctHeight>
+                </wp14:sizeRelV>
+              </wp:anchor>
+            </w:drawing>
+          </mc:Choice>
+          <mc:Fallback>
+            <w:pict>
+              <v:shape id="Right Arrow 3" o:spid="_x0000_s1026" type="#_x0000_t13" style="position:absolute;margin-left:98.35pt;margin-top:5.35pt;width:3.55pt;height:3.75pt;z-index:251663360;visibility:visible;mso-wrap-style:square;mso-width-percent:0;mso-height-percent:0;mso-wrap-distance-left:9pt;mso-wrap-distance-top:0;mso-wrap-distance-right:9pt;mso-wrap-distance-bottom:0;mso-position-horizontal:absolute;mso-position-horizontal-relative:text;mso-position-vertical:absolute;mso-position-vertical-relative:text;mso-width-percent:0;mso-height-percent:0;mso-width-relative:margin;mso-height-relative:margin;v-text-anchor:middle" o:gfxdata="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" adj="10800" fillcolor="#4f81bd [3204]" strokecolor="#243f60 [1604]" strokeweight="2pt"/>
+            </w:pict>
+          </mc:Fallback>
+        </mc:AlternateContent>
+      </w:r>
+      <w:r>
+        <w:rPr>
+          <w:rFonts w:cstheme="majorBidi"/>
+          <w:noProof/>
+          <w:szCs w:val="22"/>
+          <w:lang w:eastAsia="en-IN"/>
+        </w:rPr>
+        <mc:AlternateContent>
+          <mc:Choice Requires="wps">
+            <w:drawing>
+              <wp:anchor distT="0" distB="0" distL="114300" distR="114300" simplePos="0" relativeHeight="251661312" behindDoc="0" locked="0" layoutInCell="1" allowOverlap="1" wp14:anchorId="018F1FEF" wp14:editId="6AC8D0BD">
+                <wp:simplePos x="0" y="0"/>
+                <wp:positionH relativeFrom="column">
+                  <wp:posOffset>680085</wp:posOffset>
+                </wp:positionH>
+                <wp:positionV relativeFrom="paragraph">
+                  <wp:posOffset>67945</wp:posOffset>
+                </wp:positionV>
+                <wp:extent cx="45085" cy="47625"/>
+                <wp:effectExtent l="0" t="38100" r="31115" b="66675"/>
+                <wp:wrapNone/>
+                <wp:docPr id="2" name="Right Arrow 2"/>
+                <wp:cNvGraphicFramePr/>
+                <a:graphic xmlns:a="http://schemas.openxmlformats.org/drawingml/2006/main">
+                  <a:graphicData uri="http://schemas.microsoft.com/office/word/2010/wordprocessingShape">
+                    <wps:wsp>
+                      <wps:cNvSpPr/>
+                      <wps:spPr>
+                        <a:xfrm>
+                          <a:off x="0" y="0"/>
+                          <a:ext cx="45085" cy="47625"/>
+                        </a:xfrm>
+                        <a:prstGeom prst="rightArrow">
+                          <a:avLst/>
+                        </a:prstGeom>
+                      </wps:spPr>
+                      <wps:style>
+                        <a:lnRef idx="2">
+                          <a:schemeClr val="accent1">
+                            <a:shade val="50000"/>
+                          </a:schemeClr>
+                        </a:lnRef>
+                        <a:fillRef idx="1">
+                          <a:schemeClr val="accent1"/>
+                        </a:fillRef>
+                        <a:effectRef idx="0">
+                          <a:schemeClr val="accent1"/>
+                        </a:effectRef>
+                        <a:fontRef idx="minor">
+                          <a:schemeClr val="lt1"/>
+                        </a:fontRef>
+                      </wps:style>
+                      <wps:bodyPr rot="0" spcFirstLastPara="0" vertOverflow="overflow" horzOverflow="overflow" vert="horz" wrap="square" lIns="91440" tIns="45720" rIns="91440" bIns="45720" numCol="1" spcCol="0" rtlCol="0" fromWordArt="0" anchor="ctr" anchorCtr="0" forceAA="0" compatLnSpc="1">
+                        <a:prstTxWarp prst="textNoShape">
+                          <a:avLst/>
+                        </a:prstTxWarp>
+                        <a:noAutofit/>
+                      </wps:bodyPr>
+                    </wps:wsp>
+                  </a:graphicData>
+                </a:graphic>
+              </wp:anchor>
+            </w:drawing>
+          </mc:Choice>
+          <mc:Fallback>
+            <w:pict>
+              <v:shape id="Right Arrow 2" o:spid="_x0000_s1026" type="#_x0000_t13" style="position:absolute;margin-left:53.55pt;margin-top:5.35pt;width:3.55pt;height:3.75pt;z-index:251661312;visibility:visible;mso-wrap-style:square;mso-wrap-distance-left:9pt;mso-wrap-distance-top:0;mso-wrap-distance-right:9pt;mso-wrap-distance-bottom:0;mso-position-horizontal:absolute;mso-position-horizontal-relative:text;mso-position-vertical:absolute;mso-position-vertical-relative:text;v-text-anchor:middle" o:gfxdata="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" adj="10800" fillcolor="#4f81bd [3204]" strokecolor="#243f60 [1604]" strokeweight="2pt"/>
+            </w:pict>
+          </mc:Fallback>
+        </mc:AlternateContent>
+      </w:r>
+      <w:r>
+        <w:rPr>
+          <w:rFonts w:cstheme="majorBidi"/>
+          <w:noProof/>
+          <w:szCs w:val="22"/>
+          <w:lang w:eastAsia="en-IN"/>
+        </w:rPr>
+        <mc:AlternateContent>
+          <mc:Choice Requires="wps">
+            <w:drawing>
+              <wp:anchor distT="0" distB="0" distL="114300" distR="114300" simplePos="0" relativeHeight="251659264" behindDoc="0" locked="0" layoutInCell="1" allowOverlap="1" wp14:anchorId="34FCD65A" wp14:editId="62B80B17">
+                <wp:simplePos x="0" y="0"/>
+                <wp:positionH relativeFrom="column">
+                  <wp:posOffset>258417</wp:posOffset>
+                </wp:positionH>
+                <wp:positionV relativeFrom="paragraph">
+                  <wp:posOffset>71589</wp:posOffset>
+                </wp:positionV>
+                <wp:extent cx="45719" cy="47708"/>
+                <wp:effectExtent l="0" t="38100" r="31115" b="66675"/>
+                <wp:wrapNone/>
+                <wp:docPr id="1" name="Right Arrow 1"/>
+                <wp:cNvGraphicFramePr/>
+                <a:graphic xmlns:a="http://schemas.openxmlformats.org/drawingml/2006/main">
+                  <a:graphicData uri="http://schemas.microsoft.com/office/word/2010/wordprocessingShape">
+                    <wps:wsp>
+                      <wps:cNvSpPr/>
+                      <wps:spPr>
+                        <a:xfrm>
+                          <a:off x="0" y="0"/>
+                          <a:ext cx="45719" cy="47708"/>
+                        </a:xfrm>
+                        <a:prstGeom prst="rightArrow">
+                          <a:avLst/>
+                        </a:prstGeom>
+                      </wps:spPr>
+                      <wps:style>
+                        <a:lnRef idx="2">
+                          <a:schemeClr val="accent1">
+                            <a:shade val="50000"/>
+                          </a:schemeClr>
+                        </a:lnRef>
+                        <a:fillRef idx="1">
+                          <a:schemeClr val="accent1"/>
+                        </a:fillRef>
+                        <a:effectRef idx="0">
+                          <a:schemeClr val="accent1"/>
+                        </a:effectRef>
+                        <a:fontRef idx="minor">
+                          <a:schemeClr val="lt1"/>
+                        </a:fontRef>
+                      </wps:style>
+                      <wps:bodyPr rot="0" spcFirstLastPara="0" vertOverflow="overflow" horzOverflow="overflow" vert="horz" wrap="square" lIns="91440" tIns="45720" rIns="91440" bIns="45720" numCol="1" spcCol="0" rtlCol="0" fromWordArt="0" anchor="ctr" anchorCtr="0" forceAA="0" compatLnSpc="1">
+                        <a:prstTxWarp prst="textNoShape">
+                          <a:avLst/>
+                        </a:prstTxWarp>
+                        <a:noAutofit/>
+                      </wps:bodyPr>
+                    </wps:wsp>
+                  </a:graphicData>
+                </a:graphic>
+              </wp:anchor>
+            </w:drawing>
+          </mc:Choice>
+          <mc:Fallback>
+            <w:pict>
+              <v:shape id="Right Arrow 1" o:spid="_x0000_s1026" type="#_x0000_t13" style="position:absolute;margin-left:20.35pt;margin-top:5.65pt;width:3.6pt;height:3.75pt;z-index:251659264;visibility:visible;mso-wrap-style:square;mso-wrap-distance-left:9pt;mso-wrap-distance-top:0;mso-wrap-distance-right:9pt;mso-wrap-distance-bottom:0;mso-position-horizontal:absolute;mso-position-horizontal-relative:text;mso-position-vertical:absolute;mso-position-vertical-relative:text;v-text-anchor:middle" o:gfxdata="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" adj="10800" fillcolor="#4f81bd [3204]" strokecolor="#243f60 [1604]" strokeweight="2pt"/>
+            </w:pict>
+          </mc:Fallback>
+        </mc:AlternateContent>
+      </w:r>
+      <w:r>
+        <w:rPr>
+          <w:rFonts w:cstheme="majorBidi"/>
+          <w:szCs w:val="22"/>
+        </w:rPr>
+        <w:t xml:space="preserve">You </w:t>
+      </w:r>
+      <w:proofErr w:type="gramStart"/>
+      <w:r>
+        <w:rPr>
+          <w:rFonts w:cstheme="majorBidi"/>
+          <w:szCs w:val="22"/>
+        </w:rPr>
+        <w:t>-  Proxy</w:t>
+      </w:r>
+      <w:proofErr w:type="gramEnd"/>
+      <w:r>
+        <w:rPr>
+          <w:rFonts w:cstheme="majorBidi"/>
+          <w:szCs w:val="22"/>
+        </w:rPr>
+        <w:t xml:space="preserve">   Website   Proxy  </w:t>
+      </w:r>
+      <w:r>
+        <w:rPr>
+          <w:rFonts w:cstheme="majorBidi"/>
+          <w:szCs w:val="22"/>
+        </w:rPr>
+        <w:t>You (with response).</w:t>
+      </w:r>
+    </w:p>
+    <w:p>
+      <w:pPr>
+        <w:rPr>
+          <w:rFonts w:cstheme="majorBidi"/>
+          <w:szCs w:val="22"/>
+        </w:rPr>
+      </w:pPr>
+      <w:r>
+        <w:rPr>
+          <w:rFonts w:cstheme="majorBidi"/>
+          <w:szCs w:val="22"/>
+        </w:rPr>
+        <w:t>This shows your device routing through a proxy to reach sites safely.</w:t>
+      </w:r>
+    </w:p>
+    <w:p>
+      <w:pPr>
+        <w:rPr>
+          <w:rFonts w:cstheme="majorBidi"/>
+          <w:b/>
+          <w:bCs/>
+          <w:szCs w:val="22"/>
+        </w:rPr>
+      </w:pPr>
+    </w:p>
+    <w:p>
+      <w:pPr>
+        <w:rPr>
+          <w:rFonts w:cstheme="majorBidi"/>
+          <w:b/>
+          <w:bCs/>
+          <w:szCs w:val="22"/>
+        </w:rPr>
+      </w:pPr>
+      <w:r>
+        <w:rPr>
+          <w:rFonts w:cstheme="majorBidi"/>
+          <w:b/>
+          <w:bCs/>
+          <w:szCs w:val="22"/>
+        </w:rPr>
+        <w:t>Different</w:t>
+      </w:r>
+      <w:r>
+        <w:rPr>
+          <w:rFonts w:cstheme="majorBidi"/>
+          <w:b/>
+          <w:bCs/>
+          <w:szCs w:val="22"/>
+        </w:rPr>
+        <w:t xml:space="preserve"> Types</w:t>
+      </w:r>
+      <w:r>
+        <w:rPr>
+          <w:rFonts w:cstheme="majorBidi"/>
+          <w:b/>
+          <w:bCs/>
+          <w:szCs w:val="22"/>
+        </w:rPr>
+        <w:t xml:space="preserve"> of Proxies:</w:t>
+      </w:r>
+    </w:p>
+    <w:p>
+      <w:pPr>
+        <w:pStyle w:val="ListParagraph"/>
+        <w:numPr>
+          <w:ilvl w:val="0"/>
+          <w:numId w:val="10"/>
+        </w:numPr>
+        <w:rPr>
+          <w:rFonts w:cstheme="majorBidi"/>
+          <w:szCs w:val="22"/>
+        </w:rPr>
+      </w:pPr>
+      <w:r>
+        <w:rPr>
+          <w:rFonts w:cstheme="majorBidi"/>
+          <w:b/>
+          <w:bCs/>
+          <w:szCs w:val="22"/>
+        </w:rPr>
+        <w:t>Forward Proxy:</w:t>
+      </w:r>
+      <w:r>
+        <w:rPr>
+          <w:rFonts w:cstheme="majorBidi"/>
+          <w:szCs w:val="22"/>
+        </w:rPr>
+        <w:t xml:space="preserve"> Protects clients by filtering outbound traffic (e.g., company firewalls).</w:t>
+      </w:r>
+    </w:p>
+    <w:p>
+      <w:pPr>
+        <w:pStyle w:val="ListParagraph"/>
+        <w:numPr>
+          <w:ilvl w:val="0"/>
+          <w:numId w:val="10"/>
+        </w:numPr>
+        <w:rPr>
+          <w:rFonts w:cstheme="majorBidi"/>
+          <w:szCs w:val="22"/>
+        </w:rPr>
+      </w:pPr>
+      <w:r>
+        <w:rPr>
+          <w:rFonts w:cstheme="majorBidi"/>
+          <w:b/>
+          <w:bCs/>
+          <w:szCs w:val="22"/>
+        </w:rPr>
+        <w:t>Reverse Proxy:</w:t>
+      </w:r>
+      <w:r>
+        <w:rPr>
+          <w:rFonts w:cstheme="majorBidi"/>
+          <w:szCs w:val="22"/>
+        </w:rPr>
+        <w:t xml:space="preserve"> Protects servers by handling inbound requests (e.g., load balancing in AWS ELB).</w:t>
+      </w:r>
+    </w:p>
+    <w:p>
+      <w:pPr>
+        <w:pStyle w:val="ListParagraph"/>
+        <w:numPr>
+          <w:ilvl w:val="0"/>
+          <w:numId w:val="10"/>
+        </w:numPr>
+        <w:rPr>
+          <w:rFonts w:cstheme="majorBidi"/>
+          <w:szCs w:val="22"/>
+        </w:rPr>
+      </w:pPr>
+      <w:r>
+        <w:rPr>
+          <w:rFonts w:cstheme="majorBidi"/>
+          <w:b/>
+          <w:bCs/>
+          <w:noProof/>
+          <w:szCs w:val="22"/>
+          <w:lang w:eastAsia="en-IN"/>
+        </w:rPr>
+        <mc:AlternateContent>
+          <mc:Choice Requires="wps">
+            <w:drawing>
+              <wp:anchor distT="0" distB="0" distL="114300" distR="114300" simplePos="0" relativeHeight="251666432" behindDoc="0" locked="0" layoutInCell="1" allowOverlap="1" wp14:anchorId="3FDAD846" wp14:editId="49A7D1F7">
+                <wp:simplePos x="0" y="0"/>
+                <wp:positionH relativeFrom="column">
+                  <wp:posOffset>524786</wp:posOffset>
+                </wp:positionH>
+                <wp:positionV relativeFrom="paragraph">
+                  <wp:posOffset>134813</wp:posOffset>
+                </wp:positionV>
+                <wp:extent cx="575807" cy="508884"/>
+                <wp:effectExtent l="38100" t="0" r="34290" b="62865"/>
+                <wp:wrapNone/>
+                <wp:docPr id="5" name="Straight Arrow Connector 5"/>
+                <wp:cNvGraphicFramePr/>
+                <a:graphic xmlns:a="http://schemas.openxmlformats.org/drawingml/2006/main">
+                  <a:graphicData uri="http://schemas.microsoft.com/office/word/2010/wordprocessingShape">
+                    <wps:wsp>
+                      <wps:cNvCnPr/>
+                      <wps:spPr>
+                        <a:xfrm flipH="1">
+                          <a:off x="0" y="0"/>
+                          <a:ext cx="575807" cy="508884"/>
+                        </a:xfrm>
+                        <a:prstGeom prst="straightConnector1">
+                          <a:avLst/>
+                        </a:prstGeom>
+                        <a:ln>
+                          <a:tailEnd type="arrow"/>
+                        </a:ln>
+                      </wps:spPr>
+                      <wps:style>
+                        <a:lnRef idx="1">
+                          <a:schemeClr val="accent1"/>
+                        </a:lnRef>
+                        <a:fillRef idx="0">
+                          <a:schemeClr val="accent1"/>
+                        </a:fillRef>
+                        <a:effectRef idx="0">
+                          <a:schemeClr val="accent1"/>
+                        </a:effectRef>
+                        <a:fontRef idx="minor">
+                          <a:schemeClr val="tx1"/>
+                        </a:fontRef>
+                      </wps:style>
+                      <wps:bodyPr/>
+                    </wps:wsp>
+                  </a:graphicData>
+                </a:graphic>
+                <wp14:sizeRelH relativeFrom="margin">
+                  <wp14:pctWidth>0</wp14:pctWidth>
+                </wp14:sizeRelH>
+                <wp14:sizeRelV relativeFrom="margin">
+                  <wp14:pctHeight>0</wp14:pctHeight>
+                </wp14:sizeRelV>
+              </wp:anchor>
+            </w:drawing>
+          </mc:Choice>
+          <mc:Fallback>
+            <w:pict>
+              <v:shapetype id="_x0000_t32" coordsize="21600,21600" o:spt="32" o:oned="t" path="m,l21600,21600e" filled="f">
+                <v:path arrowok="t" fillok="f" o:connecttype="none"/>
+                <o:lock v:ext="edit" shapetype="t"/>
+              </v:shapetype>
+              <v:shape id="Straight Arrow Connector 5" o:spid="_x0000_s1026" type="#_x0000_t32" style="position:absolute;margin-left:41.3pt;margin-top:10.6pt;width:45.35pt;height:40.05pt;flip:x;z-index:251666432;visibility:visible;mso-wrap-style:square;mso-width-percent:0;mso-height-percent:0;mso-wrap-distance-left:9pt;mso-wrap-distance-top:0;mso-wrap-distance-right:9pt;mso-wrap-distance-bottom:0;mso-position-horizontal:absolute;mso-position-horizontal-relative:text;mso-position-vertical:absolute;mso-position-vertical-relative:text;mso-width-percent:0;mso-height-percent:0;mso-width-relative:margin;mso-height-relative:margin" o:gfxdata="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" strokecolor="#4579b8 [3044]">
+                <v:stroke endarrow="open"/>
+              </v:shape>
+            </w:pict>
+          </mc:Fallback>
+        </mc:AlternateContent>
+      </w:r>
+      <w:r>
+        <w:rPr>
+          <w:rFonts w:cstheme="majorBidi"/>
+          <w:b/>
+          <w:bCs/>
+          <w:szCs w:val="22"/>
+        </w:rPr>
+        <w:t>Transparent:</w:t>
+      </w:r>
+      <w:r>
+        <w:rPr>
+          <w:rFonts w:cstheme="majorBidi"/>
+          <w:szCs w:val="22"/>
+        </w:rPr>
+        <w:t xml:space="preserve"> Works silently without client changes.</w:t>
+      </w:r>
+      <w:r>
+        <w:rPr>
+          <w:rFonts w:cstheme="majorBidi"/>
+          <w:szCs w:val="22"/>
+        </w:rPr>
+        <w:t xml:space="preserve"> </w:t>
+      </w:r>
+    </w:p>
+    <w:p>
+      <w:pPr>
+        <w:rPr>
+          <w:rFonts w:cstheme="majorBidi"/>
+          <w:szCs w:val="22"/>
+        </w:rPr>
+      </w:pPr>
+    </w:p>
+    <w:p>
+      <w:pPr>
+        <w:rPr>
+          <w:rFonts w:cstheme="majorBidi"/>
+          <w:sz w:val="20"/>
+        </w:rPr>
+      </w:pPr>
+      <w:r>
+        <w:rPr>
+          <w:rFonts w:cstheme="majorBidi"/>
+          <w:sz w:val="20"/>
+        </w:rPr>
+        <w:t>Network gear (routers/firewalls) automatically reroutes your traffic to the proxy, which inspects/forwards it. You think you're connecting directly to sites, but it's the proxy handling things invisibly.</w:t>
+      </w:r>
+      <w:r>
+        <w:rPr>
+          <w:rFonts w:cstheme="majorBidi"/>
+          <w:sz w:val="20"/>
+        </w:rPr>
+        <w:t xml:space="preserve"> </w:t>
+      </w:r>
+    </w:p>
+    <w:p>
+      <w:pPr>
+        <w:pStyle w:val="ListParagraph"/>
+        <w:numPr>
+          <w:ilvl w:val="0"/>
+          <w:numId w:val="12"/>
+        </w:numPr>
+        <w:rPr>
+          <w:rFonts w:cstheme="majorBidi"/>
+          <w:sz w:val="20"/>
+        </w:rPr>
+      </w:pPr>
+      <w:r>
+        <w:rPr>
+          <w:rFonts w:cstheme="majorBidi"/>
+          <w:sz w:val="20"/>
+        </w:rPr>
+        <w:lastRenderedPageBreak/>
+        <w:t>Transparent proxies are</w:t>
+      </w:r>
+      <w:r>
+        <w:rPr>
+          <w:rFonts w:cstheme="majorBidi"/>
+          <w:sz w:val="20"/>
+        </w:rPr>
+        <w:t xml:space="preserve"> commonly used in Schools/ISPs block sites or log activity without </w:t>
+      </w:r>
+      <w:proofErr w:type="gramStart"/>
+      <w:r>
+        <w:rPr>
+          <w:rFonts w:cstheme="majorBidi"/>
+          <w:sz w:val="20"/>
+        </w:rPr>
+        <w:t xml:space="preserve">telling </w:t>
+      </w:r>
+      <w:r>
+        <w:rPr>
+          <w:rFonts w:cstheme="majorBidi"/>
+          <w:sz w:val="20"/>
+        </w:rPr>
+        <w:t xml:space="preserve"> the</w:t>
+      </w:r>
+      <w:proofErr w:type="gramEnd"/>
+      <w:r>
+        <w:rPr>
+          <w:rFonts w:cstheme="majorBidi"/>
+          <w:sz w:val="20"/>
+        </w:rPr>
+        <w:t xml:space="preserve"> </w:t>
+      </w:r>
+      <w:r>
+        <w:rPr>
+          <w:rFonts w:cstheme="majorBidi"/>
+          <w:sz w:val="20"/>
+        </w:rPr>
+        <w:t>users.</w:t>
+      </w:r>
+    </w:p>
+    <w:p>
+      <w:pPr>
+        <w:pStyle w:val="ListParagraph"/>
+        <w:numPr>
+          <w:ilvl w:val="0"/>
+          <w:numId w:val="11"/>
+        </w:numPr>
+        <w:rPr>
+          <w:rFonts w:cstheme="majorBidi"/>
+          <w:sz w:val="20"/>
+        </w:rPr>
+      </w:pPr>
+      <w:r>
+        <w:rPr>
+          <w:rFonts w:cstheme="majorBidi"/>
+          <w:sz w:val="20"/>
+          <w:highlight w:val="yellow"/>
+        </w:rPr>
+        <w:t>Proxies cache data for quick grabs</w:t>
+      </w:r>
+      <w:r>
+        <w:rPr>
+          <w:rFonts w:cstheme="majorBidi"/>
+          <w:sz w:val="20"/>
+        </w:rPr>
+        <w:t xml:space="preserve"> (fast shelf in 3-tier apps, </w:t>
+      </w:r>
+      <w:r>
+        <w:rPr>
+          <w:rFonts w:cstheme="majorBidi"/>
+          <w:sz w:val="20"/>
+        </w:rPr>
+        <w:t>skips slow DB) and hide your IP for security</w:t>
+      </w:r>
+      <w:r>
+        <w:rPr>
+          <w:rFonts w:cstheme="majorBidi"/>
+          <w:sz w:val="20"/>
+        </w:rPr>
+        <w:t>.</w:t>
+      </w:r>
+    </w:p>
+    <w:p>
+      <w:pPr>
+        <w:pStyle w:val="ListParagraph"/>
+        <w:numPr>
+          <w:ilvl w:val="0"/>
+          <w:numId w:val="11"/>
+        </w:numPr>
+        <w:rPr>
+          <w:rFonts w:cstheme="majorBidi"/>
+          <w:sz w:val="20"/>
+        </w:rPr>
+      </w:pPr>
+      <w:r>
+        <w:rPr>
+          <w:rFonts w:cstheme="majorBidi"/>
+          <w:sz w:val="20"/>
+        </w:rPr>
+        <w:t>They also block threats by filtering malware, hacks, or floods before they reach you or servers.</w:t>
+      </w:r>
+    </w:p>
+    <w:p>
+      <w:pPr>
+        <w:rPr>
+          <w:rFonts w:cstheme="majorBidi"/>
+          <w:sz w:val="20"/>
+        </w:rPr>
+      </w:pPr>
+    </w:p>
+    <w:p>
+      <w:pPr>
+        <w:rPr>
+          <w:rFonts w:cstheme="majorBidi"/>
+          <w:b/>
+          <w:bCs/>
+          <w:sz w:val="20"/>
+        </w:rPr>
+      </w:pPr>
+      <w:r>
+        <w:rPr>
+          <w:rFonts w:cstheme="majorBidi"/>
+          <w:b/>
+          <w:bCs/>
+          <w:sz w:val="20"/>
+        </w:rPr>
+        <w:t xml:space="preserve">Q: </w:t>
+      </w:r>
+      <w:r>
+        <w:rPr>
+          <w:rFonts w:cstheme="majorBidi"/>
+          <w:b/>
+          <w:bCs/>
+          <w:sz w:val="20"/>
+        </w:rPr>
+        <w:t xml:space="preserve">What is the difference between a proxy and </w:t>
+      </w:r>
+      <w:proofErr w:type="spellStart"/>
+      <w:r>
+        <w:rPr>
+          <w:rFonts w:cstheme="majorBidi"/>
+          <w:b/>
+          <w:bCs/>
+          <w:sz w:val="20"/>
+        </w:rPr>
+        <w:t>Redis</w:t>
+      </w:r>
+      <w:proofErr w:type="spellEnd"/>
+      <w:r>
+        <w:rPr>
+          <w:rFonts w:cstheme="majorBidi"/>
+          <w:b/>
+          <w:bCs/>
+          <w:sz w:val="20"/>
+        </w:rPr>
+        <w:t>? Don't they do the same thing?</w:t>
+      </w:r>
+    </w:p>
+    <w:p>
+      <w:pPr>
+        <w:rPr>
+          <w:rFonts w:cstheme="majorBidi"/>
+          <w:b/>
+          <w:bCs/>
+          <w:sz w:val="20"/>
+        </w:rPr>
+      </w:pPr>
+      <w:proofErr w:type="spellStart"/>
+      <w:r>
+        <w:rPr>
+          <w:rFonts w:cstheme="majorBidi"/>
+          <w:b/>
+          <w:bCs/>
+          <w:sz w:val="20"/>
+        </w:rPr>
+        <w:t>Ans</w:t>
+      </w:r>
+      <w:proofErr w:type="spellEnd"/>
+      <w:r>
+        <w:rPr>
+          <w:rFonts w:cstheme="majorBidi"/>
+          <w:b/>
+          <w:bCs/>
+          <w:sz w:val="20"/>
+        </w:rPr>
+        <w:t>:</w:t>
+      </w:r>
+    </w:p>
+    <w:p>
+      <w:pPr>
+        <w:pStyle w:val="ListParagraph"/>
+        <w:numPr>
+          <w:ilvl w:val="0"/>
+          <w:numId w:val="13"/>
+        </w:numPr>
+        <w:rPr>
+          <w:rFonts w:cstheme="majorBidi"/>
+          <w:b/>
+          <w:bCs/>
+          <w:sz w:val="20"/>
+        </w:rPr>
+      </w:pPr>
+      <w:proofErr w:type="spellStart"/>
+      <w:r>
+        <w:rPr>
+          <w:rFonts w:cstheme="majorBidi"/>
+          <w:b/>
+          <w:bCs/>
+          <w:sz w:val="20"/>
+        </w:rPr>
+        <w:t>Redis</w:t>
+      </w:r>
+      <w:proofErr w:type="spellEnd"/>
+      <w:r>
+        <w:rPr>
+          <w:rFonts w:cstheme="majorBidi"/>
+          <w:b/>
+          <w:bCs/>
+          <w:sz w:val="20"/>
+        </w:rPr>
+        <w:t xml:space="preserve"> </w:t>
+      </w:r>
+      <w:r>
+        <w:rPr>
+          <w:rFonts w:cstheme="majorBidi"/>
+          <w:sz w:val="20"/>
+        </w:rPr>
+        <w:t>is like a super-fast filing cabinet that only stores and quickly grabs data (numbers, user info) you put in it.</w:t>
+      </w:r>
+    </w:p>
+    <w:p>
+      <w:pPr>
+        <w:pStyle w:val="ListParagraph"/>
+        <w:numPr>
+          <w:ilvl w:val="0"/>
+          <w:numId w:val="13"/>
+        </w:numPr>
+        <w:rPr>
+          <w:rFonts w:cstheme="majorBidi"/>
+          <w:b/>
+          <w:bCs/>
+          <w:sz w:val="20"/>
+        </w:rPr>
+      </w:pPr>
+      <w:r>
+        <w:rPr>
+          <w:rFonts w:cstheme="majorBidi"/>
+          <w:b/>
+          <w:bCs/>
+          <w:sz w:val="20"/>
+        </w:rPr>
+        <w:t>Proxy</w:t>
+      </w:r>
+      <w:r>
+        <w:rPr>
+          <w:rFonts w:cstheme="majorBidi"/>
+          <w:sz w:val="20"/>
+        </w:rPr>
+        <w:t xml:space="preserve"> is like a helpful assistant who carries messages between you and websites, and sometimes keeps copies of whole web pages to serve instantly - but its main job is forwarding traffic safely.</w:t>
+      </w:r>
+    </w:p>
+    <w:p>
+      <w:pPr>
+        <w:rPr>
+          <w:rFonts w:cstheme="majorBidi"/>
+          <w:sz w:val="20"/>
+        </w:rPr>
+      </w:pPr>
+      <w:proofErr w:type="spellStart"/>
+      <w:r>
+        <w:rPr>
+          <w:rFonts w:cstheme="majorBidi"/>
+          <w:b/>
+          <w:bCs/>
+          <w:sz w:val="20"/>
+          <w:highlight w:val="yellow"/>
+        </w:rPr>
+        <w:t>Redis</w:t>
+      </w:r>
+      <w:proofErr w:type="spellEnd"/>
+      <w:r>
+        <w:rPr>
+          <w:rFonts w:cstheme="majorBidi"/>
+          <w:sz w:val="20"/>
+          <w:highlight w:val="yellow"/>
+        </w:rPr>
+        <w:t xml:space="preserve"> = pure storage speed.</w:t>
+      </w:r>
+      <w:r>
+        <w:rPr>
+          <w:rFonts w:cstheme="majorBidi"/>
+          <w:b/>
+          <w:bCs/>
+          <w:sz w:val="20"/>
+          <w:highlight w:val="yellow"/>
+        </w:rPr>
+        <w:t xml:space="preserve"> Proxy</w:t>
+      </w:r>
+      <w:r>
+        <w:rPr>
+          <w:rFonts w:cstheme="majorBidi"/>
+          <w:sz w:val="20"/>
+          <w:highlight w:val="yellow"/>
+        </w:rPr>
+        <w:t xml:space="preserve"> = traffic handler that might cache too.</w:t>
+      </w:r>
+    </w:p>
     <w:sectPr>
       <w:pgSz w:w="11906" w:h="16838"/>
       <w:pgMar w:top="1440" w:right="1440" w:bottom="1440" w:left="1440" w:header="708" w:footer="708" w:gutter="0"/>
@@ -1531,9 +3129,172 @@
 </w:document>
 </file>
 
+<file path=word/endnotes.xml><?xml version="1.0" encoding="utf-8"?>
+<w:endnotes xmlns:wpc="http://schemas.microsoft.com/office/word/2010/wordprocessingCanvas" xmlns:mc="http://schemas.openxmlformats.org/markup-compatibility/2006" xmlns:o="urn:schemas-microsoft-com:office:office" xmlns:r="http://schemas.openxmlformats.org/officeDocument/2006/relationships" xmlns:m="http://schemas.openxmlformats.org/officeDocument/2006/math" xmlns:v="urn:schemas-microsoft-com:vml" xmlns:wp14="http://schemas.microsoft.com/office/word/2010/wordprocessingDrawing" xmlns:wp="http://schemas.openxmlformats.org/drawingml/2006/wordprocessingDrawing" xmlns:w10="urn:schemas-microsoft-com:office:word" xmlns:w="http://schemas.openxmlformats.org/wordprocessingml/2006/main" xmlns:w14="http://schemas.microsoft.com/office/word/2010/wordml" xmlns:wpg="http://schemas.microsoft.com/office/word/2010/wordprocessingGroup" xmlns:wpi="http://schemas.microsoft.com/office/word/2010/wordprocessingInk" xmlns:wne="http://schemas.microsoft.com/office/word/2006/wordml" xmlns:wps="http://schemas.microsoft.com/office/word/2010/wordprocessingShape" mc:Ignorable="w14 wp14">
+  <w:endnote w:type="separator" w:id="-1">
+    <w:p>
+      <w:pPr>
+        <w:spacing w:after="0" w:line="240" w:lineRule="auto"/>
+      </w:pPr>
+      <w:r>
+        <w:separator/>
+      </w:r>
+    </w:p>
+  </w:endnote>
+  <w:endnote w:type="continuationSeparator" w:id="0">
+    <w:p>
+      <w:pPr>
+        <w:spacing w:after="0" w:line="240" w:lineRule="auto"/>
+      </w:pPr>
+      <w:r>
+        <w:continuationSeparator/>
+      </w:r>
+    </w:p>
+  </w:endnote>
+</w:endnotes>
+</file>
+
+<file path=word/footnotes.xml><?xml version="1.0" encoding="utf-8"?>
+<w:footnotes xmlns:wpc="http://schemas.microsoft.com/office/word/2010/wordprocessingCanvas" xmlns:mc="http://schemas.openxmlformats.org/markup-compatibility/2006" xmlns:o="urn:schemas-microsoft-com:office:office" xmlns:r="http://schemas.openxmlformats.org/officeDocument/2006/relationships" xmlns:m="http://schemas.openxmlformats.org/officeDocument/2006/math" xmlns:v="urn:schemas-microsoft-com:vml" xmlns:wp14="http://schemas.microsoft.com/office/word/2010/wordprocessingDrawing" xmlns:wp="http://schemas.openxmlformats.org/drawingml/2006/wordprocessingDrawing" xmlns:w10="urn:schemas-microsoft-com:office:word" xmlns:w="http://schemas.openxmlformats.org/wordprocessingml/2006/main" xmlns:w14="http://schemas.microsoft.com/office/word/2010/wordml" xmlns:wpg="http://schemas.microsoft.com/office/word/2010/wordprocessingGroup" xmlns:wpi="http://schemas.microsoft.com/office/word/2010/wordprocessingInk" xmlns:wne="http://schemas.microsoft.com/office/word/2006/wordml" xmlns:wps="http://schemas.microsoft.com/office/word/2010/wordprocessingShape" mc:Ignorable="w14 wp14">
+  <w:footnote w:type="separator" w:id="-1">
+    <w:p>
+      <w:pPr>
+        <w:spacing w:after="0" w:line="240" w:lineRule="auto"/>
+      </w:pPr>
+      <w:r>
+        <w:separator/>
+      </w:r>
+    </w:p>
+  </w:footnote>
+  <w:footnote w:type="continuationSeparator" w:id="0">
+    <w:p>
+      <w:pPr>
+        <w:spacing w:after="0" w:line="240" w:lineRule="auto"/>
+      </w:pPr>
+      <w:r>
+        <w:continuationSeparator/>
+      </w:r>
+    </w:p>
+  </w:footnote>
+</w:footnotes>
+</file>
+
 <file path=word/numbering.xml><?xml version="1.0" encoding="utf-8"?>
 <w:numbering xmlns:wpc="http://schemas.microsoft.com/office/word/2010/wordprocessingCanvas" xmlns:mc="http://schemas.openxmlformats.org/markup-compatibility/2006" xmlns:o="urn:schemas-microsoft-com:office:office" xmlns:r="http://schemas.openxmlformats.org/officeDocument/2006/relationships" xmlns:m="http://schemas.openxmlformats.org/officeDocument/2006/math" xmlns:v="urn:schemas-microsoft-com:vml" xmlns:wp14="http://schemas.microsoft.com/office/word/2010/wordprocessingDrawing" xmlns:wp="http://schemas.openxmlformats.org/drawingml/2006/wordprocessingDrawing" xmlns:w10="urn:schemas-microsoft-com:office:word" xmlns:w="http://schemas.openxmlformats.org/wordprocessingml/2006/main" xmlns:w14="http://schemas.microsoft.com/office/word/2010/wordml" xmlns:wpg="http://schemas.microsoft.com/office/word/2010/wordprocessingGroup" xmlns:wpi="http://schemas.microsoft.com/office/word/2010/wordprocessingInk" xmlns:wne="http://schemas.microsoft.com/office/word/2006/wordml" xmlns:wps="http://schemas.microsoft.com/office/word/2010/wordprocessingShape" mc:Ignorable="w14 wp14">
   <w:abstractNum w:abstractNumId="0">
+    <w:nsid w:val="083D4A55"/>
+    <w:multiLevelType w:val="hybridMultilevel"/>
+    <w:tmpl w:val="C14292F6"/>
+    <w:lvl w:ilvl="0" w:tplc="40090001">
+      <w:start w:val="1"/>
+      <w:numFmt w:val="bullet"/>
+      <w:lvlText w:val=""/>
+      <w:lvlJc w:val="left"/>
+      <w:pPr>
+        <w:ind w:left="720" w:hanging="360"/>
+      </w:pPr>
+      <w:rPr>
+        <w:rFonts w:ascii="Symbol" w:hAnsi="Symbol" w:hint="default"/>
+      </w:rPr>
+    </w:lvl>
+    <w:lvl w:ilvl="1" w:tplc="40090003" w:tentative="1">
+      <w:start w:val="1"/>
+      <w:numFmt w:val="bullet"/>
+      <w:lvlText w:val="o"/>
+      <w:lvlJc w:val="left"/>
+      <w:pPr>
+        <w:ind w:left="1440" w:hanging="360"/>
+      </w:pPr>
+      <w:rPr>
+        <w:rFonts w:ascii="Courier New" w:hAnsi="Courier New" w:cs="Courier New" w:hint="default"/>
+      </w:rPr>
+    </w:lvl>
+    <w:lvl w:ilvl="2" w:tplc="40090005" w:tentative="1">
+      <w:start w:val="1"/>
+      <w:numFmt w:val="bullet"/>
+      <w:lvlText w:val=""/>
+      <w:lvlJc w:val="left"/>
+      <w:pPr>
+        <w:ind w:left="2160" w:hanging="360"/>
+      </w:pPr>
+      <w:rPr>
+        <w:rFonts w:ascii="Wingdings" w:hAnsi="Wingdings" w:hint="default"/>
+      </w:rPr>
+    </w:lvl>
+    <w:lvl w:ilvl="3" w:tplc="40090001" w:tentative="1">
+      <w:start w:val="1"/>
+      <w:numFmt w:val="bullet"/>
+      <w:lvlText w:val=""/>
+      <w:lvlJc w:val="left"/>
+      <w:pPr>
+        <w:ind w:left="2880" w:hanging="360"/>
+      </w:pPr>
+      <w:rPr>
+        <w:rFonts w:ascii="Symbol" w:hAnsi="Symbol" w:hint="default"/>
+      </w:rPr>
+    </w:lvl>
+    <w:lvl w:ilvl="4" w:tplc="40090003" w:tentative="1">
+      <w:start w:val="1"/>
+      <w:numFmt w:val="bullet"/>
+      <w:lvlText w:val="o"/>
+      <w:lvlJc w:val="left"/>
+      <w:pPr>
+        <w:ind w:left="3600" w:hanging="360"/>
+      </w:pPr>
+      <w:rPr>
+        <w:rFonts w:ascii="Courier New" w:hAnsi="Courier New" w:cs="Courier New" w:hint="default"/>
+      </w:rPr>
+    </w:lvl>
+    <w:lvl w:ilvl="5" w:tplc="40090005" w:tentative="1">
+      <w:start w:val="1"/>
+      <w:numFmt w:val="bullet"/>
+      <w:lvlText w:val=""/>
+      <w:lvlJc w:val="left"/>
+      <w:pPr>
+        <w:ind w:left="4320" w:hanging="360"/>
+      </w:pPr>
+      <w:rPr>
+        <w:rFonts w:ascii="Wingdings" w:hAnsi="Wingdings" w:hint="default"/>
+      </w:rPr>
+    </w:lvl>
+    <w:lvl w:ilvl="6" w:tplc="40090001" w:tentative="1">
+      <w:start w:val="1"/>
+      <w:numFmt w:val="bullet"/>
+      <w:lvlText w:val=""/>
+      <w:lvlJc w:val="left"/>
+      <w:pPr>
+        <w:ind w:left="5040" w:hanging="360"/>
+      </w:pPr>
+      <w:rPr>
+        <w:rFonts w:ascii="Symbol" w:hAnsi="Symbol" w:hint="default"/>
+      </w:rPr>
+    </w:lvl>
+    <w:lvl w:ilvl="7" w:tplc="40090003" w:tentative="1">
+      <w:start w:val="1"/>
+      <w:numFmt w:val="bullet"/>
+      <w:lvlText w:val="o"/>
+      <w:lvlJc w:val="left"/>
+      <w:pPr>
+        <w:ind w:left="5760" w:hanging="360"/>
+      </w:pPr>
+      <w:rPr>
+        <w:rFonts w:ascii="Courier New" w:hAnsi="Courier New" w:cs="Courier New" w:hint="default"/>
+      </w:rPr>
+    </w:lvl>
+    <w:lvl w:ilvl="8" w:tplc="40090005" w:tentative="1">
+      <w:start w:val="1"/>
+      <w:numFmt w:val="bullet"/>
+      <w:lvlText w:val=""/>
+      <w:lvlJc w:val="left"/>
+      <w:pPr>
+        <w:ind w:left="6480" w:hanging="360"/>
+      </w:pPr>
+      <w:rPr>
+        <w:rFonts w:ascii="Wingdings" w:hAnsi="Wingdings" w:hint="default"/>
+      </w:rPr>
+    </w:lvl>
+  </w:abstractNum>
+  <w:abstractNum w:abstractNumId="1">
     <w:nsid w:val="0B206E2C"/>
     <w:multiLevelType w:val="hybridMultilevel"/>
     <w:tmpl w:val="AF6AF642"/>
@@ -1646,7 +3407,120 @@
       </w:rPr>
     </w:lvl>
   </w:abstractNum>
-  <w:abstractNum w:abstractNumId="1">
+  <w:abstractNum w:abstractNumId="2">
+    <w:nsid w:val="0BBF4368"/>
+    <w:multiLevelType w:val="hybridMultilevel"/>
+    <w:tmpl w:val="6B249BEE"/>
+    <w:lvl w:ilvl="0" w:tplc="40090001">
+      <w:start w:val="1"/>
+      <w:numFmt w:val="bullet"/>
+      <w:lvlText w:val=""/>
+      <w:lvlJc w:val="left"/>
+      <w:pPr>
+        <w:ind w:left="720" w:hanging="360"/>
+      </w:pPr>
+      <w:rPr>
+        <w:rFonts w:ascii="Symbol" w:hAnsi="Symbol" w:hint="default"/>
+      </w:rPr>
+    </w:lvl>
+    <w:lvl w:ilvl="1" w:tplc="40090003" w:tentative="1">
+      <w:start w:val="1"/>
+      <w:numFmt w:val="bullet"/>
+      <w:lvlText w:val="o"/>
+      <w:lvlJc w:val="left"/>
+      <w:pPr>
+        <w:ind w:left="1440" w:hanging="360"/>
+      </w:pPr>
+      <w:rPr>
+        <w:rFonts w:ascii="Courier New" w:hAnsi="Courier New" w:cs="Courier New" w:hint="default"/>
+      </w:rPr>
+    </w:lvl>
+    <w:lvl w:ilvl="2" w:tplc="40090005" w:tentative="1">
+      <w:start w:val="1"/>
+      <w:numFmt w:val="bullet"/>
+      <w:lvlText w:val=""/>
+      <w:lvlJc w:val="left"/>
+      <w:pPr>
+        <w:ind w:left="2160" w:hanging="360"/>
+      </w:pPr>
+      <w:rPr>
+        <w:rFonts w:ascii="Wingdings" w:hAnsi="Wingdings" w:hint="default"/>
+      </w:rPr>
+    </w:lvl>
+    <w:lvl w:ilvl="3" w:tplc="40090001" w:tentative="1">
+      <w:start w:val="1"/>
+      <w:numFmt w:val="bullet"/>
+      <w:lvlText w:val=""/>
+      <w:lvlJc w:val="left"/>
+      <w:pPr>
+        <w:ind w:left="2880" w:hanging="360"/>
+      </w:pPr>
+      <w:rPr>
+        <w:rFonts w:ascii="Symbol" w:hAnsi="Symbol" w:hint="default"/>
+      </w:rPr>
+    </w:lvl>
+    <w:lvl w:ilvl="4" w:tplc="40090003" w:tentative="1">
+      <w:start w:val="1"/>
+      <w:numFmt w:val="bullet"/>
+      <w:lvlText w:val="o"/>
+      <w:lvlJc w:val="left"/>
+      <w:pPr>
+        <w:ind w:left="3600" w:hanging="360"/>
+      </w:pPr>
+      <w:rPr>
+        <w:rFonts w:ascii="Courier New" w:hAnsi="Courier New" w:cs="Courier New" w:hint="default"/>
+      </w:rPr>
+    </w:lvl>
+    <w:lvl w:ilvl="5" w:tplc="40090005" w:tentative="1">
+      <w:start w:val="1"/>
+      <w:numFmt w:val="bullet"/>
+      <w:lvlText w:val=""/>
+      <w:lvlJc w:val="left"/>
+      <w:pPr>
+        <w:ind w:left="4320" w:hanging="360"/>
+      </w:pPr>
+      <w:rPr>
+        <w:rFonts w:ascii="Wingdings" w:hAnsi="Wingdings" w:hint="default"/>
+      </w:rPr>
+    </w:lvl>
+    <w:lvl w:ilvl="6" w:tplc="40090001" w:tentative="1">
+      <w:start w:val="1"/>
+      <w:numFmt w:val="bullet"/>
+      <w:lvlText w:val=""/>
+      <w:lvlJc w:val="left"/>
+      <w:pPr>
+        <w:ind w:left="5040" w:hanging="360"/>
+      </w:pPr>
+      <w:rPr>
+        <w:rFonts w:ascii="Symbol" w:hAnsi="Symbol" w:hint="default"/>
+      </w:rPr>
+    </w:lvl>
+    <w:lvl w:ilvl="7" w:tplc="40090003" w:tentative="1">
+      <w:start w:val="1"/>
+      <w:numFmt w:val="bullet"/>
+      <w:lvlText w:val="o"/>
+      <w:lvlJc w:val="left"/>
+      <w:pPr>
+        <w:ind w:left="5760" w:hanging="360"/>
+      </w:pPr>
+      <w:rPr>
+        <w:rFonts w:ascii="Courier New" w:hAnsi="Courier New" w:cs="Courier New" w:hint="default"/>
+      </w:rPr>
+    </w:lvl>
+    <w:lvl w:ilvl="8" w:tplc="40090005" w:tentative="1">
+      <w:start w:val="1"/>
+      <w:numFmt w:val="bullet"/>
+      <w:lvlText w:val=""/>
+      <w:lvlJc w:val="left"/>
+      <w:pPr>
+        <w:ind w:left="6480" w:hanging="360"/>
+      </w:pPr>
+      <w:rPr>
+        <w:rFonts w:ascii="Wingdings" w:hAnsi="Wingdings" w:hint="default"/>
+      </w:rPr>
+    </w:lvl>
+  </w:abstractNum>
+  <w:abstractNum w:abstractNumId="3">
     <w:nsid w:val="19E92AE0"/>
     <w:multiLevelType w:val="hybridMultilevel"/>
     <w:tmpl w:val="4922E9B6"/>
@@ -1759,7 +3633,7 @@
       </w:rPr>
     </w:lvl>
   </w:abstractNum>
-  <w:abstractNum w:abstractNumId="2">
+  <w:abstractNum w:abstractNumId="4">
     <w:nsid w:val="1FA11807"/>
     <w:multiLevelType w:val="hybridMultilevel"/>
     <w:tmpl w:val="F424997C"/>
@@ -1872,7 +3746,93 @@
       </w:rPr>
     </w:lvl>
   </w:abstractNum>
-  <w:abstractNum w:abstractNumId="3">
+  <w:abstractNum w:abstractNumId="5">
+    <w:nsid w:val="25E03D50"/>
+    <w:multiLevelType w:val="hybridMultilevel"/>
+    <w:tmpl w:val="23248C08"/>
+    <w:lvl w:ilvl="0" w:tplc="4009000F">
+      <w:start w:val="1"/>
+      <w:numFmt w:val="decimal"/>
+      <w:lvlText w:val="%1."/>
+      <w:lvlJc w:val="left"/>
+      <w:pPr>
+        <w:ind w:left="720" w:hanging="360"/>
+      </w:pPr>
+    </w:lvl>
+    <w:lvl w:ilvl="1" w:tplc="40090019" w:tentative="1">
+      <w:start w:val="1"/>
+      <w:numFmt w:val="lowerLetter"/>
+      <w:lvlText w:val="%2."/>
+      <w:lvlJc w:val="left"/>
+      <w:pPr>
+        <w:ind w:left="1440" w:hanging="360"/>
+      </w:pPr>
+    </w:lvl>
+    <w:lvl w:ilvl="2" w:tplc="4009001B" w:tentative="1">
+      <w:start w:val="1"/>
+      <w:numFmt w:val="lowerRoman"/>
+      <w:lvlText w:val="%3."/>
+      <w:lvlJc w:val="right"/>
+      <w:pPr>
+        <w:ind w:left="2160" w:hanging="180"/>
+      </w:pPr>
+    </w:lvl>
+    <w:lvl w:ilvl="3" w:tplc="4009000F" w:tentative="1">
+      <w:start w:val="1"/>
+      <w:numFmt w:val="decimal"/>
+      <w:lvlText w:val="%4."/>
+      <w:lvlJc w:val="left"/>
+      <w:pPr>
+        <w:ind w:left="2880" w:hanging="360"/>
+      </w:pPr>
+    </w:lvl>
+    <w:lvl w:ilvl="4" w:tplc="40090019" w:tentative="1">
+      <w:start w:val="1"/>
+      <w:numFmt w:val="lowerLetter"/>
+      <w:lvlText w:val="%5."/>
+      <w:lvlJc w:val="left"/>
+      <w:pPr>
+        <w:ind w:left="3600" w:hanging="360"/>
+      </w:pPr>
+    </w:lvl>
+    <w:lvl w:ilvl="5" w:tplc="4009001B" w:tentative="1">
+      <w:start w:val="1"/>
+      <w:numFmt w:val="lowerRoman"/>
+      <w:lvlText w:val="%6."/>
+      <w:lvlJc w:val="right"/>
+      <w:pPr>
+        <w:ind w:left="4320" w:hanging="180"/>
+      </w:pPr>
+    </w:lvl>
+    <w:lvl w:ilvl="6" w:tplc="4009000F" w:tentative="1">
+      <w:start w:val="1"/>
+      <w:numFmt w:val="decimal"/>
+      <w:lvlText w:val="%7."/>
+      <w:lvlJc w:val="left"/>
+      <w:pPr>
+        <w:ind w:left="5040" w:hanging="360"/>
+      </w:pPr>
+    </w:lvl>
+    <w:lvl w:ilvl="7" w:tplc="40090019" w:tentative="1">
+      <w:start w:val="1"/>
+      <w:numFmt w:val="lowerLetter"/>
+      <w:lvlText w:val="%8."/>
+      <w:lvlJc w:val="left"/>
+      <w:pPr>
+        <w:ind w:left="5760" w:hanging="360"/>
+      </w:pPr>
+    </w:lvl>
+    <w:lvl w:ilvl="8" w:tplc="4009001B" w:tentative="1">
+      <w:start w:val="1"/>
+      <w:numFmt w:val="lowerRoman"/>
+      <w:lvlText w:val="%9."/>
+      <w:lvlJc w:val="right"/>
+      <w:pPr>
+        <w:ind w:left="6480" w:hanging="180"/>
+      </w:pPr>
+    </w:lvl>
+  </w:abstractNum>
+  <w:abstractNum w:abstractNumId="6">
     <w:nsid w:val="48831EEC"/>
     <w:multiLevelType w:val="hybridMultilevel"/>
     <w:tmpl w:val="FE3E5AE6"/>
@@ -1985,7 +3945,7 @@
       </w:rPr>
     </w:lvl>
   </w:abstractNum>
-  <w:abstractNum w:abstractNumId="4">
+  <w:abstractNum w:abstractNumId="7">
     <w:nsid w:val="5C5867B4"/>
     <w:multiLevelType w:val="hybridMultilevel"/>
     <w:tmpl w:val="5BC61310"/>
@@ -2098,7 +4058,7 @@
       </w:rPr>
     </w:lvl>
   </w:abstractNum>
-  <w:abstractNum w:abstractNumId="5">
+  <w:abstractNum w:abstractNumId="8">
     <w:nsid w:val="5DD75A37"/>
     <w:multiLevelType w:val="hybridMultilevel"/>
     <w:tmpl w:val="4C28F7A0"/>
@@ -2211,23 +4171,469 @@
       </w:rPr>
     </w:lvl>
   </w:abstractNum>
+  <w:abstractNum w:abstractNumId="9">
+    <w:nsid w:val="5F091A61"/>
+    <w:multiLevelType w:val="hybridMultilevel"/>
+    <w:tmpl w:val="444C9C0E"/>
+    <w:lvl w:ilvl="0" w:tplc="40090001">
+      <w:start w:val="1"/>
+      <w:numFmt w:val="bullet"/>
+      <w:lvlText w:val=""/>
+      <w:lvlJc w:val="left"/>
+      <w:pPr>
+        <w:ind w:left="720" w:hanging="360"/>
+      </w:pPr>
+      <w:rPr>
+        <w:rFonts w:ascii="Symbol" w:hAnsi="Symbol" w:hint="default"/>
+      </w:rPr>
+    </w:lvl>
+    <w:lvl w:ilvl="1" w:tplc="40090003" w:tentative="1">
+      <w:start w:val="1"/>
+      <w:numFmt w:val="bullet"/>
+      <w:lvlText w:val="o"/>
+      <w:lvlJc w:val="left"/>
+      <w:pPr>
+        <w:ind w:left="1440" w:hanging="360"/>
+      </w:pPr>
+      <w:rPr>
+        <w:rFonts w:ascii="Courier New" w:hAnsi="Courier New" w:cs="Courier New" w:hint="default"/>
+      </w:rPr>
+    </w:lvl>
+    <w:lvl w:ilvl="2" w:tplc="40090005" w:tentative="1">
+      <w:start w:val="1"/>
+      <w:numFmt w:val="bullet"/>
+      <w:lvlText w:val=""/>
+      <w:lvlJc w:val="left"/>
+      <w:pPr>
+        <w:ind w:left="2160" w:hanging="360"/>
+      </w:pPr>
+      <w:rPr>
+        <w:rFonts w:ascii="Wingdings" w:hAnsi="Wingdings" w:hint="default"/>
+      </w:rPr>
+    </w:lvl>
+    <w:lvl w:ilvl="3" w:tplc="40090001" w:tentative="1">
+      <w:start w:val="1"/>
+      <w:numFmt w:val="bullet"/>
+      <w:lvlText w:val=""/>
+      <w:lvlJc w:val="left"/>
+      <w:pPr>
+        <w:ind w:left="2880" w:hanging="360"/>
+      </w:pPr>
+      <w:rPr>
+        <w:rFonts w:ascii="Symbol" w:hAnsi="Symbol" w:hint="default"/>
+      </w:rPr>
+    </w:lvl>
+    <w:lvl w:ilvl="4" w:tplc="40090003" w:tentative="1">
+      <w:start w:val="1"/>
+      <w:numFmt w:val="bullet"/>
+      <w:lvlText w:val="o"/>
+      <w:lvlJc w:val="left"/>
+      <w:pPr>
+        <w:ind w:left="3600" w:hanging="360"/>
+      </w:pPr>
+      <w:rPr>
+        <w:rFonts w:ascii="Courier New" w:hAnsi="Courier New" w:cs="Courier New" w:hint="default"/>
+      </w:rPr>
+    </w:lvl>
+    <w:lvl w:ilvl="5" w:tplc="40090005" w:tentative="1">
+      <w:start w:val="1"/>
+      <w:numFmt w:val="bullet"/>
+      <w:lvlText w:val=""/>
+      <w:lvlJc w:val="left"/>
+      <w:pPr>
+        <w:ind w:left="4320" w:hanging="360"/>
+      </w:pPr>
+      <w:rPr>
+        <w:rFonts w:ascii="Wingdings" w:hAnsi="Wingdings" w:hint="default"/>
+      </w:rPr>
+    </w:lvl>
+    <w:lvl w:ilvl="6" w:tplc="40090001" w:tentative="1">
+      <w:start w:val="1"/>
+      <w:numFmt w:val="bullet"/>
+      <w:lvlText w:val=""/>
+      <w:lvlJc w:val="left"/>
+      <w:pPr>
+        <w:ind w:left="5040" w:hanging="360"/>
+      </w:pPr>
+      <w:rPr>
+        <w:rFonts w:ascii="Symbol" w:hAnsi="Symbol" w:hint="default"/>
+      </w:rPr>
+    </w:lvl>
+    <w:lvl w:ilvl="7" w:tplc="40090003" w:tentative="1">
+      <w:start w:val="1"/>
+      <w:numFmt w:val="bullet"/>
+      <w:lvlText w:val="o"/>
+      <w:lvlJc w:val="left"/>
+      <w:pPr>
+        <w:ind w:left="5760" w:hanging="360"/>
+      </w:pPr>
+      <w:rPr>
+        <w:rFonts w:ascii="Courier New" w:hAnsi="Courier New" w:cs="Courier New" w:hint="default"/>
+      </w:rPr>
+    </w:lvl>
+    <w:lvl w:ilvl="8" w:tplc="40090005" w:tentative="1">
+      <w:start w:val="1"/>
+      <w:numFmt w:val="bullet"/>
+      <w:lvlText w:val=""/>
+      <w:lvlJc w:val="left"/>
+      <w:pPr>
+        <w:ind w:left="6480" w:hanging="360"/>
+      </w:pPr>
+      <w:rPr>
+        <w:rFonts w:ascii="Wingdings" w:hAnsi="Wingdings" w:hint="default"/>
+      </w:rPr>
+    </w:lvl>
+  </w:abstractNum>
+  <w:abstractNum w:abstractNumId="10">
+    <w:nsid w:val="68FC6BAF"/>
+    <w:multiLevelType w:val="hybridMultilevel"/>
+    <w:tmpl w:val="D9BA3446"/>
+    <w:lvl w:ilvl="0" w:tplc="4009000F">
+      <w:start w:val="1"/>
+      <w:numFmt w:val="decimal"/>
+      <w:lvlText w:val="%1."/>
+      <w:lvlJc w:val="left"/>
+      <w:pPr>
+        <w:ind w:left="720" w:hanging="360"/>
+      </w:pPr>
+    </w:lvl>
+    <w:lvl w:ilvl="1" w:tplc="40090019" w:tentative="1">
+      <w:start w:val="1"/>
+      <w:numFmt w:val="lowerLetter"/>
+      <w:lvlText w:val="%2."/>
+      <w:lvlJc w:val="left"/>
+      <w:pPr>
+        <w:ind w:left="1440" w:hanging="360"/>
+      </w:pPr>
+    </w:lvl>
+    <w:lvl w:ilvl="2" w:tplc="4009001B" w:tentative="1">
+      <w:start w:val="1"/>
+      <w:numFmt w:val="lowerRoman"/>
+      <w:lvlText w:val="%3."/>
+      <w:lvlJc w:val="right"/>
+      <w:pPr>
+        <w:ind w:left="2160" w:hanging="180"/>
+      </w:pPr>
+    </w:lvl>
+    <w:lvl w:ilvl="3" w:tplc="4009000F" w:tentative="1">
+      <w:start w:val="1"/>
+      <w:numFmt w:val="decimal"/>
+      <w:lvlText w:val="%4."/>
+      <w:lvlJc w:val="left"/>
+      <w:pPr>
+        <w:ind w:left="2880" w:hanging="360"/>
+      </w:pPr>
+    </w:lvl>
+    <w:lvl w:ilvl="4" w:tplc="40090019" w:tentative="1">
+      <w:start w:val="1"/>
+      <w:numFmt w:val="lowerLetter"/>
+      <w:lvlText w:val="%5."/>
+      <w:lvlJc w:val="left"/>
+      <w:pPr>
+        <w:ind w:left="3600" w:hanging="360"/>
+      </w:pPr>
+    </w:lvl>
+    <w:lvl w:ilvl="5" w:tplc="4009001B" w:tentative="1">
+      <w:start w:val="1"/>
+      <w:numFmt w:val="lowerRoman"/>
+      <w:lvlText w:val="%6."/>
+      <w:lvlJc w:val="right"/>
+      <w:pPr>
+        <w:ind w:left="4320" w:hanging="180"/>
+      </w:pPr>
+    </w:lvl>
+    <w:lvl w:ilvl="6" w:tplc="4009000F" w:tentative="1">
+      <w:start w:val="1"/>
+      <w:numFmt w:val="decimal"/>
+      <w:lvlText w:val="%7."/>
+      <w:lvlJc w:val="left"/>
+      <w:pPr>
+        <w:ind w:left="5040" w:hanging="360"/>
+      </w:pPr>
+    </w:lvl>
+    <w:lvl w:ilvl="7" w:tplc="40090019" w:tentative="1">
+      <w:start w:val="1"/>
+      <w:numFmt w:val="lowerLetter"/>
+      <w:lvlText w:val="%8."/>
+      <w:lvlJc w:val="left"/>
+      <w:pPr>
+        <w:ind w:left="5760" w:hanging="360"/>
+      </w:pPr>
+    </w:lvl>
+    <w:lvl w:ilvl="8" w:tplc="4009001B" w:tentative="1">
+      <w:start w:val="1"/>
+      <w:numFmt w:val="lowerRoman"/>
+      <w:lvlText w:val="%9."/>
+      <w:lvlJc w:val="right"/>
+      <w:pPr>
+        <w:ind w:left="6480" w:hanging="180"/>
+      </w:pPr>
+    </w:lvl>
+  </w:abstractNum>
+  <w:abstractNum w:abstractNumId="11">
+    <w:nsid w:val="69245EAA"/>
+    <w:multiLevelType w:val="hybridMultilevel"/>
+    <w:tmpl w:val="DA9ACB24"/>
+    <w:lvl w:ilvl="0" w:tplc="40090001">
+      <w:start w:val="1"/>
+      <w:numFmt w:val="bullet"/>
+      <w:lvlText w:val=""/>
+      <w:lvlJc w:val="left"/>
+      <w:pPr>
+        <w:ind w:left="720" w:hanging="360"/>
+      </w:pPr>
+      <w:rPr>
+        <w:rFonts w:ascii="Symbol" w:hAnsi="Symbol" w:hint="default"/>
+      </w:rPr>
+    </w:lvl>
+    <w:lvl w:ilvl="1" w:tplc="40090003" w:tentative="1">
+      <w:start w:val="1"/>
+      <w:numFmt w:val="bullet"/>
+      <w:lvlText w:val="o"/>
+      <w:lvlJc w:val="left"/>
+      <w:pPr>
+        <w:ind w:left="1440" w:hanging="360"/>
+      </w:pPr>
+      <w:rPr>
+        <w:rFonts w:ascii="Courier New" w:hAnsi="Courier New" w:cs="Courier New" w:hint="default"/>
+      </w:rPr>
+    </w:lvl>
+    <w:lvl w:ilvl="2" w:tplc="40090005" w:tentative="1">
+      <w:start w:val="1"/>
+      <w:numFmt w:val="bullet"/>
+      <w:lvlText w:val=""/>
+      <w:lvlJc w:val="left"/>
+      <w:pPr>
+        <w:ind w:left="2160" w:hanging="360"/>
+      </w:pPr>
+      <w:rPr>
+        <w:rFonts w:ascii="Wingdings" w:hAnsi="Wingdings" w:hint="default"/>
+      </w:rPr>
+    </w:lvl>
+    <w:lvl w:ilvl="3" w:tplc="40090001" w:tentative="1">
+      <w:start w:val="1"/>
+      <w:numFmt w:val="bullet"/>
+      <w:lvlText w:val=""/>
+      <w:lvlJc w:val="left"/>
+      <w:pPr>
+        <w:ind w:left="2880" w:hanging="360"/>
+      </w:pPr>
+      <w:rPr>
+        <w:rFonts w:ascii="Symbol" w:hAnsi="Symbol" w:hint="default"/>
+      </w:rPr>
+    </w:lvl>
+    <w:lvl w:ilvl="4" w:tplc="40090003" w:tentative="1">
+      <w:start w:val="1"/>
+      <w:numFmt w:val="bullet"/>
+      <w:lvlText w:val="o"/>
+      <w:lvlJc w:val="left"/>
+      <w:pPr>
+        <w:ind w:left="3600" w:hanging="360"/>
+      </w:pPr>
+      <w:rPr>
+        <w:rFonts w:ascii="Courier New" w:hAnsi="Courier New" w:cs="Courier New" w:hint="default"/>
+      </w:rPr>
+    </w:lvl>
+    <w:lvl w:ilvl="5" w:tplc="40090005" w:tentative="1">
+      <w:start w:val="1"/>
+      <w:numFmt w:val="bullet"/>
+      <w:lvlText w:val=""/>
+      <w:lvlJc w:val="left"/>
+      <w:pPr>
+        <w:ind w:left="4320" w:hanging="360"/>
+      </w:pPr>
+      <w:rPr>
+        <w:rFonts w:ascii="Wingdings" w:hAnsi="Wingdings" w:hint="default"/>
+      </w:rPr>
+    </w:lvl>
+    <w:lvl w:ilvl="6" w:tplc="40090001" w:tentative="1">
+      <w:start w:val="1"/>
+      <w:numFmt w:val="bullet"/>
+      <w:lvlText w:val=""/>
+      <w:lvlJc w:val="left"/>
+      <w:pPr>
+        <w:ind w:left="5040" w:hanging="360"/>
+      </w:pPr>
+      <w:rPr>
+        <w:rFonts w:ascii="Symbol" w:hAnsi="Symbol" w:hint="default"/>
+      </w:rPr>
+    </w:lvl>
+    <w:lvl w:ilvl="7" w:tplc="40090003" w:tentative="1">
+      <w:start w:val="1"/>
+      <w:numFmt w:val="bullet"/>
+      <w:lvlText w:val="o"/>
+      <w:lvlJc w:val="left"/>
+      <w:pPr>
+        <w:ind w:left="5760" w:hanging="360"/>
+      </w:pPr>
+      <w:rPr>
+        <w:rFonts w:ascii="Courier New" w:hAnsi="Courier New" w:cs="Courier New" w:hint="default"/>
+      </w:rPr>
+    </w:lvl>
+    <w:lvl w:ilvl="8" w:tplc="40090005" w:tentative="1">
+      <w:start w:val="1"/>
+      <w:numFmt w:val="bullet"/>
+      <w:lvlText w:val=""/>
+      <w:lvlJc w:val="left"/>
+      <w:pPr>
+        <w:ind w:left="6480" w:hanging="360"/>
+      </w:pPr>
+      <w:rPr>
+        <w:rFonts w:ascii="Wingdings" w:hAnsi="Wingdings" w:hint="default"/>
+      </w:rPr>
+    </w:lvl>
+  </w:abstractNum>
+  <w:abstractNum w:abstractNumId="12">
+    <w:nsid w:val="76723C22"/>
+    <w:multiLevelType w:val="hybridMultilevel"/>
+    <w:tmpl w:val="3F12097C"/>
+    <w:lvl w:ilvl="0" w:tplc="40090001">
+      <w:start w:val="1"/>
+      <w:numFmt w:val="bullet"/>
+      <w:lvlText w:val=""/>
+      <w:lvlJc w:val="left"/>
+      <w:pPr>
+        <w:ind w:left="720" w:hanging="360"/>
+      </w:pPr>
+      <w:rPr>
+        <w:rFonts w:ascii="Symbol" w:hAnsi="Symbol" w:hint="default"/>
+      </w:rPr>
+    </w:lvl>
+    <w:lvl w:ilvl="1" w:tplc="40090003" w:tentative="1">
+      <w:start w:val="1"/>
+      <w:numFmt w:val="bullet"/>
+      <w:lvlText w:val="o"/>
+      <w:lvlJc w:val="left"/>
+      <w:pPr>
+        <w:ind w:left="1440" w:hanging="360"/>
+      </w:pPr>
+      <w:rPr>
+        <w:rFonts w:ascii="Courier New" w:hAnsi="Courier New" w:cs="Courier New" w:hint="default"/>
+      </w:rPr>
+    </w:lvl>
+    <w:lvl w:ilvl="2" w:tplc="40090005" w:tentative="1">
+      <w:start w:val="1"/>
+      <w:numFmt w:val="bullet"/>
+      <w:lvlText w:val=""/>
+      <w:lvlJc w:val="left"/>
+      <w:pPr>
+        <w:ind w:left="2160" w:hanging="360"/>
+      </w:pPr>
+      <w:rPr>
+        <w:rFonts w:ascii="Wingdings" w:hAnsi="Wingdings" w:hint="default"/>
+      </w:rPr>
+    </w:lvl>
+    <w:lvl w:ilvl="3" w:tplc="40090001" w:tentative="1">
+      <w:start w:val="1"/>
+      <w:numFmt w:val="bullet"/>
+      <w:lvlText w:val=""/>
+      <w:lvlJc w:val="left"/>
+      <w:pPr>
+        <w:ind w:left="2880" w:hanging="360"/>
+      </w:pPr>
+      <w:rPr>
+        <w:rFonts w:ascii="Symbol" w:hAnsi="Symbol" w:hint="default"/>
+      </w:rPr>
+    </w:lvl>
+    <w:lvl w:ilvl="4" w:tplc="40090003" w:tentative="1">
+      <w:start w:val="1"/>
+      <w:numFmt w:val="bullet"/>
+      <w:lvlText w:val="o"/>
+      <w:lvlJc w:val="left"/>
+      <w:pPr>
+        <w:ind w:left="3600" w:hanging="360"/>
+      </w:pPr>
+      <w:rPr>
+        <w:rFonts w:ascii="Courier New" w:hAnsi="Courier New" w:cs="Courier New" w:hint="default"/>
+      </w:rPr>
+    </w:lvl>
+    <w:lvl w:ilvl="5" w:tplc="40090005" w:tentative="1">
+      <w:start w:val="1"/>
+      <w:numFmt w:val="bullet"/>
+      <w:lvlText w:val=""/>
+      <w:lvlJc w:val="left"/>
+      <w:pPr>
+        <w:ind w:left="4320" w:hanging="360"/>
+      </w:pPr>
+      <w:rPr>
+        <w:rFonts w:ascii="Wingdings" w:hAnsi="Wingdings" w:hint="default"/>
+      </w:rPr>
+    </w:lvl>
+    <w:lvl w:ilvl="6" w:tplc="40090001" w:tentative="1">
+      <w:start w:val="1"/>
+      <w:numFmt w:val="bullet"/>
+      <w:lvlText w:val=""/>
+      <w:lvlJc w:val="left"/>
+      <w:pPr>
+        <w:ind w:left="5040" w:hanging="360"/>
+      </w:pPr>
+      <w:rPr>
+        <w:rFonts w:ascii="Symbol" w:hAnsi="Symbol" w:hint="default"/>
+      </w:rPr>
+    </w:lvl>
+    <w:lvl w:ilvl="7" w:tplc="40090003" w:tentative="1">
+      <w:start w:val="1"/>
+      <w:numFmt w:val="bullet"/>
+      <w:lvlText w:val="o"/>
+      <w:lvlJc w:val="left"/>
+      <w:pPr>
+        <w:ind w:left="5760" w:hanging="360"/>
+      </w:pPr>
+      <w:rPr>
+        <w:rFonts w:ascii="Courier New" w:hAnsi="Courier New" w:cs="Courier New" w:hint="default"/>
+      </w:rPr>
+    </w:lvl>
+    <w:lvl w:ilvl="8" w:tplc="40090005" w:tentative="1">
+      <w:start w:val="1"/>
+      <w:numFmt w:val="bullet"/>
+      <w:lvlText w:val=""/>
+      <w:lvlJc w:val="left"/>
+      <w:pPr>
+        <w:ind w:left="6480" w:hanging="360"/>
+      </w:pPr>
+      <w:rPr>
+        <w:rFonts w:ascii="Wingdings" w:hAnsi="Wingdings" w:hint="default"/>
+      </w:rPr>
+    </w:lvl>
+  </w:abstractNum>
   <w:num w:numId="1">
+    <w:abstractNumId w:val="3"/>
+  </w:num>
+  <w:num w:numId="2">
+    <w:abstractNumId w:val="7"/>
+  </w:num>
+  <w:num w:numId="3">
     <w:abstractNumId w:val="1"/>
   </w:num>
-  <w:num w:numId="2">
+  <w:num w:numId="4">
+    <w:abstractNumId w:val="8"/>
+  </w:num>
+  <w:num w:numId="5">
     <w:abstractNumId w:val="4"/>
   </w:num>
-  <w:num w:numId="3">
+  <w:num w:numId="6">
+    <w:abstractNumId w:val="6"/>
+  </w:num>
+  <w:num w:numId="7">
+    <w:abstractNumId w:val="5"/>
+  </w:num>
+  <w:num w:numId="8">
+    <w:abstractNumId w:val="12"/>
+  </w:num>
+  <w:num w:numId="9">
+    <w:abstractNumId w:val="9"/>
+  </w:num>
+  <w:num w:numId="10">
+    <w:abstractNumId w:val="10"/>
+  </w:num>
+  <w:num w:numId="11">
     <w:abstractNumId w:val="0"/>
   </w:num>
-  <w:num w:numId="4">
-    <w:abstractNumId w:val="5"/>
-  </w:num>
-  <w:num w:numId="5">
+  <w:num w:numId="12">
     <w:abstractNumId w:val="2"/>
   </w:num>
-  <w:num w:numId="6">
-    <w:abstractNumId w:val="3"/>
+  <w:num w:numId="13">
+    <w:abstractNumId w:val="11"/>
   </w:num>
 </w:numbering>
 </file>
@@ -2462,6 +4868,56 @@
       <w:bCs/>
     </w:rPr>
   </w:style>
+  <w:style w:type="paragraph" w:styleId="Header">
+    <w:name w:val="header"/>
+    <w:basedOn w:val="Normal"/>
+    <w:link w:val="HeaderChar"/>
+    <w:uiPriority w:val="99"/>
+    <w:unhideWhenUsed/>
+    <w:rsid w:val="00BD1C2C"/>
+    <w:pPr>
+      <w:tabs>
+        <w:tab w:val="center" w:pos="4513"/>
+        <w:tab w:val="right" w:pos="9026"/>
+      </w:tabs>
+      <w:spacing w:after="0" w:line="240" w:lineRule="auto"/>
+    </w:pPr>
+  </w:style>
+  <w:style w:type="character" w:customStyle="1" w:styleId="HeaderChar">
+    <w:name w:val="Header Char"/>
+    <w:basedOn w:val="DefaultParagraphFont"/>
+    <w:link w:val="Header"/>
+    <w:uiPriority w:val="99"/>
+    <w:rsid w:val="00BD1C2C"/>
+    <w:rPr>
+      <w:rFonts w:cs="Mangal"/>
+    </w:rPr>
+  </w:style>
+  <w:style w:type="paragraph" w:styleId="Footer">
+    <w:name w:val="footer"/>
+    <w:basedOn w:val="Normal"/>
+    <w:link w:val="FooterChar"/>
+    <w:uiPriority w:val="99"/>
+    <w:unhideWhenUsed/>
+    <w:rsid w:val="00BD1C2C"/>
+    <w:pPr>
+      <w:tabs>
+        <w:tab w:val="center" w:pos="4513"/>
+        <w:tab w:val="right" w:pos="9026"/>
+      </w:tabs>
+      <w:spacing w:after="0" w:line="240" w:lineRule="auto"/>
+    </w:pPr>
+  </w:style>
+  <w:style w:type="character" w:customStyle="1" w:styleId="FooterChar">
+    <w:name w:val="Footer Char"/>
+    <w:basedOn w:val="DefaultParagraphFont"/>
+    <w:link w:val="Footer"/>
+    <w:uiPriority w:val="99"/>
+    <w:rsid w:val="00BD1C2C"/>
+    <w:rPr>
+      <w:rFonts w:cs="Mangal"/>
+    </w:rPr>
+  </w:style>
 </w:styles>
 </file>
 
@@ -2693,6 +5149,56 @@
     <w:rPr>
       <w:b/>
       <w:bCs/>
+    </w:rPr>
+  </w:style>
+  <w:style w:type="paragraph" w:styleId="Header">
+    <w:name w:val="header"/>
+    <w:basedOn w:val="Normal"/>
+    <w:link w:val="HeaderChar"/>
+    <w:uiPriority w:val="99"/>
+    <w:unhideWhenUsed/>
+    <w:rsid w:val="00BD1C2C"/>
+    <w:pPr>
+      <w:tabs>
+        <w:tab w:val="center" w:pos="4513"/>
+        <w:tab w:val="right" w:pos="9026"/>
+      </w:tabs>
+      <w:spacing w:after="0" w:line="240" w:lineRule="auto"/>
+    </w:pPr>
+  </w:style>
+  <w:style w:type="character" w:customStyle="1" w:styleId="HeaderChar">
+    <w:name w:val="Header Char"/>
+    <w:basedOn w:val="DefaultParagraphFont"/>
+    <w:link w:val="Header"/>
+    <w:uiPriority w:val="99"/>
+    <w:rsid w:val="00BD1C2C"/>
+    <w:rPr>
+      <w:rFonts w:cs="Mangal"/>
+    </w:rPr>
+  </w:style>
+  <w:style w:type="paragraph" w:styleId="Footer">
+    <w:name w:val="footer"/>
+    <w:basedOn w:val="Normal"/>
+    <w:link w:val="FooterChar"/>
+    <w:uiPriority w:val="99"/>
+    <w:unhideWhenUsed/>
+    <w:rsid w:val="00BD1C2C"/>
+    <w:pPr>
+      <w:tabs>
+        <w:tab w:val="center" w:pos="4513"/>
+        <w:tab w:val="right" w:pos="9026"/>
+      </w:tabs>
+      <w:spacing w:after="0" w:line="240" w:lineRule="auto"/>
+    </w:pPr>
+  </w:style>
+  <w:style w:type="character" w:customStyle="1" w:styleId="FooterChar">
+    <w:name w:val="Footer Char"/>
+    <w:basedOn w:val="DefaultParagraphFont"/>
+    <w:link w:val="Footer"/>
+    <w:uiPriority w:val="99"/>
+    <w:rsid w:val="00BD1C2C"/>
+    <w:rPr>
+      <w:rFonts w:cs="Mangal"/>
     </w:rPr>
   </w:style>
 </w:styles>

</xml_diff>

<commit_message>
Update System design notes: Data flow & Databases
</commit_message>
<xml_diff>
--- a/system-design-basics/System design notes.docx
+++ b/system-design-basics/System design notes.docx
@@ -39,7 +39,25 @@
           <w:sz w:val="28"/>
           <w:szCs w:val="28"/>
         </w:rPr>
-        <w:t xml:space="preserve">Def:- </w:t>
+        <w:t>Def</w:t>
+      </w:r>
+      <w:proofErr w:type="gramStart"/>
+      <w:r>
+        <w:rPr>
+          <w:color w:val="FF0000"/>
+          <w:sz w:val="28"/>
+          <w:szCs w:val="28"/>
+        </w:rPr>
+        <w:t>:-</w:t>
+      </w:r>
+      <w:proofErr w:type="gramEnd"/>
+      <w:r>
+        <w:rPr>
+          <w:color w:val="FF0000"/>
+          <w:sz w:val="28"/>
+          <w:szCs w:val="28"/>
+        </w:rPr>
+        <w:t xml:space="preserve"> </w:t>
       </w:r>
       <w:r>
         <w:rPr>
@@ -91,11 +109,19 @@
           <w:szCs w:val="22"/>
         </w:rPr>
       </w:pPr>
-      <w:r>
-        <w:rPr>
-          <w:szCs w:val="22"/>
-        </w:rPr>
-        <w:t>for example: a hospital</w:t>
+      <w:proofErr w:type="gramStart"/>
+      <w:r>
+        <w:rPr>
+          <w:szCs w:val="22"/>
+        </w:rPr>
+        <w:t>for</w:t>
+      </w:r>
+      <w:proofErr w:type="gramEnd"/>
+      <w:r>
+        <w:rPr>
+          <w:szCs w:val="22"/>
+        </w:rPr>
+        <w:t xml:space="preserve"> example: a hospital</w:t>
       </w:r>
       <w:r>
         <w:rPr>
@@ -144,13 +170,27 @@
         <w:rPr>
           <w:szCs w:val="22"/>
         </w:rPr>
-        <w:t>Who will use this?</w:t>
-      </w:r>
-      <w:r>
-        <w:rPr>
-          <w:szCs w:val="22"/>
-        </w:rPr>
-        <w:t xml:space="preserve">, How much data will it handle?, </w:t>
+        <w:t>Who will use this</w:t>
+      </w:r>
+      <w:proofErr w:type="gramStart"/>
+      <w:r>
+        <w:rPr>
+          <w:szCs w:val="22"/>
+        </w:rPr>
+        <w:t>?</w:t>
+      </w:r>
+      <w:r>
+        <w:rPr>
+          <w:szCs w:val="22"/>
+        </w:rPr>
+        <w:t>,</w:t>
+      </w:r>
+      <w:proofErr w:type="gramEnd"/>
+      <w:r>
+        <w:rPr>
+          <w:szCs w:val="22"/>
+        </w:rPr>
+        <w:t xml:space="preserve"> How much data will it handle?, </w:t>
       </w:r>
       <w:r>
         <w:rPr>
@@ -406,6 +446,7 @@
           <w:szCs w:val="22"/>
         </w:rPr>
       </w:pPr>
+      <w:proofErr w:type="gramStart"/>
       <w:r>
         <w:rPr>
           <w:b/>
@@ -414,6 +455,7 @@
         </w:rPr>
         <w:t>Cache :</w:t>
       </w:r>
+      <w:proofErr w:type="gramEnd"/>
       <w:r>
         <w:rPr>
           <w:b/>
@@ -432,13 +474,35 @@
         <w:rPr>
           <w:szCs w:val="22"/>
         </w:rPr>
-        <w:t xml:space="preserve"> Example: Redis and </w:t>
-      </w:r>
-      <w:r>
-        <w:rPr>
-          <w:szCs w:val="22"/>
-        </w:rPr>
-        <w:t>Memcached.</w:t>
+        <w:t xml:space="preserve"> Example: </w:t>
+      </w:r>
+      <w:proofErr w:type="spellStart"/>
+      <w:r>
+        <w:rPr>
+          <w:szCs w:val="22"/>
+        </w:rPr>
+        <w:t>Redis</w:t>
+      </w:r>
+      <w:proofErr w:type="spellEnd"/>
+      <w:r>
+        <w:rPr>
+          <w:szCs w:val="22"/>
+        </w:rPr>
+        <w:t xml:space="preserve"> and </w:t>
+      </w:r>
+      <w:proofErr w:type="spellStart"/>
+      <w:r>
+        <w:rPr>
+          <w:szCs w:val="22"/>
+        </w:rPr>
+        <w:t>Memcached</w:t>
+      </w:r>
+      <w:proofErr w:type="spellEnd"/>
+      <w:r>
+        <w:rPr>
+          <w:szCs w:val="22"/>
+        </w:rPr>
+        <w:t>.</w:t>
       </w:r>
     </w:p>
     <w:p>
@@ -470,11 +534,19 @@
           <w:szCs w:val="22"/>
         </w:rPr>
       </w:pPr>
-      <w:r>
-        <w:rPr>
-          <w:szCs w:val="22"/>
-        </w:rPr>
-        <w:t>makes repeated reads</w:t>
+      <w:proofErr w:type="gramStart"/>
+      <w:r>
+        <w:rPr>
+          <w:szCs w:val="22"/>
+        </w:rPr>
+        <w:t>makes</w:t>
+      </w:r>
+      <w:proofErr w:type="gramEnd"/>
+      <w:r>
+        <w:rPr>
+          <w:szCs w:val="22"/>
+        </w:rPr>
+        <w:t xml:space="preserve"> repeated reads</w:t>
       </w:r>
       <w:r>
         <w:rPr>
@@ -583,13 +655,27 @@
         <w:rPr>
           <w:szCs w:val="22"/>
         </w:rPr>
-        <w:t>Logical entities are the idea or structure of a system. They are not physical things</w:t>
-      </w:r>
-      <w:r>
-        <w:rPr>
-          <w:szCs w:val="22"/>
-        </w:rPr>
-        <w:t xml:space="preserve">, </w:t>
+        <w:t xml:space="preserve">Logical entities are the idea or structure of a system. They are not physical </w:t>
+      </w:r>
+      <w:proofErr w:type="gramStart"/>
+      <w:r>
+        <w:rPr>
+          <w:szCs w:val="22"/>
+        </w:rPr>
+        <w:t>things</w:t>
+      </w:r>
+      <w:r>
+        <w:rPr>
+          <w:szCs w:val="22"/>
+        </w:rPr>
+        <w:t>,</w:t>
+      </w:r>
+      <w:proofErr w:type="gramEnd"/>
+      <w:r>
+        <w:rPr>
+          <w:szCs w:val="22"/>
+        </w:rPr>
+        <w:t xml:space="preserve"> </w:t>
       </w:r>
       <w:r>
         <w:rPr>
@@ -887,37 +973,77 @@
         <w:rPr>
           <w:szCs w:val="22"/>
         </w:rPr>
-        <w:t xml:space="preserve">: MySQL, MongoDB, Redis, Kafka, AWS, Python, Java, Servers, </w:t>
-      </w:r>
-      <w:r>
-        <w:rPr>
-          <w:szCs w:val="22"/>
-        </w:rPr>
-        <w:t>APIs.</w:t>
-      </w:r>
-    </w:p>
-    <w:p>
-      <w:pPr>
-        <w:rPr>
-          <w:szCs w:val="22"/>
-        </w:rPr>
-      </w:pPr>
-    </w:p>
-    <w:p>
-      <w:pPr>
-        <w:rPr>
-          <w:b/>
-          <w:bCs/>
-          <w:szCs w:val="22"/>
-        </w:rPr>
-      </w:pPr>
-      <w:r>
-        <w:rPr>
-          <w:b/>
-          <w:bCs/>
-          <w:szCs w:val="22"/>
-        </w:rPr>
-        <w:t>These are the real-world examples and technologies that fulfill the logical roles above:</w:t>
+        <w:t xml:space="preserve">: MySQL, MongoDB, </w:t>
+      </w:r>
+      <w:proofErr w:type="spellStart"/>
+      <w:r>
+        <w:rPr>
+          <w:szCs w:val="22"/>
+        </w:rPr>
+        <w:t>Redis</w:t>
+      </w:r>
+      <w:proofErr w:type="spellEnd"/>
+      <w:r>
+        <w:rPr>
+          <w:szCs w:val="22"/>
+        </w:rPr>
+        <w:t xml:space="preserve">, Kafka, AWS, Python, Java, Servers, </w:t>
+      </w:r>
+      <w:proofErr w:type="gramStart"/>
+      <w:r>
+        <w:rPr>
+          <w:szCs w:val="22"/>
+        </w:rPr>
+        <w:t>APIs</w:t>
+      </w:r>
+      <w:proofErr w:type="gramEnd"/>
+      <w:r>
+        <w:rPr>
+          <w:szCs w:val="22"/>
+        </w:rPr>
+        <w:t>.</w:t>
+      </w:r>
+    </w:p>
+    <w:p>
+      <w:pPr>
+        <w:rPr>
+          <w:szCs w:val="22"/>
+        </w:rPr>
+      </w:pPr>
+    </w:p>
+    <w:p>
+      <w:pPr>
+        <w:rPr>
+          <w:b/>
+          <w:bCs/>
+          <w:szCs w:val="22"/>
+        </w:rPr>
+      </w:pPr>
+      <w:r>
+        <w:rPr>
+          <w:b/>
+          <w:bCs/>
+          <w:szCs w:val="22"/>
+        </w:rPr>
+        <w:t xml:space="preserve">These are the real-world examples and technologies that </w:t>
+      </w:r>
+      <w:proofErr w:type="spellStart"/>
+      <w:r>
+        <w:rPr>
+          <w:b/>
+          <w:bCs/>
+          <w:szCs w:val="22"/>
+        </w:rPr>
+        <w:t>fulfill</w:t>
+      </w:r>
+      <w:proofErr w:type="spellEnd"/>
+      <w:r>
+        <w:rPr>
+          <w:b/>
+          <w:bCs/>
+          <w:szCs w:val="22"/>
+        </w:rPr>
+        <w:t xml:space="preserve"> the logical roles above:</w:t>
       </w:r>
     </w:p>
     <w:tbl>
@@ -1138,7 +1264,21 @@
                 <w:szCs w:val="22"/>
               </w:rPr>
               <w:tab/>
-              <w:t>Java, Golang, Python, Amber, React, etc.</w:t>
+              <w:t xml:space="preserve">Java, </w:t>
+            </w:r>
+            <w:proofErr w:type="spellStart"/>
+            <w:r>
+              <w:rPr>
+                <w:szCs w:val="22"/>
+              </w:rPr>
+              <w:t>Golang</w:t>
+            </w:r>
+            <w:proofErr w:type="spellEnd"/>
+            <w:r>
+              <w:rPr>
+                <w:szCs w:val="22"/>
+              </w:rPr>
+              <w:t>, Python, Amber, React, etc.</w:t>
             </w:r>
           </w:p>
         </w:tc>
@@ -1186,7 +1326,34 @@
                 <w:szCs w:val="22"/>
               </w:rPr>
               <w:tab/>
-              <w:t>Redis, Memcached, etc.</w:t>
+            </w:r>
+            <w:proofErr w:type="spellStart"/>
+            <w:r>
+              <w:rPr>
+                <w:szCs w:val="22"/>
+              </w:rPr>
+              <w:t>Redis</w:t>
+            </w:r>
+            <w:proofErr w:type="spellEnd"/>
+            <w:r>
+              <w:rPr>
+                <w:szCs w:val="22"/>
+              </w:rPr>
+              <w:t xml:space="preserve">, </w:t>
+            </w:r>
+            <w:proofErr w:type="spellStart"/>
+            <w:r>
+              <w:rPr>
+                <w:szCs w:val="22"/>
+              </w:rPr>
+              <w:t>Memcached</w:t>
+            </w:r>
+            <w:proofErr w:type="spellEnd"/>
+            <w:r>
+              <w:rPr>
+                <w:szCs w:val="22"/>
+              </w:rPr>
+              <w:t>, etc.</w:t>
             </w:r>
           </w:p>
         </w:tc>
@@ -1234,7 +1401,21 @@
                 <w:szCs w:val="22"/>
               </w:rPr>
               <w:tab/>
-              <w:t>Kafka, RabbitMQ, etc.</w:t>
+              <w:t xml:space="preserve">Kafka, </w:t>
+            </w:r>
+            <w:proofErr w:type="spellStart"/>
+            <w:r>
+              <w:rPr>
+                <w:szCs w:val="22"/>
+              </w:rPr>
+              <w:t>RabbitMQ</w:t>
+            </w:r>
+            <w:proofErr w:type="spellEnd"/>
+            <w:r>
+              <w:rPr>
+                <w:szCs w:val="22"/>
+              </w:rPr>
+              <w:t>, etc.</w:t>
             </w:r>
           </w:p>
         </w:tc>
@@ -1582,13 +1763,27 @@
         <w:rPr>
           <w:szCs w:val="22"/>
         </w:rPr>
-        <w:t xml:space="preserve"> Your device</w:t>
-      </w:r>
-      <w:r>
-        <w:rPr>
-          <w:szCs w:val="22"/>
-        </w:rPr>
-        <w:t>(the client)</w:t>
+        <w:t xml:space="preserve"> Your </w:t>
+      </w:r>
+      <w:proofErr w:type="gramStart"/>
+      <w:r>
+        <w:rPr>
+          <w:szCs w:val="22"/>
+        </w:rPr>
+        <w:t>device</w:t>
+      </w:r>
+      <w:r>
+        <w:rPr>
+          <w:szCs w:val="22"/>
+        </w:rPr>
+        <w:t>(</w:t>
+      </w:r>
+      <w:proofErr w:type="gramEnd"/>
+      <w:r>
+        <w:rPr>
+          <w:szCs w:val="22"/>
+        </w:rPr>
+        <w:t>the client)</w:t>
       </w:r>
       <w:r>
         <w:rPr>
@@ -1775,22 +1970,60 @@
           <w:bCs/>
           <w:szCs w:val="22"/>
         </w:rPr>
-        <w:t xml:space="preserve"> How to convert a 3 tier architecture into a N-Tier architecture?</w:t>
-      </w:r>
-    </w:p>
-    <w:p>
-      <w:pPr>
-        <w:rPr>
-          <w:szCs w:val="22"/>
-        </w:rPr>
-      </w:pPr>
-      <w:r>
-        <w:rPr>
-          <w:b/>
-          <w:bCs/>
-          <w:szCs w:val="22"/>
-        </w:rPr>
-        <w:t xml:space="preserve">Ans:- </w:t>
+        <w:t xml:space="preserve"> How to convert </w:t>
+      </w:r>
+      <w:proofErr w:type="gramStart"/>
+      <w:r>
+        <w:rPr>
+          <w:b/>
+          <w:bCs/>
+          <w:szCs w:val="22"/>
+        </w:rPr>
+        <w:t>a 3</w:t>
+      </w:r>
+      <w:proofErr w:type="gramEnd"/>
+      <w:r>
+        <w:rPr>
+          <w:b/>
+          <w:bCs/>
+          <w:szCs w:val="22"/>
+        </w:rPr>
+        <w:t xml:space="preserve"> tier architecture into a N-Tier architecture?</w:t>
+      </w:r>
+    </w:p>
+    <w:p>
+      <w:pPr>
+        <w:rPr>
+          <w:szCs w:val="22"/>
+        </w:rPr>
+      </w:pPr>
+      <w:proofErr w:type="spellStart"/>
+      <w:r>
+        <w:rPr>
+          <w:b/>
+          <w:bCs/>
+          <w:szCs w:val="22"/>
+        </w:rPr>
+        <w:t>Ans</w:t>
+      </w:r>
+      <w:proofErr w:type="spellEnd"/>
+      <w:proofErr w:type="gramStart"/>
+      <w:r>
+        <w:rPr>
+          <w:b/>
+          <w:bCs/>
+          <w:szCs w:val="22"/>
+        </w:rPr>
+        <w:t>:-</w:t>
+      </w:r>
+      <w:proofErr w:type="gramEnd"/>
+      <w:r>
+        <w:rPr>
+          <w:b/>
+          <w:bCs/>
+          <w:szCs w:val="22"/>
+        </w:rPr>
+        <w:t xml:space="preserve"> </w:t>
       </w:r>
       <w:r>
         <w:rPr>
@@ -1810,8 +2043,6 @@
         </w:rPr>
         <w:t>n additional layer such as a</w:t>
       </w:r>
-      <w:bookmarkStart w:id="0" w:name="_GoBack"/>
-      <w:bookmarkEnd w:id="0"/>
       <w:r>
         <w:rPr>
           <w:szCs w:val="22"/>
@@ -1831,11 +2062,33 @@
           <w:szCs w:val="22"/>
         </w:rPr>
       </w:pPr>
-      <w:r>
-        <w:rPr>
-          <w:szCs w:val="22"/>
-        </w:rPr>
-        <w:t>cache stores frequent data (like Redis) between the app layer and database to avoid slow DB hits every time</w:t>
+      <w:proofErr w:type="gramStart"/>
+      <w:r>
+        <w:rPr>
+          <w:szCs w:val="22"/>
+        </w:rPr>
+        <w:t>cache</w:t>
+      </w:r>
+      <w:proofErr w:type="gramEnd"/>
+      <w:r>
+        <w:rPr>
+          <w:szCs w:val="22"/>
+        </w:rPr>
+        <w:t xml:space="preserve"> stores frequent data (like </w:t>
+      </w:r>
+      <w:proofErr w:type="spellStart"/>
+      <w:r>
+        <w:rPr>
+          <w:szCs w:val="22"/>
+        </w:rPr>
+        <w:t>Redis</w:t>
+      </w:r>
+      <w:proofErr w:type="spellEnd"/>
+      <w:r>
+        <w:rPr>
+          <w:szCs w:val="22"/>
+        </w:rPr>
+        <w:t>) between the app layer and database to avoid slow DB hits every time</w:t>
       </w:r>
     </w:p>
     <w:p>
@@ -2258,7 +2511,23 @@
           <w:rFonts w:cstheme="majorBidi"/>
           <w:szCs w:val="22"/>
         </w:rPr>
-        <w:t xml:space="preserve">You -  Proxy   Website   Proxy  </w:t>
+        <w:t xml:space="preserve">You </w:t>
+      </w:r>
+      <w:proofErr w:type="gramStart"/>
+      <w:r>
+        <w:rPr>
+          <w:rFonts w:cstheme="majorBidi"/>
+          <w:szCs w:val="22"/>
+        </w:rPr>
+        <w:t>-  Proxy</w:t>
+      </w:r>
+      <w:proofErr w:type="gramEnd"/>
+      <w:r>
+        <w:rPr>
+          <w:rFonts w:cstheme="majorBidi"/>
+          <w:szCs w:val="22"/>
+        </w:rPr>
+        <w:t xml:space="preserve">   Website   Proxy  </w:t>
       </w:r>
       <w:r>
         <w:rPr>
@@ -2560,14 +2829,30 @@
           <w:rFonts w:cstheme="majorBidi"/>
           <w:sz w:val="20"/>
         </w:rPr>
-        <w:t xml:space="preserve"> commonly used in Schools/ISPs block sites or log activity without telling </w:t>
-      </w:r>
+        <w:t xml:space="preserve"> commonly used in Schools/ISPs block sites or log activity without </w:t>
+      </w:r>
+      <w:proofErr w:type="gramStart"/>
       <w:r>
         <w:rPr>
           <w:rFonts w:cstheme="majorBidi"/>
           <w:sz w:val="20"/>
         </w:rPr>
-        <w:t xml:space="preserve"> the </w:t>
+        <w:t xml:space="preserve">telling </w:t>
+      </w:r>
+      <w:r>
+        <w:rPr>
+          <w:rFonts w:cstheme="majorBidi"/>
+          <w:sz w:val="20"/>
+        </w:rPr>
+        <w:t xml:space="preserve"> the</w:t>
+      </w:r>
+      <w:proofErr w:type="gramEnd"/>
+      <w:r>
+        <w:rPr>
+          <w:rFonts w:cstheme="majorBidi"/>
+          <w:sz w:val="20"/>
+        </w:rPr>
+        <w:t xml:space="preserve"> </w:t>
       </w:r>
       <w:r>
         <w:rPr>
@@ -2672,18 +2957,19 @@
           <w:bCs/>
           <w:sz w:val="20"/>
         </w:rPr>
-        <w:t>What is the difference between a proxy and Redis? Don't they do the same thing?</w:t>
-      </w:r>
-    </w:p>
-    <w:p>
-      <w:pPr>
+        <w:t xml:space="preserve">What is the difference between a proxy and </w:t>
+      </w:r>
+      <w:proofErr w:type="spellStart"/>
+      <w:r>
         <w:rPr>
           <w:rFonts w:cstheme="majorBidi"/>
           <w:b/>
           <w:bCs/>
           <w:sz w:val="20"/>
         </w:rPr>
-      </w:pPr>
+        <w:t>Redis</w:t>
+      </w:r>
+      <w:proofErr w:type="spellEnd"/>
       <w:r>
         <w:rPr>
           <w:rFonts w:cstheme="majorBidi"/>
@@ -2691,7 +2977,37 @@
           <w:bCs/>
           <w:sz w:val="20"/>
         </w:rPr>
-        <w:t>Ans:</w:t>
+        <w:t>? Don't they do the same thing?</w:t>
+      </w:r>
+    </w:p>
+    <w:p>
+      <w:pPr>
+        <w:rPr>
+          <w:rFonts w:cstheme="majorBidi"/>
+          <w:b/>
+          <w:bCs/>
+          <w:sz w:val="20"/>
+        </w:rPr>
+      </w:pPr>
+      <w:proofErr w:type="spellStart"/>
+      <w:r>
+        <w:rPr>
+          <w:rFonts w:cstheme="majorBidi"/>
+          <w:b/>
+          <w:bCs/>
+          <w:sz w:val="20"/>
+        </w:rPr>
+        <w:t>Ans</w:t>
+      </w:r>
+      <w:proofErr w:type="spellEnd"/>
+      <w:r>
+        <w:rPr>
+          <w:rFonts w:cstheme="majorBidi"/>
+          <w:b/>
+          <w:bCs/>
+          <w:sz w:val="20"/>
+        </w:rPr>
+        <w:t>:</w:t>
       </w:r>
     </w:p>
     <w:p>
@@ -2708,6 +3024,7 @@
           <w:sz w:val="20"/>
         </w:rPr>
       </w:pPr>
+      <w:proofErr w:type="spellStart"/>
       <w:r>
         <w:rPr>
           <w:rFonts w:cstheme="majorBidi"/>
@@ -2715,7 +3032,17 @@
           <w:bCs/>
           <w:sz w:val="20"/>
         </w:rPr>
-        <w:t xml:space="preserve">Redis </w:t>
+        <w:t>Redis</w:t>
+      </w:r>
+      <w:proofErr w:type="spellEnd"/>
+      <w:r>
+        <w:rPr>
+          <w:rFonts w:cstheme="majorBidi"/>
+          <w:b/>
+          <w:bCs/>
+          <w:sz w:val="20"/>
+        </w:rPr>
+        <w:t xml:space="preserve"> </w:t>
       </w:r>
       <w:r>
         <w:rPr>
@@ -2763,6 +3090,7 @@
           <w:sz w:val="20"/>
         </w:rPr>
       </w:pPr>
+      <w:proofErr w:type="spellStart"/>
       <w:r>
         <w:rPr>
           <w:rFonts w:cstheme="majorBidi"/>
@@ -2773,6 +3101,7 @@
         </w:rPr>
         <w:t>Redis</w:t>
       </w:r>
+      <w:proofErr w:type="spellEnd"/>
       <w:r>
         <w:rPr>
           <w:rFonts w:cstheme="majorBidi"/>
@@ -2799,6 +3128,1818 @@
         </w:rPr>
         <w:t xml:space="preserve"> = traffic handler that might cache too.</w:t>
       </w:r>
+    </w:p>
+    <w:p>
+      <w:pPr>
+        <w:rPr>
+          <w:rFonts w:cstheme="majorBidi"/>
+          <w:sz w:val="20"/>
+        </w:rPr>
+      </w:pPr>
+    </w:p>
+    <w:p>
+      <w:pPr>
+        <w:rPr>
+          <w:rFonts w:cstheme="majorBidi"/>
+          <w:b/>
+          <w:bCs/>
+          <w:color w:val="FF0000"/>
+          <w:sz w:val="40"/>
+          <w:szCs w:val="40"/>
+          <w:u w:val="single"/>
+        </w:rPr>
+      </w:pPr>
+      <w:r>
+        <w:rPr>
+          <w:rFonts w:cstheme="majorBidi"/>
+          <w:b/>
+          <w:bCs/>
+          <w:color w:val="FF0000"/>
+          <w:sz w:val="40"/>
+          <w:szCs w:val="40"/>
+          <w:u w:val="single"/>
+        </w:rPr>
+        <w:t>Data and Data flow:</w:t>
+      </w:r>
+    </w:p>
+    <w:p>
+      <w:pPr>
+        <w:rPr>
+          <w:rFonts w:cstheme="majorBidi"/>
+          <w:b/>
+          <w:bCs/>
+          <w:sz w:val="28"/>
+          <w:szCs w:val="28"/>
+        </w:rPr>
+      </w:pPr>
+      <w:r>
+        <w:rPr>
+          <w:rFonts w:cstheme="majorBidi"/>
+          <w:b/>
+          <w:bCs/>
+          <w:sz w:val="28"/>
+          <w:szCs w:val="28"/>
+        </w:rPr>
+        <w:t>The Role of Data:</w:t>
+      </w:r>
+    </w:p>
+    <w:p>
+      <w:pPr>
+        <w:rPr>
+          <w:rFonts w:cstheme="minorHAnsi"/>
+          <w:b/>
+          <w:bCs/>
+        </w:rPr>
+      </w:pPr>
+      <w:r>
+        <w:rPr>
+          <w:rFonts w:cstheme="minorHAnsi"/>
+          <w:b/>
+          <w:bCs/>
+          <w:color w:val="0A0A0A"/>
+          <w:shd w:val="clear" w:color="auto" w:fill="FFFFFF"/>
+        </w:rPr>
+        <w:t>Data is the core entity of any computing system, much like people are the focus of a building; for example, people enter a hospital to be treated and then leave. </w:t>
+      </w:r>
+      <w:r>
+        <w:rPr>
+          <w:rFonts w:cstheme="minorHAnsi"/>
+          <w:b/>
+          <w:bCs/>
+        </w:rPr>
+        <w:t>Systems exist to input, manipulate, and serve data back to users</w:t>
+      </w:r>
+      <w:r>
+        <w:rPr>
+          <w:rFonts w:cstheme="minorHAnsi"/>
+          <w:b/>
+          <w:bCs/>
+        </w:rPr>
+        <w:t>.</w:t>
+      </w:r>
+    </w:p>
+    <w:p>
+      <w:pPr>
+        <w:rPr>
+          <w:rFonts w:cstheme="minorHAnsi"/>
+          <w:b/>
+          <w:bCs/>
+          <w:sz w:val="28"/>
+          <w:szCs w:val="28"/>
+        </w:rPr>
+      </w:pPr>
+      <w:r>
+        <w:rPr>
+          <w:rFonts w:cstheme="minorHAnsi"/>
+          <w:b/>
+          <w:bCs/>
+          <w:sz w:val="28"/>
+          <w:szCs w:val="28"/>
+        </w:rPr>
+        <w:t>Data Representation Layers:</w:t>
+      </w:r>
+    </w:p>
+    <w:p>
+      <w:pPr>
+        <w:rPr>
+          <w:rFonts w:cstheme="minorHAnsi"/>
+          <w:szCs w:val="22"/>
+        </w:rPr>
+      </w:pPr>
+      <w:r>
+        <w:rPr>
+          <w:rFonts w:cstheme="minorHAnsi"/>
+          <w:szCs w:val="22"/>
+        </w:rPr>
+        <w:t>Data changes its format as it trav</w:t>
+      </w:r>
+      <w:r>
+        <w:rPr>
+          <w:rFonts w:cstheme="minorHAnsi"/>
+          <w:szCs w:val="22"/>
+        </w:rPr>
+        <w:t>els through a system</w:t>
+      </w:r>
+      <w:r>
+        <w:rPr>
+          <w:rFonts w:cstheme="minorHAnsi"/>
+          <w:szCs w:val="22"/>
+        </w:rPr>
+        <w:t>:</w:t>
+      </w:r>
+    </w:p>
+    <w:p>
+      <w:pPr>
+        <w:pStyle w:val="ListParagraph"/>
+        <w:numPr>
+          <w:ilvl w:val="0"/>
+          <w:numId w:val="14"/>
+        </w:numPr>
+        <w:rPr>
+          <w:rFonts w:cstheme="minorHAnsi"/>
+          <w:b/>
+          <w:bCs/>
+          <w:szCs w:val="22"/>
+        </w:rPr>
+      </w:pPr>
+      <w:r>
+        <w:rPr>
+          <w:rFonts w:cstheme="minorHAnsi"/>
+          <w:b/>
+          <w:bCs/>
+          <w:noProof/>
+          <w:szCs w:val="22"/>
+          <w:lang w:eastAsia="en-IN"/>
+        </w:rPr>
+        <mc:AlternateContent>
+          <mc:Choice Requires="wps">
+            <w:drawing>
+              <wp:anchor distT="0" distB="0" distL="114300" distR="114300" simplePos="0" relativeHeight="251667456" behindDoc="0" locked="0" layoutInCell="1" allowOverlap="1">
+                <wp:simplePos x="0" y="0"/>
+                <wp:positionH relativeFrom="column">
+                  <wp:posOffset>620202</wp:posOffset>
+                </wp:positionH>
+                <wp:positionV relativeFrom="paragraph">
+                  <wp:posOffset>170042</wp:posOffset>
+                </wp:positionV>
+                <wp:extent cx="71561" cy="147099"/>
+                <wp:effectExtent l="19050" t="0" r="43180" b="43815"/>
+                <wp:wrapNone/>
+                <wp:docPr id="6" name="Down Arrow 6"/>
+                <wp:cNvGraphicFramePr/>
+                <a:graphic xmlns:a="http://schemas.openxmlformats.org/drawingml/2006/main">
+                  <a:graphicData uri="http://schemas.microsoft.com/office/word/2010/wordprocessingShape">
+                    <wps:wsp>
+                      <wps:cNvSpPr/>
+                      <wps:spPr>
+                        <a:xfrm>
+                          <a:off x="0" y="0"/>
+                          <a:ext cx="71561" cy="147099"/>
+                        </a:xfrm>
+                        <a:prstGeom prst="downArrow">
+                          <a:avLst/>
+                        </a:prstGeom>
+                      </wps:spPr>
+                      <wps:style>
+                        <a:lnRef idx="2">
+                          <a:schemeClr val="accent1">
+                            <a:shade val="50000"/>
+                          </a:schemeClr>
+                        </a:lnRef>
+                        <a:fillRef idx="1">
+                          <a:schemeClr val="accent1"/>
+                        </a:fillRef>
+                        <a:effectRef idx="0">
+                          <a:schemeClr val="accent1"/>
+                        </a:effectRef>
+                        <a:fontRef idx="minor">
+                          <a:schemeClr val="lt1"/>
+                        </a:fontRef>
+                      </wps:style>
+                      <wps:bodyPr rot="0" spcFirstLastPara="0" vertOverflow="overflow" horzOverflow="overflow" vert="horz" wrap="square" lIns="91440" tIns="45720" rIns="91440" bIns="45720" numCol="1" spcCol="0" rtlCol="0" fromWordArt="0" anchor="ctr" anchorCtr="0" forceAA="0" compatLnSpc="1">
+                        <a:prstTxWarp prst="textNoShape">
+                          <a:avLst/>
+                        </a:prstTxWarp>
+                        <a:noAutofit/>
+                      </wps:bodyPr>
+                    </wps:wsp>
+                  </a:graphicData>
+                </a:graphic>
+              </wp:anchor>
+            </w:drawing>
+          </mc:Choice>
+          <mc:Fallback>
+            <w:pict>
+              <v:shapetype id="_x0000_t67" coordsize="21600,21600" o:spt="67" adj="16200,5400" path="m0@0l@1@0@1,0@2,0@2@0,21600@0,10800,21600xe">
+                <v:stroke joinstyle="miter"/>
+                <v:formulas>
+                  <v:f eqn="val #0"/>
+                  <v:f eqn="val #1"/>
+                  <v:f eqn="sum height 0 #1"/>
+                  <v:f eqn="sum 10800 0 #1"/>
+                  <v:f eqn="sum width 0 #0"/>
+                  <v:f eqn="prod @4 @3 10800"/>
+                  <v:f eqn="sum width 0 @5"/>
+                </v:formulas>
+                <v:path o:connecttype="custom" o:connectlocs="10800,0;0,@0;10800,21600;21600,@0" o:connectangles="270,180,90,0" textboxrect="@1,0,@2,@6"/>
+                <v:handles>
+                  <v:h position="#1,#0" xrange="0,10800" yrange="0,21600"/>
+                </v:handles>
+              </v:shapetype>
+              <v:shape id="Down Arrow 6" o:spid="_x0000_s1026" type="#_x0000_t67" style="position:absolute;margin-left:48.85pt;margin-top:13.4pt;width:5.65pt;height:11.6pt;z-index:251667456;visibility:visible;mso-wrap-style:square;mso-wrap-distance-left:9pt;mso-wrap-distance-top:0;mso-wrap-distance-right:9pt;mso-wrap-distance-bottom:0;mso-position-horizontal:absolute;mso-position-horizontal-relative:text;mso-position-vertical:absolute;mso-position-vertical-relative:text;v-text-anchor:middle" o:gfxdata="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" adj="16346" fillcolor="#4f81bd [3204]" strokecolor="#243f60 [1604]" strokeweight="2pt"/>
+            </w:pict>
+          </mc:Fallback>
+        </mc:AlternateContent>
+      </w:r>
+      <w:r>
+        <w:rPr>
+          <w:rFonts w:cstheme="minorHAnsi"/>
+          <w:b/>
+          <w:bCs/>
+          <w:szCs w:val="22"/>
+        </w:rPr>
+        <w:t xml:space="preserve">Business Layer: </w:t>
+      </w:r>
+      <w:r>
+        <w:rPr>
+          <w:rFonts w:cstheme="minorHAnsi"/>
+          <w:szCs w:val="22"/>
+        </w:rPr>
+        <w:t>Represented as text, video, images, or notes.</w:t>
+      </w:r>
+    </w:p>
+    <w:p>
+      <w:pPr>
+        <w:pStyle w:val="ListParagraph"/>
+        <w:rPr>
+          <w:rFonts w:cstheme="minorHAnsi"/>
+          <w:b/>
+          <w:bCs/>
+          <w:szCs w:val="22"/>
+        </w:rPr>
+      </w:pPr>
+    </w:p>
+    <w:p>
+      <w:pPr>
+        <w:pStyle w:val="ListParagraph"/>
+        <w:numPr>
+          <w:ilvl w:val="0"/>
+          <w:numId w:val="14"/>
+        </w:numPr>
+        <w:rPr>
+          <w:rFonts w:cstheme="minorHAnsi"/>
+          <w:szCs w:val="22"/>
+        </w:rPr>
+      </w:pPr>
+      <w:r>
+        <w:rPr>
+          <w:rFonts w:cstheme="minorHAnsi"/>
+          <w:b/>
+          <w:bCs/>
+          <w:szCs w:val="22"/>
+        </w:rPr>
+        <w:t xml:space="preserve">Application Layer: </w:t>
+      </w:r>
+      <w:r>
+        <w:rPr>
+          <w:rFonts w:cstheme="minorHAnsi"/>
+          <w:szCs w:val="22"/>
+        </w:rPr>
+        <w:t>Transformed into structured formats like JSON or XML.</w:t>
+      </w:r>
+    </w:p>
+    <w:p>
+      <w:pPr>
+        <w:pStyle w:val="ListParagraph"/>
+        <w:rPr>
+          <w:rFonts w:cstheme="minorHAnsi"/>
+          <w:szCs w:val="22"/>
+        </w:rPr>
+      </w:pPr>
+      <w:r>
+        <w:rPr>
+          <w:rFonts w:cstheme="minorHAnsi"/>
+          <w:b/>
+          <w:bCs/>
+          <w:noProof/>
+          <w:szCs w:val="22"/>
+          <w:lang w:eastAsia="en-IN"/>
+        </w:rPr>
+        <mc:AlternateContent>
+          <mc:Choice Requires="wps">
+            <w:drawing>
+              <wp:anchor distT="0" distB="0" distL="114300" distR="114300" simplePos="0" relativeHeight="251669504" behindDoc="0" locked="0" layoutInCell="1" allowOverlap="1" wp14:anchorId="622A905C" wp14:editId="15F10C71">
+                <wp:simplePos x="0" y="0"/>
+                <wp:positionH relativeFrom="column">
+                  <wp:posOffset>621085</wp:posOffset>
+                </wp:positionH>
+                <wp:positionV relativeFrom="paragraph">
+                  <wp:posOffset>20182</wp:posOffset>
+                </wp:positionV>
+                <wp:extent cx="71561" cy="147099"/>
+                <wp:effectExtent l="19050" t="0" r="43180" b="43815"/>
+                <wp:wrapNone/>
+                <wp:docPr id="7" name="Down Arrow 7"/>
+                <wp:cNvGraphicFramePr/>
+                <a:graphic xmlns:a="http://schemas.openxmlformats.org/drawingml/2006/main">
+                  <a:graphicData uri="http://schemas.microsoft.com/office/word/2010/wordprocessingShape">
+                    <wps:wsp>
+                      <wps:cNvSpPr/>
+                      <wps:spPr>
+                        <a:xfrm>
+                          <a:off x="0" y="0"/>
+                          <a:ext cx="71561" cy="147099"/>
+                        </a:xfrm>
+                        <a:prstGeom prst="downArrow">
+                          <a:avLst/>
+                        </a:prstGeom>
+                      </wps:spPr>
+                      <wps:style>
+                        <a:lnRef idx="2">
+                          <a:schemeClr val="accent1">
+                            <a:shade val="50000"/>
+                          </a:schemeClr>
+                        </a:lnRef>
+                        <a:fillRef idx="1">
+                          <a:schemeClr val="accent1"/>
+                        </a:fillRef>
+                        <a:effectRef idx="0">
+                          <a:schemeClr val="accent1"/>
+                        </a:effectRef>
+                        <a:fontRef idx="minor">
+                          <a:schemeClr val="lt1"/>
+                        </a:fontRef>
+                      </wps:style>
+                      <wps:bodyPr rot="0" spcFirstLastPara="0" vertOverflow="overflow" horzOverflow="overflow" vert="horz" wrap="square" lIns="91440" tIns="45720" rIns="91440" bIns="45720" numCol="1" spcCol="0" rtlCol="0" fromWordArt="0" anchor="ctr" anchorCtr="0" forceAA="0" compatLnSpc="1">
+                        <a:prstTxWarp prst="textNoShape">
+                          <a:avLst/>
+                        </a:prstTxWarp>
+                        <a:noAutofit/>
+                      </wps:bodyPr>
+                    </wps:wsp>
+                  </a:graphicData>
+                </a:graphic>
+              </wp:anchor>
+            </w:drawing>
+          </mc:Choice>
+          <mc:Fallback>
+            <w:pict>
+              <v:shape id="Down Arrow 7" o:spid="_x0000_s1026" type="#_x0000_t67" style="position:absolute;margin-left:48.9pt;margin-top:1.6pt;width:5.65pt;height:11.6pt;z-index:251669504;visibility:visible;mso-wrap-style:square;mso-wrap-distance-left:9pt;mso-wrap-distance-top:0;mso-wrap-distance-right:9pt;mso-wrap-distance-bottom:0;mso-position-horizontal:absolute;mso-position-horizontal-relative:text;mso-position-vertical:absolute;mso-position-vertical-relative:text;v-text-anchor:middle" o:gfxdata="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" adj="16346" fillcolor="#4f81bd [3204]" strokecolor="#243f60 [1604]" strokeweight="2pt"/>
+            </w:pict>
+          </mc:Fallback>
+        </mc:AlternateContent>
+      </w:r>
+    </w:p>
+    <w:p>
+      <w:pPr>
+        <w:pStyle w:val="ListParagraph"/>
+        <w:numPr>
+          <w:ilvl w:val="0"/>
+          <w:numId w:val="14"/>
+        </w:numPr>
+        <w:rPr>
+          <w:rFonts w:cstheme="minorHAnsi"/>
+          <w:b/>
+          <w:bCs/>
+          <w:szCs w:val="22"/>
+        </w:rPr>
+      </w:pPr>
+      <w:r>
+        <w:rPr>
+          <w:rFonts w:cstheme="minorHAnsi"/>
+          <w:b/>
+          <w:bCs/>
+          <w:szCs w:val="22"/>
+        </w:rPr>
+        <w:t xml:space="preserve">Data </w:t>
+      </w:r>
+      <w:proofErr w:type="gramStart"/>
+      <w:r>
+        <w:rPr>
+          <w:rFonts w:cstheme="minorHAnsi"/>
+          <w:b/>
+          <w:bCs/>
+          <w:szCs w:val="22"/>
+        </w:rPr>
+        <w:t>Stores</w:t>
+      </w:r>
+      <w:r>
+        <w:rPr>
+          <w:rFonts w:cstheme="minorHAnsi"/>
+          <w:b/>
+          <w:bCs/>
+          <w:szCs w:val="22"/>
+        </w:rPr>
+        <w:t>(</w:t>
+      </w:r>
+      <w:proofErr w:type="gramEnd"/>
+      <w:r>
+        <w:rPr>
+          <w:rFonts w:cstheme="minorHAnsi"/>
+          <w:b/>
+          <w:bCs/>
+          <w:szCs w:val="22"/>
+        </w:rPr>
+        <w:t>Databases)</w:t>
+      </w:r>
+      <w:r>
+        <w:rPr>
+          <w:rFonts w:cstheme="minorHAnsi"/>
+          <w:b/>
+          <w:bCs/>
+          <w:szCs w:val="22"/>
+        </w:rPr>
+        <w:t xml:space="preserve">: </w:t>
+      </w:r>
+      <w:r>
+        <w:rPr>
+          <w:rFonts w:cstheme="minorHAnsi"/>
+          <w:szCs w:val="22"/>
+        </w:rPr>
+        <w:t>Organized into tables, indexes, or trees for efficient retrieval.</w:t>
+      </w:r>
+    </w:p>
+    <w:p>
+      <w:pPr>
+        <w:pStyle w:val="ListParagraph"/>
+        <w:rPr>
+          <w:rFonts w:cstheme="minorHAnsi"/>
+          <w:b/>
+          <w:bCs/>
+          <w:szCs w:val="22"/>
+        </w:rPr>
+      </w:pPr>
+      <w:r>
+        <w:rPr>
+          <w:rFonts w:cstheme="minorHAnsi"/>
+          <w:b/>
+          <w:bCs/>
+          <w:noProof/>
+          <w:szCs w:val="22"/>
+          <w:lang w:eastAsia="en-IN"/>
+        </w:rPr>
+        <mc:AlternateContent>
+          <mc:Choice Requires="wps">
+            <w:drawing>
+              <wp:anchor distT="0" distB="0" distL="114300" distR="114300" simplePos="0" relativeHeight="251671552" behindDoc="0" locked="0" layoutInCell="1" allowOverlap="1" wp14:anchorId="622A905C" wp14:editId="15F10C71">
+                <wp:simplePos x="0" y="0"/>
+                <wp:positionH relativeFrom="column">
+                  <wp:posOffset>613134</wp:posOffset>
+                </wp:positionH>
+                <wp:positionV relativeFrom="paragraph">
+                  <wp:posOffset>17366</wp:posOffset>
+                </wp:positionV>
+                <wp:extent cx="71561" cy="147099"/>
+                <wp:effectExtent l="19050" t="0" r="43180" b="43815"/>
+                <wp:wrapNone/>
+                <wp:docPr id="8" name="Down Arrow 8"/>
+                <wp:cNvGraphicFramePr/>
+                <a:graphic xmlns:a="http://schemas.openxmlformats.org/drawingml/2006/main">
+                  <a:graphicData uri="http://schemas.microsoft.com/office/word/2010/wordprocessingShape">
+                    <wps:wsp>
+                      <wps:cNvSpPr/>
+                      <wps:spPr>
+                        <a:xfrm>
+                          <a:off x="0" y="0"/>
+                          <a:ext cx="71561" cy="147099"/>
+                        </a:xfrm>
+                        <a:prstGeom prst="downArrow">
+                          <a:avLst/>
+                        </a:prstGeom>
+                      </wps:spPr>
+                      <wps:style>
+                        <a:lnRef idx="2">
+                          <a:schemeClr val="accent1">
+                            <a:shade val="50000"/>
+                          </a:schemeClr>
+                        </a:lnRef>
+                        <a:fillRef idx="1">
+                          <a:schemeClr val="accent1"/>
+                        </a:fillRef>
+                        <a:effectRef idx="0">
+                          <a:schemeClr val="accent1"/>
+                        </a:effectRef>
+                        <a:fontRef idx="minor">
+                          <a:schemeClr val="lt1"/>
+                        </a:fontRef>
+                      </wps:style>
+                      <wps:bodyPr rot="0" spcFirstLastPara="0" vertOverflow="overflow" horzOverflow="overflow" vert="horz" wrap="square" lIns="91440" tIns="45720" rIns="91440" bIns="45720" numCol="1" spcCol="0" rtlCol="0" fromWordArt="0" anchor="ctr" anchorCtr="0" forceAA="0" compatLnSpc="1">
+                        <a:prstTxWarp prst="textNoShape">
+                          <a:avLst/>
+                        </a:prstTxWarp>
+                        <a:noAutofit/>
+                      </wps:bodyPr>
+                    </wps:wsp>
+                  </a:graphicData>
+                </a:graphic>
+              </wp:anchor>
+            </w:drawing>
+          </mc:Choice>
+          <mc:Fallback>
+            <w:pict>
+              <v:shape id="Down Arrow 8" o:spid="_x0000_s1026" type="#_x0000_t67" style="position:absolute;margin-left:48.3pt;margin-top:1.35pt;width:5.65pt;height:11.6pt;z-index:251671552;visibility:visible;mso-wrap-style:square;mso-wrap-distance-left:9pt;mso-wrap-distance-top:0;mso-wrap-distance-right:9pt;mso-wrap-distance-bottom:0;mso-position-horizontal:absolute;mso-position-horizontal-relative:text;mso-position-vertical:absolute;mso-position-vertical-relative:text;v-text-anchor:middle" o:gfxdata="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" adj="16346" fillcolor="#4f81bd [3204]" strokecolor="#243f60 [1604]" strokeweight="2pt"/>
+            </w:pict>
+          </mc:Fallback>
+        </mc:AlternateContent>
+      </w:r>
+    </w:p>
+    <w:p>
+      <w:pPr>
+        <w:pStyle w:val="ListParagraph"/>
+        <w:numPr>
+          <w:ilvl w:val="0"/>
+          <w:numId w:val="14"/>
+        </w:numPr>
+        <w:rPr>
+          <w:rFonts w:cstheme="minorHAnsi"/>
+          <w:b/>
+          <w:bCs/>
+          <w:szCs w:val="22"/>
+        </w:rPr>
+      </w:pPr>
+      <w:r>
+        <w:rPr>
+          <w:rFonts w:cstheme="minorHAnsi"/>
+          <w:b/>
+          <w:bCs/>
+          <w:szCs w:val="22"/>
+        </w:rPr>
+        <w:t xml:space="preserve">Network Layer: </w:t>
+      </w:r>
+      <w:r>
+        <w:rPr>
+          <w:rFonts w:cstheme="minorHAnsi"/>
+          <w:szCs w:val="22"/>
+        </w:rPr>
+        <w:t>Transferred as packets.</w:t>
+      </w:r>
+    </w:p>
+    <w:p>
+      <w:pPr>
+        <w:pStyle w:val="ListParagraph"/>
+        <w:rPr>
+          <w:rFonts w:cstheme="minorHAnsi"/>
+          <w:b/>
+          <w:bCs/>
+          <w:szCs w:val="22"/>
+        </w:rPr>
+      </w:pPr>
+      <w:r>
+        <w:rPr>
+          <w:rFonts w:cstheme="minorHAnsi"/>
+          <w:b/>
+          <w:bCs/>
+          <w:noProof/>
+          <w:szCs w:val="22"/>
+          <w:lang w:eastAsia="en-IN"/>
+        </w:rPr>
+        <mc:AlternateContent>
+          <mc:Choice Requires="wps">
+            <w:drawing>
+              <wp:anchor distT="0" distB="0" distL="114300" distR="114300" simplePos="0" relativeHeight="251673600" behindDoc="0" locked="0" layoutInCell="1" allowOverlap="1" wp14:anchorId="622A905C" wp14:editId="15F10C71">
+                <wp:simplePos x="0" y="0"/>
+                <wp:positionH relativeFrom="column">
+                  <wp:posOffset>621085</wp:posOffset>
+                </wp:positionH>
+                <wp:positionV relativeFrom="paragraph">
+                  <wp:posOffset>22501</wp:posOffset>
+                </wp:positionV>
+                <wp:extent cx="71561" cy="147099"/>
+                <wp:effectExtent l="19050" t="0" r="43180" b="43815"/>
+                <wp:wrapNone/>
+                <wp:docPr id="9" name="Down Arrow 9"/>
+                <wp:cNvGraphicFramePr/>
+                <a:graphic xmlns:a="http://schemas.openxmlformats.org/drawingml/2006/main">
+                  <a:graphicData uri="http://schemas.microsoft.com/office/word/2010/wordprocessingShape">
+                    <wps:wsp>
+                      <wps:cNvSpPr/>
+                      <wps:spPr>
+                        <a:xfrm>
+                          <a:off x="0" y="0"/>
+                          <a:ext cx="71561" cy="147099"/>
+                        </a:xfrm>
+                        <a:prstGeom prst="downArrow">
+                          <a:avLst/>
+                        </a:prstGeom>
+                      </wps:spPr>
+                      <wps:style>
+                        <a:lnRef idx="2">
+                          <a:schemeClr val="accent1">
+                            <a:shade val="50000"/>
+                          </a:schemeClr>
+                        </a:lnRef>
+                        <a:fillRef idx="1">
+                          <a:schemeClr val="accent1"/>
+                        </a:fillRef>
+                        <a:effectRef idx="0">
+                          <a:schemeClr val="accent1"/>
+                        </a:effectRef>
+                        <a:fontRef idx="minor">
+                          <a:schemeClr val="lt1"/>
+                        </a:fontRef>
+                      </wps:style>
+                      <wps:bodyPr rot="0" spcFirstLastPara="0" vertOverflow="overflow" horzOverflow="overflow" vert="horz" wrap="square" lIns="91440" tIns="45720" rIns="91440" bIns="45720" numCol="1" spcCol="0" rtlCol="0" fromWordArt="0" anchor="ctr" anchorCtr="0" forceAA="0" compatLnSpc="1">
+                        <a:prstTxWarp prst="textNoShape">
+                          <a:avLst/>
+                        </a:prstTxWarp>
+                        <a:noAutofit/>
+                      </wps:bodyPr>
+                    </wps:wsp>
+                  </a:graphicData>
+                </a:graphic>
+              </wp:anchor>
+            </w:drawing>
+          </mc:Choice>
+          <mc:Fallback>
+            <w:pict>
+              <v:shape id="Down Arrow 9" o:spid="_x0000_s1026" type="#_x0000_t67" style="position:absolute;margin-left:48.9pt;margin-top:1.75pt;width:5.65pt;height:11.6pt;z-index:251673600;visibility:visible;mso-wrap-style:square;mso-wrap-distance-left:9pt;mso-wrap-distance-top:0;mso-wrap-distance-right:9pt;mso-wrap-distance-bottom:0;mso-position-horizontal:absolute;mso-position-horizontal-relative:text;mso-position-vertical:absolute;mso-position-vertical-relative:text;v-text-anchor:middle" o:gfxdata="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" adj="16346" fillcolor="#4f81bd [3204]" strokecolor="#243f60 [1604]" strokeweight="2pt"/>
+            </w:pict>
+          </mc:Fallback>
+        </mc:AlternateContent>
+      </w:r>
+    </w:p>
+    <w:p>
+      <w:pPr>
+        <w:pStyle w:val="ListParagraph"/>
+        <w:numPr>
+          <w:ilvl w:val="0"/>
+          <w:numId w:val="14"/>
+        </w:numPr>
+        <w:rPr>
+          <w:rFonts w:cstheme="minorHAnsi"/>
+          <w:b/>
+          <w:bCs/>
+          <w:szCs w:val="22"/>
+        </w:rPr>
+      </w:pPr>
+      <w:r>
+        <w:rPr>
+          <w:rFonts w:cstheme="minorHAnsi"/>
+          <w:b/>
+          <w:bCs/>
+          <w:szCs w:val="22"/>
+        </w:rPr>
+        <w:t xml:space="preserve">Hardware Level: </w:t>
+      </w:r>
+      <w:r>
+        <w:rPr>
+          <w:rFonts w:cstheme="minorHAnsi"/>
+          <w:szCs w:val="22"/>
+        </w:rPr>
+        <w:t>Ulti</w:t>
+      </w:r>
+      <w:r>
+        <w:rPr>
+          <w:rFonts w:cstheme="minorHAnsi"/>
+          <w:szCs w:val="22"/>
+        </w:rPr>
+        <w:t xml:space="preserve">mately stored as zeros and </w:t>
+      </w:r>
+      <w:proofErr w:type="gramStart"/>
+      <w:r>
+        <w:rPr>
+          <w:rFonts w:cstheme="minorHAnsi"/>
+          <w:szCs w:val="22"/>
+        </w:rPr>
+        <w:t>ones(</w:t>
+      </w:r>
+      <w:proofErr w:type="gramEnd"/>
+      <w:r>
+        <w:rPr>
+          <w:rFonts w:cstheme="minorHAnsi"/>
+          <w:szCs w:val="22"/>
+        </w:rPr>
+        <w:t>0,1).</w:t>
+      </w:r>
+    </w:p>
+    <w:p>
+      <w:pPr>
+        <w:rPr>
+          <w:rFonts w:cstheme="minorHAnsi"/>
+          <w:szCs w:val="22"/>
+        </w:rPr>
+      </w:pPr>
+    </w:p>
+    <w:p>
+      <w:pPr>
+        <w:pStyle w:val="ListParagraph"/>
+        <w:numPr>
+          <w:ilvl w:val="0"/>
+          <w:numId w:val="15"/>
+        </w:numPr>
+        <w:rPr>
+          <w:rFonts w:cstheme="minorHAnsi"/>
+          <w:szCs w:val="22"/>
+        </w:rPr>
+      </w:pPr>
+      <w:r>
+        <w:rPr>
+          <w:rFonts w:cstheme="minorHAnsi"/>
+          <w:szCs w:val="22"/>
+        </w:rPr>
+        <w:t>Effective system design requires understanding how data moves between stores (databases, caches, queues) and application components. Key communication methods include APIs, messages, and events</w:t>
+      </w:r>
+    </w:p>
+    <w:p>
+      <w:pPr>
+        <w:rPr>
+          <w:rFonts w:cstheme="minorHAnsi"/>
+          <w:b/>
+          <w:bCs/>
+          <w:sz w:val="28"/>
+          <w:szCs w:val="28"/>
+        </w:rPr>
+      </w:pPr>
+      <w:r>
+        <w:rPr>
+          <w:rFonts w:cstheme="minorHAnsi"/>
+          <w:b/>
+          <w:bCs/>
+          <w:sz w:val="28"/>
+          <w:szCs w:val="28"/>
+        </w:rPr>
+        <w:t>Factors Influencing System Design:</w:t>
+      </w:r>
+    </w:p>
+    <w:p>
+      <w:pPr>
+        <w:rPr>
+          <w:rFonts w:cstheme="minorHAnsi"/>
+          <w:b/>
+          <w:bCs/>
+          <w:sz w:val="28"/>
+          <w:szCs w:val="28"/>
+        </w:rPr>
+      </w:pPr>
+      <w:r>
+        <w:rPr>
+          <w:rFonts w:cstheme="minorHAnsi"/>
+          <w:szCs w:val="22"/>
+        </w:rPr>
+        <w:lastRenderedPageBreak/>
+        <w:t>When choosing technologies, must consider</w:t>
+      </w:r>
+      <w:r>
+        <w:rPr>
+          <w:rFonts w:cstheme="minorHAnsi"/>
+          <w:szCs w:val="22"/>
+        </w:rPr>
+        <w:t>:</w:t>
+      </w:r>
+    </w:p>
+    <w:p>
+      <w:pPr>
+        <w:pStyle w:val="ListParagraph"/>
+        <w:numPr>
+          <w:ilvl w:val="0"/>
+          <w:numId w:val="15"/>
+        </w:numPr>
+        <w:rPr>
+          <w:rFonts w:cstheme="minorHAnsi"/>
+          <w:b/>
+          <w:bCs/>
+          <w:sz w:val="28"/>
+          <w:szCs w:val="28"/>
+        </w:rPr>
+      </w:pPr>
+      <w:r>
+        <w:rPr>
+          <w:rFonts w:cstheme="minorHAnsi"/>
+          <w:szCs w:val="22"/>
+        </w:rPr>
+        <w:t>Type: (e.g., video vs. text) affects database choice.</w:t>
+      </w:r>
+    </w:p>
+    <w:p>
+      <w:pPr>
+        <w:pStyle w:val="ListParagraph"/>
+        <w:numPr>
+          <w:ilvl w:val="0"/>
+          <w:numId w:val="15"/>
+        </w:numPr>
+        <w:rPr>
+          <w:rFonts w:cstheme="minorHAnsi"/>
+          <w:b/>
+          <w:bCs/>
+          <w:sz w:val="28"/>
+          <w:szCs w:val="28"/>
+        </w:rPr>
+      </w:pPr>
+      <w:r>
+        <w:rPr>
+          <w:rFonts w:cstheme="minorHAnsi"/>
+          <w:szCs w:val="22"/>
+        </w:rPr>
+        <w:t>Volume: Scaling r</w:t>
+      </w:r>
+      <w:r>
+        <w:rPr>
+          <w:rFonts w:cstheme="minorHAnsi"/>
+          <w:szCs w:val="22"/>
+        </w:rPr>
+        <w:t>equirements (GBs vs. Terabytes).</w:t>
+      </w:r>
+    </w:p>
+    <w:p>
+      <w:pPr>
+        <w:pStyle w:val="ListParagraph"/>
+        <w:numPr>
+          <w:ilvl w:val="0"/>
+          <w:numId w:val="15"/>
+        </w:numPr>
+        <w:rPr>
+          <w:rFonts w:cstheme="minorHAnsi"/>
+          <w:b/>
+          <w:bCs/>
+          <w:sz w:val="28"/>
+          <w:szCs w:val="28"/>
+        </w:rPr>
+      </w:pPr>
+      <w:r>
+        <w:rPr>
+          <w:rFonts w:cstheme="minorHAnsi"/>
+          <w:szCs w:val="22"/>
+        </w:rPr>
+        <w:t>Consumption: Read vs. write ratios.</w:t>
+      </w:r>
+    </w:p>
+    <w:p>
+      <w:pPr>
+        <w:pStyle w:val="ListParagraph"/>
+        <w:numPr>
+          <w:ilvl w:val="0"/>
+          <w:numId w:val="15"/>
+        </w:numPr>
+        <w:rPr>
+          <w:rFonts w:cstheme="minorHAnsi"/>
+          <w:b/>
+          <w:bCs/>
+          <w:sz w:val="28"/>
+          <w:szCs w:val="28"/>
+        </w:rPr>
+      </w:pPr>
+      <w:r>
+        <w:rPr>
+          <w:rFonts w:cstheme="minorHAnsi"/>
+          <w:szCs w:val="22"/>
+        </w:rPr>
+        <w:t>Security: Critical for transactional systems like banking.</w:t>
+      </w:r>
+    </w:p>
+    <w:p>
+      <w:pPr>
+        <w:rPr>
+          <w:rFonts w:cstheme="minorHAnsi"/>
+          <w:b/>
+          <w:bCs/>
+          <w:szCs w:val="22"/>
+        </w:rPr>
+      </w:pPr>
+      <w:r>
+        <w:rPr>
+          <w:rFonts w:cstheme="minorHAnsi"/>
+          <w:b/>
+          <w:bCs/>
+          <w:szCs w:val="22"/>
+        </w:rPr>
+        <w:t>You design a system and choose technologies based on its goals and requirements.</w:t>
+      </w:r>
+    </w:p>
+    <w:p>
+      <w:pPr>
+        <w:rPr>
+          <w:rFonts w:cstheme="minorHAnsi"/>
+          <w:b/>
+          <w:bCs/>
+          <w:szCs w:val="22"/>
+        </w:rPr>
+      </w:pPr>
+      <w:r>
+        <w:rPr>
+          <w:rFonts w:cstheme="minorHAnsi"/>
+          <w:b/>
+          <w:bCs/>
+          <w:szCs w:val="22"/>
+        </w:rPr>
+        <w:t>For example:</w:t>
+      </w:r>
+    </w:p>
+    <w:p>
+      <w:pPr>
+        <w:pStyle w:val="ListParagraph"/>
+        <w:numPr>
+          <w:ilvl w:val="0"/>
+          <w:numId w:val="17"/>
+        </w:numPr>
+        <w:rPr>
+          <w:rFonts w:cstheme="minorHAnsi"/>
+          <w:szCs w:val="22"/>
+        </w:rPr>
+      </w:pPr>
+      <w:r>
+        <w:rPr>
+          <w:rFonts w:cstheme="minorHAnsi"/>
+          <w:szCs w:val="22"/>
+        </w:rPr>
+        <w:t>If the system is mainly used for streaming services like Amazon Prime or Netflix, it needs to handle high data volumes and provide fast content retrieval.</w:t>
+      </w:r>
+    </w:p>
+    <w:p>
+      <w:pPr>
+        <w:pStyle w:val="ListParagraph"/>
+        <w:numPr>
+          <w:ilvl w:val="0"/>
+          <w:numId w:val="17"/>
+        </w:numPr>
+        <w:rPr>
+          <w:rFonts w:cstheme="minorHAnsi"/>
+          <w:szCs w:val="22"/>
+        </w:rPr>
+      </w:pPr>
+      <w:r>
+        <w:rPr>
+          <w:rFonts w:cstheme="minorHAnsi"/>
+          <w:szCs w:val="22"/>
+        </w:rPr>
+        <w:t>If the system is compute-intensive, such as an image recognition system or an ML-based processing system, it may require GPUs and other machine learning infrastructure to process large datasets efficiently.</w:t>
+      </w:r>
+    </w:p>
+    <w:p>
+      <w:pPr>
+        <w:ind w:left="360"/>
+        <w:rPr>
+          <w:rFonts w:cstheme="minorHAnsi"/>
+          <w:szCs w:val="22"/>
+        </w:rPr>
+      </w:pPr>
+    </w:p>
+    <w:p>
+      <w:pPr>
+        <w:ind w:left="360"/>
+        <w:rPr>
+          <w:rFonts w:cstheme="minorHAnsi"/>
+          <w:b/>
+          <w:bCs/>
+          <w:color w:val="FF0000"/>
+          <w:sz w:val="40"/>
+          <w:szCs w:val="40"/>
+          <w:u w:val="single"/>
+        </w:rPr>
+      </w:pPr>
+      <w:r>
+        <w:rPr>
+          <w:rFonts w:cstheme="minorHAnsi"/>
+          <w:b/>
+          <w:bCs/>
+          <w:color w:val="FF0000"/>
+          <w:sz w:val="40"/>
+          <w:szCs w:val="40"/>
+          <w:u w:val="single"/>
+        </w:rPr>
+        <w:t>Databases:</w:t>
+      </w:r>
+    </w:p>
+    <w:p>
+      <w:pPr>
+        <w:ind w:left="360"/>
+        <w:rPr>
+          <w:rFonts w:cstheme="minorHAnsi"/>
+          <w:sz w:val="28"/>
+          <w:szCs w:val="28"/>
+        </w:rPr>
+      </w:pPr>
+      <w:r>
+        <w:rPr>
+          <w:rFonts w:cstheme="minorHAnsi"/>
+          <w:sz w:val="28"/>
+          <w:szCs w:val="28"/>
+        </w:rPr>
+        <w:t>Types of databases:-</w:t>
+      </w:r>
+    </w:p>
+    <w:p>
+      <w:pPr>
+        <w:ind w:left="360"/>
+        <w:rPr>
+          <w:rFonts w:cstheme="minorHAnsi"/>
+          <w:sz w:val="28"/>
+          <w:szCs w:val="28"/>
+        </w:rPr>
+      </w:pPr>
+      <w:r>
+        <w:rPr>
+          <w:rFonts w:cstheme="minorHAnsi"/>
+          <w:sz w:val="28"/>
+          <w:szCs w:val="28"/>
+        </w:rPr>
+        <w:t xml:space="preserve">1. Relational </w:t>
+      </w:r>
+      <w:proofErr w:type="gramStart"/>
+      <w:r>
+        <w:rPr>
+          <w:rFonts w:cstheme="minorHAnsi"/>
+          <w:sz w:val="28"/>
+          <w:szCs w:val="28"/>
+        </w:rPr>
+        <w:t>database(</w:t>
+      </w:r>
+      <w:proofErr w:type="gramEnd"/>
+      <w:r>
+        <w:rPr>
+          <w:rFonts w:cstheme="minorHAnsi"/>
+          <w:sz w:val="28"/>
+          <w:szCs w:val="28"/>
+        </w:rPr>
+        <w:t>SQL)</w:t>
+      </w:r>
+      <w:r>
+        <w:rPr>
+          <w:rFonts w:cstheme="minorHAnsi"/>
+          <w:sz w:val="28"/>
+          <w:szCs w:val="28"/>
+        </w:rPr>
+        <w:t>,</w:t>
+      </w:r>
+    </w:p>
+    <w:p>
+      <w:pPr>
+        <w:ind w:left="360"/>
+        <w:rPr>
+          <w:rFonts w:cstheme="minorHAnsi"/>
+          <w:sz w:val="28"/>
+          <w:szCs w:val="28"/>
+        </w:rPr>
+      </w:pPr>
+      <w:r>
+        <w:rPr>
+          <w:rFonts w:cstheme="minorHAnsi"/>
+          <w:sz w:val="28"/>
+          <w:szCs w:val="28"/>
+        </w:rPr>
+        <w:t xml:space="preserve">2. </w:t>
+      </w:r>
+      <w:proofErr w:type="spellStart"/>
+      <w:r>
+        <w:rPr>
+          <w:rFonts w:cstheme="minorHAnsi"/>
+          <w:sz w:val="28"/>
+          <w:szCs w:val="28"/>
+        </w:rPr>
+        <w:t>Non Relational</w:t>
+      </w:r>
+      <w:proofErr w:type="spellEnd"/>
+      <w:r>
+        <w:rPr>
+          <w:rFonts w:cstheme="minorHAnsi"/>
+          <w:sz w:val="28"/>
+          <w:szCs w:val="28"/>
+        </w:rPr>
+        <w:t xml:space="preserve"> </w:t>
+      </w:r>
+      <w:proofErr w:type="gramStart"/>
+      <w:r>
+        <w:rPr>
+          <w:rFonts w:cstheme="minorHAnsi"/>
+          <w:sz w:val="28"/>
+          <w:szCs w:val="28"/>
+        </w:rPr>
+        <w:t>database(</w:t>
+      </w:r>
+      <w:proofErr w:type="gramEnd"/>
+      <w:r>
+        <w:rPr>
+          <w:rFonts w:cstheme="minorHAnsi"/>
+          <w:sz w:val="28"/>
+          <w:szCs w:val="28"/>
+        </w:rPr>
+        <w:t>NoSQL)</w:t>
+      </w:r>
+      <w:r>
+        <w:rPr>
+          <w:rFonts w:cstheme="minorHAnsi"/>
+          <w:sz w:val="28"/>
+          <w:szCs w:val="28"/>
+        </w:rPr>
+        <w:t xml:space="preserve"> </w:t>
+      </w:r>
+    </w:p>
+    <w:p>
+      <w:pPr>
+        <w:ind w:left="360"/>
+        <w:rPr>
+          <w:rFonts w:cstheme="minorHAnsi"/>
+          <w:sz w:val="28"/>
+          <w:szCs w:val="28"/>
+        </w:rPr>
+      </w:pPr>
+      <w:r>
+        <w:rPr>
+          <w:rFonts w:cstheme="minorHAnsi"/>
+          <w:sz w:val="28"/>
+          <w:szCs w:val="28"/>
+        </w:rPr>
+        <w:t>3. Search databases (</w:t>
+      </w:r>
+      <w:r>
+        <w:rPr>
+          <w:rFonts w:cstheme="minorHAnsi"/>
+          <w:i/>
+          <w:iCs/>
+          <w:szCs w:val="22"/>
+        </w:rPr>
+        <w:t>not a primary database used with relational or non</w:t>
+      </w:r>
+      <w:r>
+        <w:rPr>
+          <w:rFonts w:cstheme="minorHAnsi"/>
+          <w:i/>
+          <w:iCs/>
+          <w:szCs w:val="22"/>
+        </w:rPr>
+        <w:t>-</w:t>
+      </w:r>
+      <w:r>
+        <w:rPr>
+          <w:rFonts w:cstheme="minorHAnsi"/>
+          <w:i/>
+          <w:iCs/>
+          <w:szCs w:val="22"/>
+        </w:rPr>
+        <w:t>relational</w:t>
+      </w:r>
+      <w:r>
+        <w:rPr>
+          <w:rFonts w:cstheme="minorHAnsi"/>
+          <w:i/>
+          <w:iCs/>
+          <w:szCs w:val="22"/>
+        </w:rPr>
+        <w:t xml:space="preserve"> databases</w:t>
+      </w:r>
+      <w:r>
+        <w:rPr>
+          <w:rFonts w:cstheme="minorHAnsi"/>
+          <w:i/>
+          <w:iCs/>
+          <w:szCs w:val="22"/>
+        </w:rPr>
+        <w:t xml:space="preserve"> as a secondary database</w:t>
+      </w:r>
+      <w:r>
+        <w:rPr>
+          <w:rFonts w:cstheme="minorHAnsi"/>
+          <w:sz w:val="28"/>
+          <w:szCs w:val="28"/>
+        </w:rPr>
+        <w:t>)</w:t>
+      </w:r>
+    </w:p>
+    <w:p>
+      <w:pPr>
+        <w:ind w:left="360"/>
+        <w:rPr>
+          <w:rFonts w:cstheme="minorHAnsi"/>
+          <w:b/>
+          <w:bCs/>
+          <w:sz w:val="28"/>
+          <w:szCs w:val="28"/>
+        </w:rPr>
+      </w:pPr>
+      <w:r>
+        <w:rPr>
+          <w:rFonts w:cstheme="minorHAnsi"/>
+          <w:b/>
+          <w:bCs/>
+          <w:sz w:val="28"/>
+          <w:szCs w:val="28"/>
+        </w:rPr>
+        <w:t xml:space="preserve">1. Relational </w:t>
+      </w:r>
+      <w:proofErr w:type="gramStart"/>
+      <w:r>
+        <w:rPr>
+          <w:rFonts w:cstheme="minorHAnsi"/>
+          <w:b/>
+          <w:bCs/>
+          <w:sz w:val="28"/>
+          <w:szCs w:val="28"/>
+        </w:rPr>
+        <w:t>database</w:t>
+      </w:r>
+      <w:r>
+        <w:rPr>
+          <w:rFonts w:cstheme="minorHAnsi"/>
+          <w:b/>
+          <w:bCs/>
+          <w:sz w:val="28"/>
+          <w:szCs w:val="28"/>
+        </w:rPr>
+        <w:t>(</w:t>
+      </w:r>
+      <w:proofErr w:type="gramEnd"/>
+      <w:r>
+        <w:rPr>
+          <w:rFonts w:cstheme="minorHAnsi"/>
+          <w:b/>
+          <w:bCs/>
+          <w:sz w:val="28"/>
+          <w:szCs w:val="28"/>
+        </w:rPr>
+        <w:t>SQL)</w:t>
+      </w:r>
+      <w:r>
+        <w:rPr>
+          <w:rFonts w:cstheme="minorHAnsi"/>
+          <w:b/>
+          <w:bCs/>
+          <w:sz w:val="28"/>
+          <w:szCs w:val="28"/>
+        </w:rPr>
+        <w:t>:-</w:t>
+      </w:r>
+    </w:p>
+    <w:p>
+      <w:pPr>
+        <w:ind w:left="360"/>
+        <w:rPr>
+          <w:rFonts w:cstheme="minorHAnsi"/>
+          <w:szCs w:val="22"/>
+        </w:rPr>
+      </w:pPr>
+      <w:r>
+        <w:rPr>
+          <w:rFonts w:cstheme="minorHAnsi"/>
+          <w:szCs w:val="22"/>
+        </w:rPr>
+        <w:t xml:space="preserve">Relational databases organize data into tables and rows with a defined schema. They are ideal for structured data where relationships are clear and ACID properties (Atomicity, Consistency, Isolation, </w:t>
+      </w:r>
+      <w:proofErr w:type="gramStart"/>
+      <w:r>
+        <w:rPr>
+          <w:rFonts w:cstheme="minorHAnsi"/>
+          <w:szCs w:val="22"/>
+        </w:rPr>
+        <w:t>Durabi</w:t>
+      </w:r>
+      <w:r>
+        <w:rPr>
+          <w:rFonts w:cstheme="minorHAnsi"/>
+          <w:szCs w:val="22"/>
+        </w:rPr>
+        <w:t>lity</w:t>
+      </w:r>
+      <w:proofErr w:type="gramEnd"/>
+      <w:r>
+        <w:rPr>
+          <w:rFonts w:cstheme="minorHAnsi"/>
+          <w:szCs w:val="22"/>
+        </w:rPr>
+        <w:t>) are critical</w:t>
+      </w:r>
+      <w:r>
+        <w:rPr>
+          <w:rFonts w:cstheme="minorHAnsi"/>
+          <w:szCs w:val="22"/>
+        </w:rPr>
+        <w:t>.</w:t>
+      </w:r>
+    </w:p>
+    <w:p>
+      <w:pPr>
+        <w:ind w:left="360"/>
+        <w:rPr>
+          <w:rFonts w:cstheme="minorHAnsi"/>
+          <w:szCs w:val="22"/>
+        </w:rPr>
+      </w:pPr>
+      <w:r>
+        <w:rPr>
+          <w:rFonts w:cstheme="minorHAnsi"/>
+          <w:b/>
+          <w:bCs/>
+          <w:szCs w:val="22"/>
+        </w:rPr>
+        <w:t>Pros:</w:t>
+      </w:r>
+      <w:r>
+        <w:rPr>
+          <w:rFonts w:cstheme="minorHAnsi"/>
+          <w:szCs w:val="22"/>
+        </w:rPr>
+        <w:t xml:space="preserve"> Ensures data integrity, prevents null/garbage values.</w:t>
+      </w:r>
+    </w:p>
+    <w:p>
+      <w:pPr>
+        <w:ind w:left="360"/>
+        <w:rPr>
+          <w:rFonts w:cstheme="minorHAnsi"/>
+          <w:szCs w:val="22"/>
+        </w:rPr>
+      </w:pPr>
+      <w:r>
+        <w:rPr>
+          <w:rFonts w:cstheme="minorHAnsi"/>
+          <w:b/>
+          <w:bCs/>
+          <w:szCs w:val="22"/>
+        </w:rPr>
+        <w:t>Cons</w:t>
+      </w:r>
+      <w:r>
+        <w:rPr>
+          <w:rFonts w:cstheme="minorHAnsi"/>
+          <w:b/>
+          <w:bCs/>
+          <w:szCs w:val="22"/>
+          <w:highlight w:val="yellow"/>
+        </w:rPr>
+        <w:t>:</w:t>
+      </w:r>
+      <w:r>
+        <w:rPr>
+          <w:rFonts w:cstheme="minorHAnsi"/>
+          <w:szCs w:val="22"/>
+          <w:highlight w:val="yellow"/>
+        </w:rPr>
+        <w:t xml:space="preserve"> Hard to scale horizontally; joins become expensive as data grows.</w:t>
+      </w:r>
+    </w:p>
+    <w:p>
+      <w:pPr>
+        <w:ind w:left="360"/>
+        <w:rPr>
+          <w:rFonts w:cstheme="minorHAnsi"/>
+          <w:b/>
+          <w:bCs/>
+          <w:sz w:val="28"/>
+          <w:szCs w:val="28"/>
+        </w:rPr>
+      </w:pPr>
+      <w:r>
+        <w:rPr>
+          <w:rFonts w:cstheme="minorHAnsi"/>
+          <w:b/>
+          <w:bCs/>
+          <w:sz w:val="28"/>
+          <w:szCs w:val="28"/>
+        </w:rPr>
+        <w:t>2. Non-Relational Databases (NoSQL)</w:t>
+      </w:r>
+    </w:p>
+    <w:p>
+      <w:pPr>
+        <w:ind w:left="360"/>
+        <w:rPr>
+          <w:rFonts w:cstheme="minorHAnsi"/>
+          <w:szCs w:val="22"/>
+        </w:rPr>
+      </w:pPr>
+      <w:r>
+        <w:rPr>
+          <w:rFonts w:cstheme="minorHAnsi"/>
+          <w:szCs w:val="22"/>
+        </w:rPr>
+        <w:t>Designed for flexibility, these databases do not have a fixed schema and ar</w:t>
+      </w:r>
+      <w:r>
+        <w:rPr>
+          <w:rFonts w:cstheme="minorHAnsi"/>
+          <w:szCs w:val="22"/>
+        </w:rPr>
+        <w:t>e generally more scalable</w:t>
+      </w:r>
+      <w:r>
+        <w:rPr>
+          <w:rFonts w:cstheme="minorHAnsi"/>
+          <w:szCs w:val="22"/>
+        </w:rPr>
+        <w:t>.</w:t>
+      </w:r>
+    </w:p>
+    <w:p>
+      <w:pPr>
+        <w:ind w:left="360"/>
+        <w:rPr>
+          <w:rFonts w:cstheme="minorHAnsi"/>
+          <w:b/>
+          <w:bCs/>
+          <w:szCs w:val="22"/>
+        </w:rPr>
+      </w:pPr>
+      <w:r>
+        <w:rPr>
+          <w:rFonts w:cstheme="minorHAnsi"/>
+          <w:b/>
+          <w:bCs/>
+          <w:szCs w:val="22"/>
+        </w:rPr>
+        <w:t>Different types of Non-Relational databases are:-</w:t>
+      </w:r>
+    </w:p>
+    <w:p>
+      <w:pPr>
+        <w:pStyle w:val="ListParagraph"/>
+        <w:numPr>
+          <w:ilvl w:val="0"/>
+          <w:numId w:val="18"/>
+        </w:numPr>
+        <w:rPr>
+          <w:rFonts w:cstheme="minorHAnsi"/>
+          <w:szCs w:val="22"/>
+        </w:rPr>
+      </w:pPr>
+      <w:r>
+        <w:rPr>
+          <w:rFonts w:cstheme="minorHAnsi"/>
+          <w:b/>
+          <w:bCs/>
+          <w:szCs w:val="22"/>
+        </w:rPr>
+        <w:lastRenderedPageBreak/>
+        <w:t>Key-Value Stores:</w:t>
+      </w:r>
+      <w:r>
+        <w:rPr>
+          <w:rFonts w:cstheme="minorHAnsi"/>
+          <w:b/>
+          <w:bCs/>
+          <w:sz w:val="28"/>
+          <w:szCs w:val="28"/>
+        </w:rPr>
+        <w:t xml:space="preserve"> </w:t>
+      </w:r>
+      <w:r>
+        <w:rPr>
+          <w:rFonts w:cstheme="minorHAnsi"/>
+          <w:szCs w:val="22"/>
+        </w:rPr>
+        <w:t>Use a simple hash map structure (key and value). Perfect for caching</w:t>
+      </w:r>
+      <w:r>
+        <w:rPr>
+          <w:rFonts w:cstheme="minorHAnsi"/>
+          <w:szCs w:val="22"/>
+        </w:rPr>
+        <w:t xml:space="preserve"> and feature flags</w:t>
+      </w:r>
+      <w:r>
+        <w:rPr>
+          <w:rFonts w:cstheme="minorHAnsi"/>
+          <w:szCs w:val="22"/>
+        </w:rPr>
+        <w:t>.</w:t>
+      </w:r>
+    </w:p>
+    <w:p>
+      <w:pPr>
+        <w:pStyle w:val="ListParagraph"/>
+        <w:numPr>
+          <w:ilvl w:val="0"/>
+          <w:numId w:val="18"/>
+        </w:numPr>
+        <w:rPr>
+          <w:rFonts w:cstheme="minorHAnsi"/>
+          <w:szCs w:val="22"/>
+        </w:rPr>
+      </w:pPr>
+      <w:r>
+        <w:rPr>
+          <w:rFonts w:cstheme="minorHAnsi"/>
+          <w:b/>
+          <w:bCs/>
+          <w:szCs w:val="22"/>
+        </w:rPr>
+        <w:t>Document Databases:</w:t>
+      </w:r>
+      <w:r>
+        <w:rPr>
+          <w:rFonts w:cstheme="minorHAnsi"/>
+          <w:b/>
+          <w:bCs/>
+          <w:sz w:val="28"/>
+          <w:szCs w:val="28"/>
+        </w:rPr>
+        <w:t xml:space="preserve"> </w:t>
+      </w:r>
+      <w:r>
+        <w:rPr>
+          <w:rFonts w:cstheme="minorHAnsi"/>
+          <w:szCs w:val="22"/>
+        </w:rPr>
+        <w:t>Store data as collections and documents</w:t>
+      </w:r>
+      <w:r>
+        <w:rPr>
+          <w:rFonts w:cstheme="minorHAnsi"/>
+          <w:szCs w:val="22"/>
+        </w:rPr>
+        <w:t xml:space="preserve"> like JSON file</w:t>
+      </w:r>
+      <w:r>
+        <w:rPr>
+          <w:rFonts w:cstheme="minorHAnsi"/>
+          <w:szCs w:val="22"/>
+        </w:rPr>
+        <w:t>. Great for dynamic data that evolves over time without need</w:t>
+      </w:r>
+      <w:r>
+        <w:rPr>
+          <w:rFonts w:cstheme="minorHAnsi"/>
+          <w:szCs w:val="22"/>
+        </w:rPr>
+        <w:t>ing complex joins</w:t>
+      </w:r>
+      <w:r>
+        <w:rPr>
+          <w:rFonts w:cstheme="minorHAnsi"/>
+          <w:szCs w:val="22"/>
+        </w:rPr>
+        <w:t>.</w:t>
+      </w:r>
+    </w:p>
+    <w:p>
+      <w:pPr>
+        <w:pStyle w:val="ListParagraph"/>
+        <w:numPr>
+          <w:ilvl w:val="0"/>
+          <w:numId w:val="18"/>
+        </w:numPr>
+        <w:rPr>
+          <w:rFonts w:cstheme="minorHAnsi"/>
+          <w:szCs w:val="22"/>
+        </w:rPr>
+      </w:pPr>
+      <w:r>
+        <w:rPr>
+          <w:rFonts w:cstheme="minorHAnsi"/>
+          <w:b/>
+          <w:bCs/>
+          <w:szCs w:val="22"/>
+        </w:rPr>
+        <w:t>Column-Wide Stores:</w:t>
+      </w:r>
+      <w:r>
+        <w:rPr>
+          <w:rFonts w:cstheme="minorHAnsi"/>
+          <w:szCs w:val="22"/>
+        </w:rPr>
+        <w:t xml:space="preserve"> A middle ground between SQL and NoSQL. They handle massive amounts of streaming/event data (e.g., </w:t>
+      </w:r>
+      <w:proofErr w:type="spellStart"/>
+      <w:r>
+        <w:rPr>
+          <w:rFonts w:cstheme="minorHAnsi"/>
+          <w:szCs w:val="22"/>
+        </w:rPr>
+        <w:t>IoT</w:t>
+      </w:r>
+      <w:proofErr w:type="spellEnd"/>
+      <w:r>
+        <w:rPr>
+          <w:rFonts w:cstheme="minorHAnsi"/>
+          <w:szCs w:val="22"/>
+        </w:rPr>
+        <w:t xml:space="preserve"> sensors, user interactions) and supp</w:t>
+      </w:r>
+      <w:r>
+        <w:rPr>
+          <w:rFonts w:cstheme="minorHAnsi"/>
+          <w:szCs w:val="22"/>
+        </w:rPr>
+        <w:t>ort heavy writes</w:t>
+      </w:r>
+      <w:r>
+        <w:rPr>
+          <w:rFonts w:cstheme="minorHAnsi"/>
+          <w:szCs w:val="22"/>
+        </w:rPr>
+        <w:t>.</w:t>
+      </w:r>
+      <w:r>
+        <w:rPr>
+          <w:rFonts w:cstheme="minorHAnsi"/>
+          <w:szCs w:val="22"/>
+        </w:rPr>
+        <w:t xml:space="preserve"> </w:t>
+      </w:r>
+      <w:r>
+        <w:rPr>
+          <w:rFonts w:cstheme="minorHAnsi"/>
+          <w:color w:val="0F0F0F"/>
+          <w:sz w:val="21"/>
+          <w:szCs w:val="21"/>
+          <w:highlight w:val="yellow"/>
+          <w:shd w:val="clear" w:color="auto" w:fill="FFFFFF"/>
+        </w:rPr>
+        <w:t>Unlike traditional databases that store data row by row, these databases store data </w:t>
+      </w:r>
+      <w:r>
+        <w:rPr>
+          <w:rStyle w:val="Strong"/>
+          <w:rFonts w:cstheme="minorHAnsi"/>
+          <w:color w:val="0F0F0F"/>
+          <w:sz w:val="21"/>
+          <w:szCs w:val="21"/>
+          <w:highlight w:val="yellow"/>
+          <w:bdr w:val="none" w:sz="0" w:space="0" w:color="auto" w:frame="1"/>
+          <w:shd w:val="clear" w:color="auto" w:fill="FFFFFF"/>
+        </w:rPr>
+        <w:t>column by column</w:t>
+      </w:r>
+    </w:p>
+    <w:p>
+      <w:pPr>
+        <w:ind w:left="360"/>
+        <w:rPr>
+          <w:rFonts w:cstheme="minorHAnsi"/>
+          <w:b/>
+          <w:bCs/>
+          <w:sz w:val="28"/>
+          <w:szCs w:val="28"/>
+        </w:rPr>
+      </w:pPr>
+      <w:r>
+        <w:rPr>
+          <w:rFonts w:cstheme="minorHAnsi"/>
+          <w:b/>
+          <w:bCs/>
+          <w:sz w:val="28"/>
+          <w:szCs w:val="28"/>
+        </w:rPr>
+        <w:t>3. Search Databases</w:t>
+      </w:r>
+    </w:p>
+    <w:p>
+      <w:pPr>
+        <w:ind w:left="360"/>
+        <w:rPr>
+          <w:rFonts w:cstheme="minorHAnsi"/>
+          <w:szCs w:val="22"/>
+        </w:rPr>
+      </w:pPr>
+      <w:proofErr w:type="gramStart"/>
+      <w:r>
+        <w:rPr>
+          <w:rFonts w:cstheme="minorHAnsi"/>
+          <w:szCs w:val="22"/>
+        </w:rPr>
+        <w:t>Optimized for full-text search queries.</w:t>
+      </w:r>
+      <w:proofErr w:type="gramEnd"/>
+      <w:r>
+        <w:rPr>
+          <w:rFonts w:cstheme="minorHAnsi"/>
+          <w:szCs w:val="22"/>
+        </w:rPr>
+        <w:t xml:space="preserve"> They use advanced indexing to return search results quickly, </w:t>
+      </w:r>
+      <w:r>
+        <w:rPr>
+          <w:rFonts w:cstheme="minorHAnsi"/>
+          <w:szCs w:val="22"/>
+          <w:highlight w:val="yellow"/>
+        </w:rPr>
+        <w:t>often acting as a secondary data store for an application</w:t>
+      </w:r>
+      <w:r>
+        <w:rPr>
+          <w:rFonts w:cstheme="minorHAnsi"/>
+          <w:szCs w:val="22"/>
+          <w:highlight w:val="yellow"/>
+        </w:rPr>
+        <w:t xml:space="preserve"> (not primary)</w:t>
+      </w:r>
+      <w:r>
+        <w:rPr>
+          <w:rFonts w:cstheme="minorHAnsi"/>
+          <w:szCs w:val="22"/>
+        </w:rPr>
+        <w:t xml:space="preserve"> (e</w:t>
+      </w:r>
+      <w:r>
+        <w:rPr>
+          <w:rFonts w:cstheme="minorHAnsi"/>
+          <w:szCs w:val="22"/>
+        </w:rPr>
+        <w:t xml:space="preserve">.g., </w:t>
+      </w:r>
+      <w:proofErr w:type="spellStart"/>
+      <w:r>
+        <w:rPr>
+          <w:rFonts w:cstheme="minorHAnsi"/>
+          <w:szCs w:val="22"/>
+        </w:rPr>
+        <w:t>Elasticsearch</w:t>
+      </w:r>
+      <w:proofErr w:type="spellEnd"/>
+      <w:r>
+        <w:rPr>
+          <w:rFonts w:cstheme="minorHAnsi"/>
+          <w:szCs w:val="22"/>
+        </w:rPr>
+        <w:t>)</w:t>
+      </w:r>
+      <w:r>
+        <w:rPr>
+          <w:rFonts w:cstheme="minorHAnsi"/>
+          <w:szCs w:val="22"/>
+        </w:rPr>
+        <w:t>.</w:t>
+      </w:r>
+    </w:p>
+    <w:p>
+      <w:pPr>
+        <w:rPr>
+          <w:rFonts w:cstheme="minorHAnsi"/>
+          <w:b/>
+          <w:bCs/>
+          <w:sz w:val="28"/>
+          <w:szCs w:val="28"/>
+        </w:rPr>
+      </w:pPr>
+      <w:r>
+        <w:rPr>
+          <w:rFonts w:cstheme="minorHAnsi"/>
+          <w:b/>
+          <w:bCs/>
+          <w:sz w:val="28"/>
+          <w:szCs w:val="28"/>
+        </w:rPr>
+        <w:t>Note</w:t>
+      </w:r>
+      <w:proofErr w:type="gramStart"/>
+      <w:r>
+        <w:rPr>
+          <w:rFonts w:cstheme="minorHAnsi"/>
+          <w:b/>
+          <w:bCs/>
+          <w:sz w:val="28"/>
+          <w:szCs w:val="28"/>
+        </w:rPr>
+        <w:t>:-</w:t>
+      </w:r>
+      <w:proofErr w:type="gramEnd"/>
+      <w:r>
+        <w:rPr>
+          <w:rFonts w:cstheme="minorHAnsi"/>
+          <w:b/>
+          <w:bCs/>
+          <w:sz w:val="28"/>
+          <w:szCs w:val="28"/>
+        </w:rPr>
+        <w:t xml:space="preserve"> </w:t>
+      </w:r>
+      <w:r>
+        <w:rPr>
+          <w:rFonts w:cstheme="minorHAnsi"/>
+          <w:b/>
+          <w:bCs/>
+          <w:szCs w:val="22"/>
+        </w:rPr>
+        <w:t>There is no "one-size-fits-all" database. Choosing the right one depends on your specific schema requirements, r</w:t>
+      </w:r>
+      <w:bookmarkStart w:id="0" w:name="_GoBack"/>
+      <w:bookmarkEnd w:id="0"/>
+      <w:r>
+        <w:rPr>
+          <w:rFonts w:cstheme="minorHAnsi"/>
+          <w:b/>
+          <w:bCs/>
+          <w:szCs w:val="22"/>
+        </w:rPr>
+        <w:t>ead/write patterns, and scalability needs</w:t>
+      </w:r>
+    </w:p>
+    <w:p>
+      <w:pPr>
+        <w:ind w:left="360"/>
+        <w:rPr>
+          <w:rFonts w:cstheme="minorHAnsi"/>
+          <w:sz w:val="28"/>
+          <w:szCs w:val="28"/>
+        </w:rPr>
+      </w:pPr>
     </w:p>
     <w:sectPr>
       <w:pgSz w:w="11906" w:h="16838"/>
@@ -3514,6 +5655,119 @@
     </w:lvl>
   </w:abstractNum>
   <w:abstractNum w:abstractNumId="6">
+    <w:nsid w:val="2FAD3C22"/>
+    <w:multiLevelType w:val="hybridMultilevel"/>
+    <w:tmpl w:val="2E0CEADA"/>
+    <w:lvl w:ilvl="0" w:tplc="40090001">
+      <w:start w:val="1"/>
+      <w:numFmt w:val="bullet"/>
+      <w:lvlText w:val=""/>
+      <w:lvlJc w:val="left"/>
+      <w:pPr>
+        <w:ind w:left="720" w:hanging="360"/>
+      </w:pPr>
+      <w:rPr>
+        <w:rFonts w:ascii="Symbol" w:hAnsi="Symbol" w:hint="default"/>
+      </w:rPr>
+    </w:lvl>
+    <w:lvl w:ilvl="1" w:tplc="40090003" w:tentative="1">
+      <w:start w:val="1"/>
+      <w:numFmt w:val="bullet"/>
+      <w:lvlText w:val="o"/>
+      <w:lvlJc w:val="left"/>
+      <w:pPr>
+        <w:ind w:left="1440" w:hanging="360"/>
+      </w:pPr>
+      <w:rPr>
+        <w:rFonts w:ascii="Courier New" w:hAnsi="Courier New" w:cs="Courier New" w:hint="default"/>
+      </w:rPr>
+    </w:lvl>
+    <w:lvl w:ilvl="2" w:tplc="40090005" w:tentative="1">
+      <w:start w:val="1"/>
+      <w:numFmt w:val="bullet"/>
+      <w:lvlText w:val=""/>
+      <w:lvlJc w:val="left"/>
+      <w:pPr>
+        <w:ind w:left="2160" w:hanging="360"/>
+      </w:pPr>
+      <w:rPr>
+        <w:rFonts w:ascii="Wingdings" w:hAnsi="Wingdings" w:hint="default"/>
+      </w:rPr>
+    </w:lvl>
+    <w:lvl w:ilvl="3" w:tplc="40090001" w:tentative="1">
+      <w:start w:val="1"/>
+      <w:numFmt w:val="bullet"/>
+      <w:lvlText w:val=""/>
+      <w:lvlJc w:val="left"/>
+      <w:pPr>
+        <w:ind w:left="2880" w:hanging="360"/>
+      </w:pPr>
+      <w:rPr>
+        <w:rFonts w:ascii="Symbol" w:hAnsi="Symbol" w:hint="default"/>
+      </w:rPr>
+    </w:lvl>
+    <w:lvl w:ilvl="4" w:tplc="40090003" w:tentative="1">
+      <w:start w:val="1"/>
+      <w:numFmt w:val="bullet"/>
+      <w:lvlText w:val="o"/>
+      <w:lvlJc w:val="left"/>
+      <w:pPr>
+        <w:ind w:left="3600" w:hanging="360"/>
+      </w:pPr>
+      <w:rPr>
+        <w:rFonts w:ascii="Courier New" w:hAnsi="Courier New" w:cs="Courier New" w:hint="default"/>
+      </w:rPr>
+    </w:lvl>
+    <w:lvl w:ilvl="5" w:tplc="40090005" w:tentative="1">
+      <w:start w:val="1"/>
+      <w:numFmt w:val="bullet"/>
+      <w:lvlText w:val=""/>
+      <w:lvlJc w:val="left"/>
+      <w:pPr>
+        <w:ind w:left="4320" w:hanging="360"/>
+      </w:pPr>
+      <w:rPr>
+        <w:rFonts w:ascii="Wingdings" w:hAnsi="Wingdings" w:hint="default"/>
+      </w:rPr>
+    </w:lvl>
+    <w:lvl w:ilvl="6" w:tplc="40090001" w:tentative="1">
+      <w:start w:val="1"/>
+      <w:numFmt w:val="bullet"/>
+      <w:lvlText w:val=""/>
+      <w:lvlJc w:val="left"/>
+      <w:pPr>
+        <w:ind w:left="5040" w:hanging="360"/>
+      </w:pPr>
+      <w:rPr>
+        <w:rFonts w:ascii="Symbol" w:hAnsi="Symbol" w:hint="default"/>
+      </w:rPr>
+    </w:lvl>
+    <w:lvl w:ilvl="7" w:tplc="40090003" w:tentative="1">
+      <w:start w:val="1"/>
+      <w:numFmt w:val="bullet"/>
+      <w:lvlText w:val="o"/>
+      <w:lvlJc w:val="left"/>
+      <w:pPr>
+        <w:ind w:left="5760" w:hanging="360"/>
+      </w:pPr>
+      <w:rPr>
+        <w:rFonts w:ascii="Courier New" w:hAnsi="Courier New" w:cs="Courier New" w:hint="default"/>
+      </w:rPr>
+    </w:lvl>
+    <w:lvl w:ilvl="8" w:tplc="40090005" w:tentative="1">
+      <w:start w:val="1"/>
+      <w:numFmt w:val="bullet"/>
+      <w:lvlText w:val=""/>
+      <w:lvlJc w:val="left"/>
+      <w:pPr>
+        <w:ind w:left="6480" w:hanging="360"/>
+      </w:pPr>
+      <w:rPr>
+        <w:rFonts w:ascii="Wingdings" w:hAnsi="Wingdings" w:hint="default"/>
+      </w:rPr>
+    </w:lvl>
+  </w:abstractNum>
+  <w:abstractNum w:abstractNumId="7">
     <w:nsid w:val="48831EEC"/>
     <w:multiLevelType w:val="hybridMultilevel"/>
     <w:tmpl w:val="FE3E5AE6"/>
@@ -3626,7 +5880,206 @@
       </w:rPr>
     </w:lvl>
   </w:abstractNum>
-  <w:abstractNum w:abstractNumId="7">
+  <w:abstractNum w:abstractNumId="8">
+    <w:nsid w:val="4D544A4C"/>
+    <w:multiLevelType w:val="hybridMultilevel"/>
+    <w:tmpl w:val="7C6CBBDE"/>
+    <w:lvl w:ilvl="0" w:tplc="4009000F">
+      <w:start w:val="1"/>
+      <w:numFmt w:val="decimal"/>
+      <w:lvlText w:val="%1."/>
+      <w:lvlJc w:val="left"/>
+      <w:pPr>
+        <w:ind w:left="720" w:hanging="360"/>
+      </w:pPr>
+    </w:lvl>
+    <w:lvl w:ilvl="1" w:tplc="40090019" w:tentative="1">
+      <w:start w:val="1"/>
+      <w:numFmt w:val="lowerLetter"/>
+      <w:lvlText w:val="%2."/>
+      <w:lvlJc w:val="left"/>
+      <w:pPr>
+        <w:ind w:left="1440" w:hanging="360"/>
+      </w:pPr>
+    </w:lvl>
+    <w:lvl w:ilvl="2" w:tplc="4009001B" w:tentative="1">
+      <w:start w:val="1"/>
+      <w:numFmt w:val="lowerRoman"/>
+      <w:lvlText w:val="%3."/>
+      <w:lvlJc w:val="right"/>
+      <w:pPr>
+        <w:ind w:left="2160" w:hanging="180"/>
+      </w:pPr>
+    </w:lvl>
+    <w:lvl w:ilvl="3" w:tplc="4009000F" w:tentative="1">
+      <w:start w:val="1"/>
+      <w:numFmt w:val="decimal"/>
+      <w:lvlText w:val="%4."/>
+      <w:lvlJc w:val="left"/>
+      <w:pPr>
+        <w:ind w:left="2880" w:hanging="360"/>
+      </w:pPr>
+    </w:lvl>
+    <w:lvl w:ilvl="4" w:tplc="40090019" w:tentative="1">
+      <w:start w:val="1"/>
+      <w:numFmt w:val="lowerLetter"/>
+      <w:lvlText w:val="%5."/>
+      <w:lvlJc w:val="left"/>
+      <w:pPr>
+        <w:ind w:left="3600" w:hanging="360"/>
+      </w:pPr>
+    </w:lvl>
+    <w:lvl w:ilvl="5" w:tplc="4009001B" w:tentative="1">
+      <w:start w:val="1"/>
+      <w:numFmt w:val="lowerRoman"/>
+      <w:lvlText w:val="%6."/>
+      <w:lvlJc w:val="right"/>
+      <w:pPr>
+        <w:ind w:left="4320" w:hanging="180"/>
+      </w:pPr>
+    </w:lvl>
+    <w:lvl w:ilvl="6" w:tplc="4009000F" w:tentative="1">
+      <w:start w:val="1"/>
+      <w:numFmt w:val="decimal"/>
+      <w:lvlText w:val="%7."/>
+      <w:lvlJc w:val="left"/>
+      <w:pPr>
+        <w:ind w:left="5040" w:hanging="360"/>
+      </w:pPr>
+    </w:lvl>
+    <w:lvl w:ilvl="7" w:tplc="40090019" w:tentative="1">
+      <w:start w:val="1"/>
+      <w:numFmt w:val="lowerLetter"/>
+      <w:lvlText w:val="%8."/>
+      <w:lvlJc w:val="left"/>
+      <w:pPr>
+        <w:ind w:left="5760" w:hanging="360"/>
+      </w:pPr>
+    </w:lvl>
+    <w:lvl w:ilvl="8" w:tplc="4009001B" w:tentative="1">
+      <w:start w:val="1"/>
+      <w:numFmt w:val="lowerRoman"/>
+      <w:lvlText w:val="%9."/>
+      <w:lvlJc w:val="right"/>
+      <w:pPr>
+        <w:ind w:left="6480" w:hanging="180"/>
+      </w:pPr>
+    </w:lvl>
+  </w:abstractNum>
+  <w:abstractNum w:abstractNumId="9">
+    <w:nsid w:val="528E4AA5"/>
+    <w:multiLevelType w:val="hybridMultilevel"/>
+    <w:tmpl w:val="172C5AD4"/>
+    <w:lvl w:ilvl="0" w:tplc="40090001">
+      <w:start w:val="1"/>
+      <w:numFmt w:val="bullet"/>
+      <w:lvlText w:val=""/>
+      <w:lvlJc w:val="left"/>
+      <w:pPr>
+        <w:ind w:left="720" w:hanging="360"/>
+      </w:pPr>
+      <w:rPr>
+        <w:rFonts w:ascii="Symbol" w:hAnsi="Symbol" w:hint="default"/>
+      </w:rPr>
+    </w:lvl>
+    <w:lvl w:ilvl="1" w:tplc="40090003" w:tentative="1">
+      <w:start w:val="1"/>
+      <w:numFmt w:val="bullet"/>
+      <w:lvlText w:val="o"/>
+      <w:lvlJc w:val="left"/>
+      <w:pPr>
+        <w:ind w:left="1440" w:hanging="360"/>
+      </w:pPr>
+      <w:rPr>
+        <w:rFonts w:ascii="Courier New" w:hAnsi="Courier New" w:cs="Courier New" w:hint="default"/>
+      </w:rPr>
+    </w:lvl>
+    <w:lvl w:ilvl="2" w:tplc="40090005" w:tentative="1">
+      <w:start w:val="1"/>
+      <w:numFmt w:val="bullet"/>
+      <w:lvlText w:val=""/>
+      <w:lvlJc w:val="left"/>
+      <w:pPr>
+        <w:ind w:left="2160" w:hanging="360"/>
+      </w:pPr>
+      <w:rPr>
+        <w:rFonts w:ascii="Wingdings" w:hAnsi="Wingdings" w:hint="default"/>
+      </w:rPr>
+    </w:lvl>
+    <w:lvl w:ilvl="3" w:tplc="40090001" w:tentative="1">
+      <w:start w:val="1"/>
+      <w:numFmt w:val="bullet"/>
+      <w:lvlText w:val=""/>
+      <w:lvlJc w:val="left"/>
+      <w:pPr>
+        <w:ind w:left="2880" w:hanging="360"/>
+      </w:pPr>
+      <w:rPr>
+        <w:rFonts w:ascii="Symbol" w:hAnsi="Symbol" w:hint="default"/>
+      </w:rPr>
+    </w:lvl>
+    <w:lvl w:ilvl="4" w:tplc="40090003" w:tentative="1">
+      <w:start w:val="1"/>
+      <w:numFmt w:val="bullet"/>
+      <w:lvlText w:val="o"/>
+      <w:lvlJc w:val="left"/>
+      <w:pPr>
+        <w:ind w:left="3600" w:hanging="360"/>
+      </w:pPr>
+      <w:rPr>
+        <w:rFonts w:ascii="Courier New" w:hAnsi="Courier New" w:cs="Courier New" w:hint="default"/>
+      </w:rPr>
+    </w:lvl>
+    <w:lvl w:ilvl="5" w:tplc="40090005" w:tentative="1">
+      <w:start w:val="1"/>
+      <w:numFmt w:val="bullet"/>
+      <w:lvlText w:val=""/>
+      <w:lvlJc w:val="left"/>
+      <w:pPr>
+        <w:ind w:left="4320" w:hanging="360"/>
+      </w:pPr>
+      <w:rPr>
+        <w:rFonts w:ascii="Wingdings" w:hAnsi="Wingdings" w:hint="default"/>
+      </w:rPr>
+    </w:lvl>
+    <w:lvl w:ilvl="6" w:tplc="40090001" w:tentative="1">
+      <w:start w:val="1"/>
+      <w:numFmt w:val="bullet"/>
+      <w:lvlText w:val=""/>
+      <w:lvlJc w:val="left"/>
+      <w:pPr>
+        <w:ind w:left="5040" w:hanging="360"/>
+      </w:pPr>
+      <w:rPr>
+        <w:rFonts w:ascii="Symbol" w:hAnsi="Symbol" w:hint="default"/>
+      </w:rPr>
+    </w:lvl>
+    <w:lvl w:ilvl="7" w:tplc="40090003" w:tentative="1">
+      <w:start w:val="1"/>
+      <w:numFmt w:val="bullet"/>
+      <w:lvlText w:val="o"/>
+      <w:lvlJc w:val="left"/>
+      <w:pPr>
+        <w:ind w:left="5760" w:hanging="360"/>
+      </w:pPr>
+      <w:rPr>
+        <w:rFonts w:ascii="Courier New" w:hAnsi="Courier New" w:cs="Courier New" w:hint="default"/>
+      </w:rPr>
+    </w:lvl>
+    <w:lvl w:ilvl="8" w:tplc="40090005" w:tentative="1">
+      <w:start w:val="1"/>
+      <w:numFmt w:val="bullet"/>
+      <w:lvlText w:val=""/>
+      <w:lvlJc w:val="left"/>
+      <w:pPr>
+        <w:ind w:left="6480" w:hanging="360"/>
+      </w:pPr>
+      <w:rPr>
+        <w:rFonts w:ascii="Wingdings" w:hAnsi="Wingdings" w:hint="default"/>
+      </w:rPr>
+    </w:lvl>
+  </w:abstractNum>
+  <w:abstractNum w:abstractNumId="10">
     <w:nsid w:val="5C5867B4"/>
     <w:multiLevelType w:val="hybridMultilevel"/>
     <w:tmpl w:val="5BC61310"/>
@@ -3739,7 +6192,7 @@
       </w:rPr>
     </w:lvl>
   </w:abstractNum>
-  <w:abstractNum w:abstractNumId="8">
+  <w:abstractNum w:abstractNumId="11">
     <w:nsid w:val="5DD75A37"/>
     <w:multiLevelType w:val="hybridMultilevel"/>
     <w:tmpl w:val="4C28F7A0"/>
@@ -3852,7 +6305,7 @@
       </w:rPr>
     </w:lvl>
   </w:abstractNum>
-  <w:abstractNum w:abstractNumId="9">
+  <w:abstractNum w:abstractNumId="12">
     <w:nsid w:val="5F091A61"/>
     <w:multiLevelType w:val="hybridMultilevel"/>
     <w:tmpl w:val="444C9C0E"/>
@@ -3965,7 +6418,93 @@
       </w:rPr>
     </w:lvl>
   </w:abstractNum>
-  <w:abstractNum w:abstractNumId="10">
+  <w:abstractNum w:abstractNumId="13">
+    <w:nsid w:val="68027475"/>
+    <w:multiLevelType w:val="hybridMultilevel"/>
+    <w:tmpl w:val="7C6CBBDE"/>
+    <w:lvl w:ilvl="0" w:tplc="4009000F">
+      <w:start w:val="1"/>
+      <w:numFmt w:val="decimal"/>
+      <w:lvlText w:val="%1."/>
+      <w:lvlJc w:val="left"/>
+      <w:pPr>
+        <w:ind w:left="720" w:hanging="360"/>
+      </w:pPr>
+    </w:lvl>
+    <w:lvl w:ilvl="1" w:tplc="40090019" w:tentative="1">
+      <w:start w:val="1"/>
+      <w:numFmt w:val="lowerLetter"/>
+      <w:lvlText w:val="%2."/>
+      <w:lvlJc w:val="left"/>
+      <w:pPr>
+        <w:ind w:left="1440" w:hanging="360"/>
+      </w:pPr>
+    </w:lvl>
+    <w:lvl w:ilvl="2" w:tplc="4009001B" w:tentative="1">
+      <w:start w:val="1"/>
+      <w:numFmt w:val="lowerRoman"/>
+      <w:lvlText w:val="%3."/>
+      <w:lvlJc w:val="right"/>
+      <w:pPr>
+        <w:ind w:left="2160" w:hanging="180"/>
+      </w:pPr>
+    </w:lvl>
+    <w:lvl w:ilvl="3" w:tplc="4009000F" w:tentative="1">
+      <w:start w:val="1"/>
+      <w:numFmt w:val="decimal"/>
+      <w:lvlText w:val="%4."/>
+      <w:lvlJc w:val="left"/>
+      <w:pPr>
+        <w:ind w:left="2880" w:hanging="360"/>
+      </w:pPr>
+    </w:lvl>
+    <w:lvl w:ilvl="4" w:tplc="40090019" w:tentative="1">
+      <w:start w:val="1"/>
+      <w:numFmt w:val="lowerLetter"/>
+      <w:lvlText w:val="%5."/>
+      <w:lvlJc w:val="left"/>
+      <w:pPr>
+        <w:ind w:left="3600" w:hanging="360"/>
+      </w:pPr>
+    </w:lvl>
+    <w:lvl w:ilvl="5" w:tplc="4009001B" w:tentative="1">
+      <w:start w:val="1"/>
+      <w:numFmt w:val="lowerRoman"/>
+      <w:lvlText w:val="%6."/>
+      <w:lvlJc w:val="right"/>
+      <w:pPr>
+        <w:ind w:left="4320" w:hanging="180"/>
+      </w:pPr>
+    </w:lvl>
+    <w:lvl w:ilvl="6" w:tplc="4009000F" w:tentative="1">
+      <w:start w:val="1"/>
+      <w:numFmt w:val="decimal"/>
+      <w:lvlText w:val="%7."/>
+      <w:lvlJc w:val="left"/>
+      <w:pPr>
+        <w:ind w:left="5040" w:hanging="360"/>
+      </w:pPr>
+    </w:lvl>
+    <w:lvl w:ilvl="7" w:tplc="40090019" w:tentative="1">
+      <w:start w:val="1"/>
+      <w:numFmt w:val="lowerLetter"/>
+      <w:lvlText w:val="%8."/>
+      <w:lvlJc w:val="left"/>
+      <w:pPr>
+        <w:ind w:left="5760" w:hanging="360"/>
+      </w:pPr>
+    </w:lvl>
+    <w:lvl w:ilvl="8" w:tplc="4009001B" w:tentative="1">
+      <w:start w:val="1"/>
+      <w:numFmt w:val="lowerRoman"/>
+      <w:lvlText w:val="%9."/>
+      <w:lvlJc w:val="right"/>
+      <w:pPr>
+        <w:ind w:left="6480" w:hanging="180"/>
+      </w:pPr>
+    </w:lvl>
+  </w:abstractNum>
+  <w:abstractNum w:abstractNumId="14">
     <w:nsid w:val="68FC6BAF"/>
     <w:multiLevelType w:val="hybridMultilevel"/>
     <w:tmpl w:val="D9BA3446"/>
@@ -4051,7 +6590,7 @@
       </w:pPr>
     </w:lvl>
   </w:abstractNum>
-  <w:abstractNum w:abstractNumId="11">
+  <w:abstractNum w:abstractNumId="15">
     <w:nsid w:val="69245EAA"/>
     <w:multiLevelType w:val="hybridMultilevel"/>
     <w:tmpl w:val="DA9ACB24"/>
@@ -4164,7 +6703,120 @@
       </w:rPr>
     </w:lvl>
   </w:abstractNum>
-  <w:abstractNum w:abstractNumId="12">
+  <w:abstractNum w:abstractNumId="16">
+    <w:nsid w:val="6D8A2669"/>
+    <w:multiLevelType w:val="hybridMultilevel"/>
+    <w:tmpl w:val="61902C76"/>
+    <w:lvl w:ilvl="0" w:tplc="40090001">
+      <w:start w:val="1"/>
+      <w:numFmt w:val="bullet"/>
+      <w:lvlText w:val=""/>
+      <w:lvlJc w:val="left"/>
+      <w:pPr>
+        <w:ind w:left="720" w:hanging="360"/>
+      </w:pPr>
+      <w:rPr>
+        <w:rFonts w:ascii="Symbol" w:hAnsi="Symbol" w:hint="default"/>
+      </w:rPr>
+    </w:lvl>
+    <w:lvl w:ilvl="1" w:tplc="40090003" w:tentative="1">
+      <w:start w:val="1"/>
+      <w:numFmt w:val="bullet"/>
+      <w:lvlText w:val="o"/>
+      <w:lvlJc w:val="left"/>
+      <w:pPr>
+        <w:ind w:left="1440" w:hanging="360"/>
+      </w:pPr>
+      <w:rPr>
+        <w:rFonts w:ascii="Courier New" w:hAnsi="Courier New" w:cs="Courier New" w:hint="default"/>
+      </w:rPr>
+    </w:lvl>
+    <w:lvl w:ilvl="2" w:tplc="40090005" w:tentative="1">
+      <w:start w:val="1"/>
+      <w:numFmt w:val="bullet"/>
+      <w:lvlText w:val=""/>
+      <w:lvlJc w:val="left"/>
+      <w:pPr>
+        <w:ind w:left="2160" w:hanging="360"/>
+      </w:pPr>
+      <w:rPr>
+        <w:rFonts w:ascii="Wingdings" w:hAnsi="Wingdings" w:hint="default"/>
+      </w:rPr>
+    </w:lvl>
+    <w:lvl w:ilvl="3" w:tplc="40090001" w:tentative="1">
+      <w:start w:val="1"/>
+      <w:numFmt w:val="bullet"/>
+      <w:lvlText w:val=""/>
+      <w:lvlJc w:val="left"/>
+      <w:pPr>
+        <w:ind w:left="2880" w:hanging="360"/>
+      </w:pPr>
+      <w:rPr>
+        <w:rFonts w:ascii="Symbol" w:hAnsi="Symbol" w:hint="default"/>
+      </w:rPr>
+    </w:lvl>
+    <w:lvl w:ilvl="4" w:tplc="40090003" w:tentative="1">
+      <w:start w:val="1"/>
+      <w:numFmt w:val="bullet"/>
+      <w:lvlText w:val="o"/>
+      <w:lvlJc w:val="left"/>
+      <w:pPr>
+        <w:ind w:left="3600" w:hanging="360"/>
+      </w:pPr>
+      <w:rPr>
+        <w:rFonts w:ascii="Courier New" w:hAnsi="Courier New" w:cs="Courier New" w:hint="default"/>
+      </w:rPr>
+    </w:lvl>
+    <w:lvl w:ilvl="5" w:tplc="40090005" w:tentative="1">
+      <w:start w:val="1"/>
+      <w:numFmt w:val="bullet"/>
+      <w:lvlText w:val=""/>
+      <w:lvlJc w:val="left"/>
+      <w:pPr>
+        <w:ind w:left="4320" w:hanging="360"/>
+      </w:pPr>
+      <w:rPr>
+        <w:rFonts w:ascii="Wingdings" w:hAnsi="Wingdings" w:hint="default"/>
+      </w:rPr>
+    </w:lvl>
+    <w:lvl w:ilvl="6" w:tplc="40090001" w:tentative="1">
+      <w:start w:val="1"/>
+      <w:numFmt w:val="bullet"/>
+      <w:lvlText w:val=""/>
+      <w:lvlJc w:val="left"/>
+      <w:pPr>
+        <w:ind w:left="5040" w:hanging="360"/>
+      </w:pPr>
+      <w:rPr>
+        <w:rFonts w:ascii="Symbol" w:hAnsi="Symbol" w:hint="default"/>
+      </w:rPr>
+    </w:lvl>
+    <w:lvl w:ilvl="7" w:tplc="40090003" w:tentative="1">
+      <w:start w:val="1"/>
+      <w:numFmt w:val="bullet"/>
+      <w:lvlText w:val="o"/>
+      <w:lvlJc w:val="left"/>
+      <w:pPr>
+        <w:ind w:left="5760" w:hanging="360"/>
+      </w:pPr>
+      <w:rPr>
+        <w:rFonts w:ascii="Courier New" w:hAnsi="Courier New" w:cs="Courier New" w:hint="default"/>
+      </w:rPr>
+    </w:lvl>
+    <w:lvl w:ilvl="8" w:tplc="40090005" w:tentative="1">
+      <w:start w:val="1"/>
+      <w:numFmt w:val="bullet"/>
+      <w:lvlText w:val=""/>
+      <w:lvlJc w:val="left"/>
+      <w:pPr>
+        <w:ind w:left="6480" w:hanging="360"/>
+      </w:pPr>
+      <w:rPr>
+        <w:rFonts w:ascii="Wingdings" w:hAnsi="Wingdings" w:hint="default"/>
+      </w:rPr>
+    </w:lvl>
+  </w:abstractNum>
+  <w:abstractNum w:abstractNumId="17">
     <w:nsid w:val="76723C22"/>
     <w:multiLevelType w:val="hybridMultilevel"/>
     <w:tmpl w:val="3F12097C"/>
@@ -4281,31 +6933,31 @@
     <w:abstractNumId w:val="3"/>
   </w:num>
   <w:num w:numId="2">
-    <w:abstractNumId w:val="7"/>
+    <w:abstractNumId w:val="10"/>
   </w:num>
   <w:num w:numId="3">
     <w:abstractNumId w:val="1"/>
   </w:num>
   <w:num w:numId="4">
-    <w:abstractNumId w:val="8"/>
+    <w:abstractNumId w:val="11"/>
   </w:num>
   <w:num w:numId="5">
     <w:abstractNumId w:val="4"/>
   </w:num>
   <w:num w:numId="6">
-    <w:abstractNumId w:val="6"/>
+    <w:abstractNumId w:val="7"/>
   </w:num>
   <w:num w:numId="7">
     <w:abstractNumId w:val="5"/>
   </w:num>
   <w:num w:numId="8">
+    <w:abstractNumId w:val="17"/>
+  </w:num>
+  <w:num w:numId="9">
     <w:abstractNumId w:val="12"/>
   </w:num>
-  <w:num w:numId="9">
-    <w:abstractNumId w:val="9"/>
-  </w:num>
   <w:num w:numId="10">
-    <w:abstractNumId w:val="10"/>
+    <w:abstractNumId w:val="14"/>
   </w:num>
   <w:num w:numId="11">
     <w:abstractNumId w:val="0"/>
@@ -4314,7 +6966,22 @@
     <w:abstractNumId w:val="2"/>
   </w:num>
   <w:num w:numId="13">
-    <w:abstractNumId w:val="11"/>
+    <w:abstractNumId w:val="15"/>
+  </w:num>
+  <w:num w:numId="14">
+    <w:abstractNumId w:val="13"/>
+  </w:num>
+  <w:num w:numId="15">
+    <w:abstractNumId w:val="9"/>
+  </w:num>
+  <w:num w:numId="16">
+    <w:abstractNumId w:val="16"/>
+  </w:num>
+  <w:num w:numId="17">
+    <w:abstractNumId w:val="6"/>
+  </w:num>
+  <w:num w:numId="18">
+    <w:abstractNumId w:val="8"/>
   </w:num>
 </w:numbering>
 </file>

</xml_diff>